<commit_message>
feat: v3 - add uml class diagrams and update some srs sections
</commit_message>
<xml_diff>
--- a/Adrian Kucyk SRS.docx
+++ b/Adrian Kucyk SRS.docx
@@ -194,7 +194,35 @@
           <w:lang w:eastAsia="en-GB"/>
           <w14:ligatures w14:val="none"/>
         </w:rPr>
-        <w:t>«v2»</w:t>
+        <w:t>«v</w:t>
+      </w:r>
+      <w:r>
+        <w:rPr>
+          <w:rFonts w:eastAsia="Times New Roman" w:cs="" w:asciiTheme="majorBidi" w:cstheme="majorBidi" w:hAnsiTheme="majorBidi"/>
+          <w:b/>
+          <w:bCs/>
+          <w:color w:val="0000FF"/>
+          <w:kern w:val="0"/>
+          <w:sz w:val="20"/>
+          <w:szCs w:val="20"/>
+          <w:lang w:eastAsia="en-GB"/>
+          <w14:ligatures w14:val="none"/>
+        </w:rPr>
+        <w:t>3</w:t>
+      </w:r>
+      <w:r>
+        <w:rPr>
+          <w:rFonts w:eastAsia="Times New Roman" w:cs="" w:asciiTheme="majorBidi" w:cstheme="majorBidi" w:hAnsiTheme="majorBidi"/>
+          <w:b/>
+          <w:bCs/>
+          <w:color w:val="0000FF"/>
+          <w:kern w:val="0"/>
+          <w:sz w:val="20"/>
+          <w:szCs w:val="20"/>
+          <w:lang w:eastAsia="en-GB"/>
+          <w14:ligatures w14:val="none"/>
+        </w:rPr>
+        <w:t>»</w:t>
       </w:r>
     </w:p>
     <w:p>
@@ -298,7 +326,63 @@
           <w:lang w:eastAsia="en-GB"/>
           <w14:ligatures w14:val="none"/>
         </w:rPr>
-        <w:t>27.04.2026</w:t>
+        <w:t>1</w:t>
+      </w:r>
+      <w:r>
+        <w:rPr>
+          <w:rFonts w:eastAsia="Times New Roman" w:cs="" w:asciiTheme="majorBidi" w:cstheme="majorBidi" w:hAnsiTheme="majorBidi"/>
+          <w:b/>
+          <w:bCs/>
+          <w:color w:val="0000FF"/>
+          <w:kern w:val="0"/>
+          <w:sz w:val="20"/>
+          <w:szCs w:val="20"/>
+          <w:lang w:eastAsia="en-GB"/>
+          <w14:ligatures w14:val="none"/>
+        </w:rPr>
+        <w:t>5</w:t>
+      </w:r>
+      <w:r>
+        <w:rPr>
+          <w:rFonts w:eastAsia="Times New Roman" w:cs="" w:asciiTheme="majorBidi" w:cstheme="majorBidi" w:hAnsiTheme="majorBidi"/>
+          <w:b/>
+          <w:bCs/>
+          <w:color w:val="0000FF"/>
+          <w:kern w:val="0"/>
+          <w:sz w:val="20"/>
+          <w:szCs w:val="20"/>
+          <w:lang w:eastAsia="en-GB"/>
+          <w14:ligatures w14:val="none"/>
+        </w:rPr>
+        <w:t>.0</w:t>
+      </w:r>
+      <w:r>
+        <w:rPr>
+          <w:rFonts w:eastAsia="Times New Roman" w:cs="" w:asciiTheme="majorBidi" w:cstheme="majorBidi" w:hAnsiTheme="majorBidi"/>
+          <w:b/>
+          <w:bCs/>
+          <w:color w:val="0000FF"/>
+          <w:kern w:val="0"/>
+          <w:sz w:val="20"/>
+          <w:szCs w:val="20"/>
+          <w:lang w:eastAsia="en-GB"/>
+          <w14:ligatures w14:val="none"/>
+        </w:rPr>
+        <w:t>5</w:t>
+      </w:r>
+      <w:r>
+        <w:rPr>
+          <w:rFonts w:eastAsia="Times New Roman" w:cs="" w:asciiTheme="majorBidi" w:cstheme="majorBidi" w:hAnsiTheme="majorBidi"/>
+          <w:b/>
+          <w:bCs/>
+          <w:color w:val="0000FF"/>
+          <w:kern w:val="0"/>
+          <w:sz w:val="20"/>
+          <w:szCs w:val="20"/>
+          <w:lang w:eastAsia="en-GB"/>
+          <w14:ligatures w14:val="none"/>
+        </w:rPr>
+        <w:t>.2026</w:t>
       </w:r>
     </w:p>
     <w:p>
@@ -463,16 +547,16 @@
         <w:tblLook w:noHBand="0" w:noVBand="1" w:firstColumn="1" w:lastRow="0" w:lastColumn="0" w:firstRow="1" w:val="04a0"/>
       </w:tblPr>
       <w:tblGrid>
-        <w:gridCol w:w="1088"/>
-        <w:gridCol w:w="786"/>
-        <w:gridCol w:w="2469"/>
+        <w:gridCol w:w="1087"/>
+        <w:gridCol w:w="784"/>
+        <w:gridCol w:w="2472"/>
         <w:gridCol w:w="884"/>
       </w:tblGrid>
       <w:tr>
         <w:trPr/>
         <w:tc>
           <w:tcPr>
-            <w:tcW w:w="1088" w:type="dxa"/>
+            <w:tcW w:w="1087" w:type="dxa"/>
             <w:tcBorders>
               <w:top w:val="single" w:sz="6" w:space="0" w:color="000000"/>
               <w:start w:val="single" w:sz="6" w:space="0" w:color="000000"/>
@@ -512,7 +596,7 @@
         </w:tc>
         <w:tc>
           <w:tcPr>
-            <w:tcW w:w="786" w:type="dxa"/>
+            <w:tcW w:w="784" w:type="dxa"/>
             <w:tcBorders>
               <w:top w:val="single" w:sz="6" w:space="0" w:color="000000"/>
               <w:start w:val="single" w:sz="6" w:space="0" w:color="000000"/>
@@ -552,7 +636,7 @@
         </w:tc>
         <w:tc>
           <w:tcPr>
-            <w:tcW w:w="2469" w:type="dxa"/>
+            <w:tcW w:w="2472" w:type="dxa"/>
             <w:tcBorders>
               <w:top w:val="single" w:sz="6" w:space="0" w:color="000000"/>
               <w:start w:val="single" w:sz="6" w:space="0" w:color="000000"/>
@@ -635,7 +719,7 @@
         <w:trPr/>
         <w:tc>
           <w:tcPr>
-            <w:tcW w:w="1088" w:type="dxa"/>
+            <w:tcW w:w="1087" w:type="dxa"/>
             <w:tcBorders>
               <w:top w:val="single" w:sz="6" w:space="0" w:color="000000"/>
               <w:start w:val="single" w:sz="6" w:space="0" w:color="000000"/>
@@ -675,7 +759,7 @@
         </w:tc>
         <w:tc>
           <w:tcPr>
-            <w:tcW w:w="786" w:type="dxa"/>
+            <w:tcW w:w="784" w:type="dxa"/>
             <w:tcBorders>
               <w:top w:val="single" w:sz="6" w:space="0" w:color="000000"/>
               <w:start w:val="single" w:sz="6" w:space="0" w:color="000000"/>
@@ -715,7 +799,7 @@
         </w:tc>
         <w:tc>
           <w:tcPr>
-            <w:tcW w:w="2469" w:type="dxa"/>
+            <w:tcW w:w="2472" w:type="dxa"/>
             <w:tcBorders>
               <w:top w:val="single" w:sz="6" w:space="0" w:color="000000"/>
               <w:start w:val="single" w:sz="6" w:space="0" w:color="000000"/>
@@ -798,7 +882,7 @@
         <w:trPr/>
         <w:tc>
           <w:tcPr>
-            <w:tcW w:w="1088" w:type="dxa"/>
+            <w:tcW w:w="1087" w:type="dxa"/>
             <w:tcBorders>
               <w:start w:val="single" w:sz="6" w:space="0" w:color="000000"/>
               <w:bottom w:val="single" w:sz="6" w:space="0" w:color="000000"/>
@@ -837,7 +921,7 @@
         </w:tc>
         <w:tc>
           <w:tcPr>
-            <w:tcW w:w="786" w:type="dxa"/>
+            <w:tcW w:w="784" w:type="dxa"/>
             <w:tcBorders>
               <w:start w:val="single" w:sz="6" w:space="0" w:color="000000"/>
               <w:bottom w:val="single" w:sz="6" w:space="0" w:color="000000"/>
@@ -876,7 +960,7 @@
         </w:tc>
         <w:tc>
           <w:tcPr>
-            <w:tcW w:w="2469" w:type="dxa"/>
+            <w:tcW w:w="2472" w:type="dxa"/>
             <w:tcBorders>
               <w:start w:val="single" w:sz="6" w:space="0" w:color="000000"/>
               <w:bottom w:val="single" w:sz="6" w:space="0" w:color="000000"/>
@@ -953,6 +1037,165 @@
           </w:p>
         </w:tc>
       </w:tr>
+      <w:tr>
+        <w:trPr/>
+        <w:tc>
+          <w:tcPr>
+            <w:tcW w:w="1087" w:type="dxa"/>
+            <w:tcBorders>
+              <w:start w:val="single" w:sz="6" w:space="0" w:color="000000"/>
+              <w:bottom w:val="single" w:sz="6" w:space="0" w:color="000000"/>
+              <w:end w:val="single" w:sz="6" w:space="0" w:color="000000"/>
+            </w:tcBorders>
+            <w:shd w:color="auto" w:fill="FFFFFF" w:val="clear"/>
+            <w:vAlign w:val="center"/>
+          </w:tcPr>
+          <w:p>
+            <w:pPr>
+              <w:pStyle w:val="Normal"/>
+              <w:spacing w:lineRule="atLeast" w:line="264" w:before="360" w:after="360"/>
+              <w:rPr>
+                <w:rFonts w:eastAsia="Times New Roman" w:cs="" w:asciiTheme="majorBidi" w:cstheme="majorBidi" w:hAnsiTheme="majorBidi"/>
+                <w:color w:val="0301FA"/>
+                <w:kern w:val="0"/>
+                <w:sz w:val="16"/>
+                <w:szCs w:val="16"/>
+                <w:lang w:eastAsia="en-GB"/>
+                <w14:ligatures w14:val="none"/>
+              </w:rPr>
+            </w:pPr>
+            <w:r>
+              <w:rPr>
+                <w:rFonts w:eastAsia="Times New Roman" w:cs="" w:asciiTheme="majorBidi" w:cstheme="majorBidi" w:hAnsiTheme="majorBidi"/>
+                <w:color w:val="0301FA"/>
+                <w:kern w:val="0"/>
+                <w:sz w:val="16"/>
+                <w:szCs w:val="16"/>
+                <w:lang w:eastAsia="en-GB"/>
+                <w14:ligatures w14:val="none"/>
+              </w:rPr>
+              <w:t>Update: add uml class diagrams</w:t>
+            </w:r>
+          </w:p>
+        </w:tc>
+        <w:tc>
+          <w:tcPr>
+            <w:tcW w:w="784" w:type="dxa"/>
+            <w:tcBorders>
+              <w:start w:val="single" w:sz="6" w:space="0" w:color="000000"/>
+              <w:bottom w:val="single" w:sz="6" w:space="0" w:color="000000"/>
+              <w:end w:val="single" w:sz="6" w:space="0" w:color="000000"/>
+            </w:tcBorders>
+            <w:shd w:color="auto" w:fill="FFFFFF" w:val="clear"/>
+            <w:vAlign w:val="center"/>
+          </w:tcPr>
+          <w:p>
+            <w:pPr>
+              <w:pStyle w:val="Normal"/>
+              <w:spacing w:lineRule="atLeast" w:line="264" w:before="360" w:after="360"/>
+              <w:rPr>
+                <w:rFonts w:eastAsia="Times New Roman" w:cs="" w:asciiTheme="majorBidi" w:cstheme="majorBidi" w:hAnsiTheme="majorBidi"/>
+                <w:color w:val="0301FA"/>
+                <w:kern w:val="0"/>
+                <w:sz w:val="16"/>
+                <w:szCs w:val="16"/>
+                <w:lang w:eastAsia="en-GB"/>
+                <w14:ligatures w14:val="none"/>
+              </w:rPr>
+            </w:pPr>
+            <w:r>
+              <w:rPr>
+                <w:rFonts w:eastAsia="Times New Roman" w:cs="" w:asciiTheme="majorBidi" w:cstheme="majorBidi" w:hAnsiTheme="majorBidi"/>
+                <w:color w:val="0301FA"/>
+                <w:kern w:val="0"/>
+                <w:sz w:val="16"/>
+                <w:szCs w:val="16"/>
+                <w:lang w:eastAsia="en-GB"/>
+                <w14:ligatures w14:val="none"/>
+              </w:rPr>
+              <w:t>15.05.2026</w:t>
+            </w:r>
+          </w:p>
+        </w:tc>
+        <w:tc>
+          <w:tcPr>
+            <w:tcW w:w="2472" w:type="dxa"/>
+            <w:tcBorders>
+              <w:start w:val="single" w:sz="6" w:space="0" w:color="000000"/>
+              <w:bottom w:val="single" w:sz="6" w:space="0" w:color="000000"/>
+              <w:end w:val="single" w:sz="6" w:space="0" w:color="000000"/>
+            </w:tcBorders>
+            <w:shd w:color="auto" w:fill="FFFFFF" w:val="clear"/>
+            <w:vAlign w:val="center"/>
+          </w:tcPr>
+          <w:p>
+            <w:pPr>
+              <w:pStyle w:val="Normal"/>
+              <w:spacing w:lineRule="atLeast" w:line="264" w:before="360" w:after="360"/>
+              <w:rPr>
+                <w:rFonts w:eastAsia="Times New Roman" w:cs="" w:asciiTheme="majorBidi" w:cstheme="majorBidi" w:hAnsiTheme="majorBidi"/>
+                <w:color w:val="0301FA"/>
+                <w:kern w:val="0"/>
+                <w:sz w:val="16"/>
+                <w:szCs w:val="16"/>
+                <w:lang w:eastAsia="en-GB"/>
+                <w14:ligatures w14:val="none"/>
+              </w:rPr>
+            </w:pPr>
+            <w:r>
+              <w:rPr>
+                <w:rFonts w:eastAsia="Times New Roman" w:cs="" w:asciiTheme="majorBidi" w:cstheme="majorBidi" w:hAnsiTheme="majorBidi"/>
+                <w:color w:val="0301FA"/>
+                <w:kern w:val="0"/>
+                <w:sz w:val="16"/>
+                <w:szCs w:val="16"/>
+                <w:lang w:eastAsia="en-GB"/>
+                <w14:ligatures w14:val="none"/>
+              </w:rPr>
+              <w:t xml:space="preserve">Update to include UML class diagrams and update some srs sections, add user characteristics </w:t>
+            </w:r>
+          </w:p>
+        </w:tc>
+        <w:tc>
+          <w:tcPr>
+            <w:tcW w:w="884" w:type="dxa"/>
+            <w:tcBorders>
+              <w:start w:val="single" w:sz="6" w:space="0" w:color="000000"/>
+              <w:bottom w:val="single" w:sz="6" w:space="0" w:color="000000"/>
+              <w:end w:val="single" w:sz="6" w:space="0" w:color="000000"/>
+            </w:tcBorders>
+            <w:shd w:color="auto" w:fill="FFFFFF" w:val="clear"/>
+            <w:vAlign w:val="center"/>
+          </w:tcPr>
+          <w:p>
+            <w:pPr>
+              <w:pStyle w:val="Normal"/>
+              <w:spacing w:lineRule="atLeast" w:line="264" w:before="360" w:after="360"/>
+              <w:rPr>
+                <w:rFonts w:eastAsia="Times New Roman" w:cs="" w:asciiTheme="majorBidi" w:cstheme="majorBidi" w:hAnsiTheme="majorBidi"/>
+                <w:color w:val="0301FA"/>
+                <w:kern w:val="0"/>
+                <w:sz w:val="16"/>
+                <w:szCs w:val="16"/>
+                <w:lang w:eastAsia="en-GB"/>
+                <w14:ligatures w14:val="none"/>
+              </w:rPr>
+            </w:pPr>
+            <w:r>
+              <w:rPr>
+                <w:rFonts w:eastAsia="Times New Roman" w:cs="" w:asciiTheme="majorBidi" w:cstheme="majorBidi" w:hAnsiTheme="majorBidi"/>
+                <w:color w:val="0301FA"/>
+                <w:kern w:val="0"/>
+                <w:sz w:val="16"/>
+                <w:szCs w:val="16"/>
+                <w:lang w:eastAsia="en-GB"/>
+                <w14:ligatures w14:val="none"/>
+              </w:rPr>
+              <w:t>v3</w:t>
+            </w:r>
+          </w:p>
+        </w:tc>
+      </w:tr>
     </w:tbl>
     <w:p>
       <w:pPr>
@@ -1337,66 +1580,6 @@
           <w14:ligatures w14:val="none"/>
         </w:rPr>
         <w:t>StayEase shall be a web-based management platform that shall automatee room inventory and guest reservations. It shall replace manual scheduling with a synchronized digital environment, excluding hardware-level integrations like smart locks for this version.</w:t>
-      </w:r>
-    </w:p>
-    <w:p>
-      <w:pPr>
-        <w:pStyle w:val="Normal"/>
-        <w:shd w:val="clear" w:color="auto" w:fill="FFFFFF"/>
-        <w:spacing w:lineRule="auto" w:line="240" w:before="240" w:after="0"/>
-        <w:jc w:val="both"/>
-        <w:rPr>
-          <w:rFonts w:eastAsia="Times New Roman" w:cs="" w:asciiTheme="majorBidi" w:cstheme="majorBidi" w:hAnsiTheme="majorBidi"/>
-          <w:color w:val="373D3F"/>
-          <w:kern w:val="0"/>
-          <w:sz w:val="20"/>
-          <w:szCs w:val="20"/>
-          <w:lang w:eastAsia="en-GB"/>
-          <w14:ligatures w14:val="none"/>
-        </w:rPr>
-      </w:pPr>
-      <w:r>
-        <w:rPr>
-          <w:rFonts w:eastAsia="Times New Roman" w:cs="" w:asciiTheme="majorBidi" w:cstheme="majorBidi" w:hAnsiTheme="majorBidi"/>
-          <w:b/>
-          <w:bCs/>
-          <w:color w:val="373D3F"/>
-          <w:kern w:val="0"/>
-          <w:sz w:val="20"/>
-          <w:szCs w:val="20"/>
-          <w:lang w:eastAsia="en-GB"/>
-          <w14:ligatures w14:val="none"/>
-        </w:rPr>
-        <w:t>1.5. References  </w:t>
-      </w:r>
-    </w:p>
-    <w:p>
-      <w:pPr>
-        <w:pStyle w:val="Normal"/>
-        <w:shd w:val="clear" w:color="auto" w:fill="FFFFFF"/>
-        <w:spacing w:lineRule="auto" w:line="240" w:before="240" w:after="0"/>
-        <w:jc w:val="both"/>
-        <w:rPr>
-          <w:rFonts w:eastAsia="Times New Roman" w:cs="" w:asciiTheme="majorBidi" w:cstheme="majorBidi" w:hAnsiTheme="majorBidi"/>
-          <w:color w:val="373D3F"/>
-          <w:kern w:val="0"/>
-          <w:sz w:val="20"/>
-          <w:szCs w:val="20"/>
-          <w:lang w:eastAsia="en-GB"/>
-          <w14:ligatures w14:val="none"/>
-        </w:rPr>
-      </w:pPr>
-      <w:r>
-        <w:rPr>
-          <w:rFonts w:eastAsia="Times New Roman" w:cs="" w:asciiTheme="majorBidi" w:cstheme="majorBidi" w:hAnsiTheme="majorBidi"/>
-          <w:color w:val="0000FF"/>
-          <w:kern w:val="0"/>
-          <w:sz w:val="20"/>
-          <w:szCs w:val="20"/>
-          <w:lang w:eastAsia="en-GB"/>
-          <w14:ligatures w14:val="none"/>
-        </w:rPr>
-        <w:t>«List any other documents or Web addresses to which this document refers or was based on. These may include user interface style guides, contracts, standards, system requirements specifications, use case documents, or a vision and scope document. Provide enough information so that the reader could access a copy of each reference, including title, author, version number, date, and source or location. Include the assignment document in the references.»</w:t>
       </w:r>
     </w:p>
     <w:p>
@@ -1829,7 +2012,7 @@
           <w:lang w:eastAsia="en-GB"/>
           <w14:ligatures w14:val="none"/>
         </w:rPr>
-        <w:t>Hotel Owner/Administrator</w:t>
+        <w:t>Hotel Owner/Administrator – the frequency of use shall be sporadical, he shall have eclusive accees to managing rooms and users, but he also should have allccess to all the other system features</w:t>
       </w:r>
     </w:p>
     <w:p>
@@ -1862,7 +2045,7 @@
           <w:lang w:eastAsia="en-GB"/>
           <w14:ligatures w14:val="none"/>
         </w:rPr>
-        <w:t>Manager</w:t>
+        <w:t>Manager – the frequency of use shall be high, he shall have the second most premissions after hotel owner, he shall be able to update room status, view reports, manage reservations, check in quests and check out guests,</w:t>
       </w:r>
     </w:p>
     <w:p>
@@ -1895,7 +2078,7 @@
           <w:lang w:eastAsia="en-GB"/>
           <w14:ligatures w14:val="none"/>
         </w:rPr>
-        <w:t>Receptionist</w:t>
+        <w:t>Receptionist – the frequency of use shall be daily, and he should have access to managing reservations, as well as checking in quests and checking out guests.</w:t>
       </w:r>
     </w:p>
     <w:p>
@@ -1928,7 +2111,48 @@
           <w:lang w:eastAsia="en-GB"/>
           <w14:ligatures w14:val="none"/>
         </w:rPr>
-        <w:t>Room cleaners</w:t>
+        <w:t xml:space="preserve">Room cleaners – the frequency of use </w:t>
+      </w:r>
+      <w:r>
+        <w:rPr>
+          <w:rFonts w:eastAsia="Times New Roman" w:cs="" w:asciiTheme="majorBidi" w:cstheme="majorBidi" w:hAnsiTheme="majorBidi"/>
+          <w:color w:val="0000FF"/>
+          <w:kern w:val="0"/>
+          <w:sz w:val="20"/>
+          <w:szCs w:val="20"/>
+          <w:lang w:eastAsia="en-GB"/>
+          <w14:ligatures w14:val="none"/>
+        </w:rPr>
+        <w:t>might be daily, they should have access to updating room statuses and viewing raports/status of the rooms.</w:t>
+      </w:r>
+    </w:p>
+    <w:p>
+      <w:pPr>
+        <w:pStyle w:val="Normal"/>
+        <w:shd w:val="clear" w:color="auto" w:fill="FFFFFF"/>
+        <w:spacing w:lineRule="auto" w:line="240" w:before="240" w:after="0"/>
+        <w:jc w:val="both"/>
+        <w:rPr>
+          <w:rFonts w:eastAsia="Times New Roman" w:cs="" w:asciiTheme="majorBidi" w:cstheme="majorBidi" w:hAnsiTheme="majorBidi"/>
+          <w:color w:val="0000FF"/>
+          <w:kern w:val="0"/>
+          <w:sz w:val="20"/>
+          <w:szCs w:val="20"/>
+          <w:lang w:eastAsia="en-GB"/>
+          <w14:ligatures w14:val="none"/>
+        </w:rPr>
+      </w:pPr>
+      <w:r>
+        <w:rPr>
+          <w:rFonts w:eastAsia="Times New Roman" w:cs="" w:asciiTheme="majorBidi" w:cstheme="majorBidi" w:hAnsiTheme="majorBidi"/>
+          <w:color w:val="0000FF"/>
+          <w:kern w:val="0"/>
+          <w:sz w:val="20"/>
+          <w:szCs w:val="20"/>
+          <w:lang w:eastAsia="en-GB"/>
+          <w14:ligatures w14:val="none"/>
+        </w:rPr>
+        <w:t>The basic use cases for the users are shown on the blelow diagram.</w:t>
       </w:r>
     </w:p>
     <w:p>
@@ -2067,7 +2291,31 @@
           <w:lang w:eastAsia="en-GB"/>
           <w14:ligatures w14:val="none"/>
         </w:rPr>
-        <w:t>The platofrm will be dedicated local computer acting as the sever, it will have ubuntu operation sysstem in one of the latest distributions, from as the database the PostgreSQL will be used. Any device in the hotel, such as tablets, laptops or other workstations will need to be connected to the local network and by using one from modern browsers, access the management website.</w:t>
+        <w:t xml:space="preserve">The platofrm will be dedicated local computer acting as the sever, it will have ubuntu operation system in one of the latest distributions. </w:t>
+      </w:r>
+      <w:r>
+        <w:rPr>
+          <w:rFonts w:eastAsia="Times New Roman" w:cs="" w:asciiTheme="majorBidi" w:cstheme="majorBidi" w:hAnsiTheme="majorBidi"/>
+          <w:color w:val="0000FF"/>
+          <w:kern w:val="0"/>
+          <w:sz w:val="20"/>
+          <w:szCs w:val="20"/>
+          <w:lang w:eastAsia="en-GB"/>
+          <w14:ligatures w14:val="none"/>
+        </w:rPr>
+        <w:t>A</w:t>
+      </w:r>
+      <w:r>
+        <w:rPr>
+          <w:rFonts w:eastAsia="Times New Roman" w:cs="" w:asciiTheme="majorBidi" w:cstheme="majorBidi" w:hAnsiTheme="majorBidi"/>
+          <w:color w:val="0000FF"/>
+          <w:kern w:val="0"/>
+          <w:sz w:val="20"/>
+          <w:szCs w:val="20"/>
+          <w:lang w:eastAsia="en-GB"/>
+          <w14:ligatures w14:val="none"/>
+        </w:rPr>
+        <w:t>s the database the PostgreSQL will be used. Any device in the hotel, such as tablets, laptops or other workstations will need to be connected to the local network and by using modern browser, access the management website.</w:t>
       </w:r>
     </w:p>
     <w:p>
@@ -2127,7 +2375,94 @@
           <w:lang w:eastAsia="en-GB"/>
           <w14:ligatures w14:val="none"/>
         </w:rPr>
-        <w:t>«Describe any items or issues that will limit the options available to the developers. These might include: corporate or regulatory policies; hardware limitations (timing requirements, memory requirements); interfaces to other applications; specific technologies, tools, and databases to be used; parallel operations; language requirements; communications protocols; security considerations; design conventions or programming standards (for example, if the customer’s organization will be responsible for maintaining the delivered software).»</w:t>
+        <w:t>The system must be built as a self-hosted, full-stack web application designed to run locally on the client's own infrastructure</w:t>
+      </w:r>
+    </w:p>
+    <w:p>
+      <w:pPr>
+        <w:pStyle w:val="Normal"/>
+        <w:shd w:val="clear" w:color="auto" w:fill="FFFFFF"/>
+        <w:spacing w:lineRule="auto" w:line="240" w:before="240" w:after="0"/>
+        <w:jc w:val="both"/>
+        <w:rPr>
+          <w:rFonts w:eastAsia="Times New Roman" w:cs="" w:asciiTheme="majorBidi" w:cstheme="majorBidi" w:hAnsiTheme="majorBidi"/>
+          <w:color w:val="373D3F"/>
+          <w:kern w:val="0"/>
+          <w:sz w:val="20"/>
+          <w:szCs w:val="20"/>
+          <w:lang w:eastAsia="en-GB"/>
+          <w14:ligatures w14:val="none"/>
+        </w:rPr>
+      </w:pPr>
+      <w:r>
+        <w:rPr>
+          <w:rFonts w:eastAsia="Times New Roman" w:cs="" w:asciiTheme="majorBidi" w:cstheme="majorBidi" w:hAnsiTheme="majorBidi"/>
+          <w:color w:val="0000FF"/>
+          <w:kern w:val="0"/>
+          <w:sz w:val="20"/>
+          <w:szCs w:val="20"/>
+          <w:lang w:eastAsia="en-GB"/>
+          <w14:ligatures w14:val="none"/>
+        </w:rPr>
+        <w:t>The deployment environment is constrained to a dedicated local computer serving as the server running an Ubuntu operating system distribution</w:t>
+      </w:r>
+    </w:p>
+    <w:p>
+      <w:pPr>
+        <w:pStyle w:val="Normal"/>
+        <w:shd w:val="clear" w:color="auto" w:fill="FFFFFF"/>
+        <w:spacing w:lineRule="auto" w:line="240" w:before="240" w:after="0"/>
+        <w:jc w:val="both"/>
+        <w:rPr>
+          <w:rFonts w:eastAsia="Times New Roman" w:cs="" w:asciiTheme="majorBidi" w:cstheme="majorBidi" w:hAnsiTheme="majorBidi"/>
+          <w:color w:val="373D3F"/>
+          <w:kern w:val="0"/>
+          <w:sz w:val="20"/>
+          <w:szCs w:val="20"/>
+          <w:lang w:eastAsia="en-GB"/>
+          <w14:ligatures w14:val="none"/>
+        </w:rPr>
+      </w:pPr>
+      <w:r>
+        <w:rPr>
+          <w:rFonts w:eastAsia="Times New Roman" w:cs="" w:asciiTheme="majorBidi" w:cstheme="majorBidi" w:hAnsiTheme="majorBidi"/>
+          <w:color w:val="0000FF"/>
+          <w:kern w:val="0"/>
+          <w:sz w:val="20"/>
+          <w:szCs w:val="20"/>
+          <w:lang w:eastAsia="en-GB"/>
+          <w14:ligatures w14:val="none"/>
+        </w:rPr>
+        <w:t>Hardware-level ecosystem integrations, specifically including smart locks, are completely excluded from the scope of this system version</w:t>
+      </w:r>
+    </w:p>
+    <w:p>
+      <w:pPr>
+        <w:pStyle w:val="Normal"/>
+        <w:shd w:val="clear" w:color="auto" w:fill="FFFFFF"/>
+        <w:spacing w:lineRule="auto" w:line="240" w:before="240" w:after="0"/>
+        <w:jc w:val="both"/>
+        <w:rPr>
+          <w:rFonts w:eastAsia="Times New Roman" w:cs="" w:asciiTheme="majorBidi" w:cstheme="majorBidi" w:hAnsiTheme="majorBidi"/>
+          <w:color w:val="373D3F"/>
+          <w:kern w:val="0"/>
+          <w:sz w:val="20"/>
+          <w:szCs w:val="20"/>
+          <w:lang w:eastAsia="en-GB"/>
+          <w14:ligatures w14:val="none"/>
+        </w:rPr>
+      </w:pPr>
+      <w:r>
+        <w:rPr>
+          <w:rFonts w:eastAsia="Times New Roman" w:cs="" w:asciiTheme="majorBidi" w:cstheme="majorBidi" w:hAnsiTheme="majorBidi"/>
+          <w:color w:val="0000FF"/>
+          <w:kern w:val="0"/>
+          <w:sz w:val="20"/>
+          <w:szCs w:val="20"/>
+          <w:lang w:eastAsia="en-GB"/>
+          <w14:ligatures w14:val="none"/>
+        </w:rPr>
+        <w:t>The application database component is strictly constrained to PostgreSQL</w:t>
       </w:r>
     </w:p>
     <w:p>
@@ -2163,31 +2498,117 @@
     </w:p>
     <w:p>
       <w:pPr>
-        <w:pStyle w:val="Normal"/>
-        <w:shd w:val="clear" w:color="auto" w:fill="FFFFFF"/>
-        <w:spacing w:lineRule="auto" w:line="240" w:before="240" w:after="0"/>
-        <w:jc w:val="both"/>
-        <w:rPr>
-          <w:rFonts w:eastAsia="Times New Roman" w:cs="" w:asciiTheme="majorBidi" w:cstheme="majorBidi" w:hAnsiTheme="majorBidi"/>
-          <w:color w:val="373D3F"/>
-          <w:kern w:val="0"/>
-          <w:sz w:val="20"/>
-          <w:szCs w:val="20"/>
-          <w:lang w:eastAsia="en-GB"/>
-          <w14:ligatures w14:val="none"/>
-        </w:rPr>
-      </w:pPr>
-      <w:r>
-        <w:rPr>
-          <w:rFonts w:eastAsia="Times New Roman" w:cs="" w:asciiTheme="majorBidi" w:cstheme="majorBidi" w:hAnsiTheme="majorBidi"/>
-          <w:color w:val="0000FF"/>
-          <w:kern w:val="0"/>
-          <w:sz w:val="20"/>
-          <w:szCs w:val="20"/>
-          <w:lang w:eastAsia="en-GB"/>
-          <w14:ligatures w14:val="none"/>
-        </w:rPr>
-        <w:t>«List the user documentation components (such as user manuals, on-line help, and tutorials) that will be delivered along with the software. Identify any known user documentation delivery formats or standards.»</w:t>
+        <w:pStyle w:val="BodyText"/>
+        <w:shd w:val="clear" w:color="auto" w:fill="FFFFFF"/>
+        <w:spacing w:lineRule="auto" w:line="240" w:before="240" w:after="0"/>
+        <w:jc w:val="both"/>
+        <w:rPr>
+          <w:rFonts w:eastAsia="Times New Roman" w:cs="" w:asciiTheme="majorBidi" w:cstheme="majorBidi" w:hAnsiTheme="majorBidi"/>
+          <w:color w:val="373D3F"/>
+          <w:kern w:val="0"/>
+          <w:sz w:val="20"/>
+          <w:szCs w:val="20"/>
+          <w:lang w:eastAsia="en-GB"/>
+          <w14:ligatures w14:val="none"/>
+        </w:rPr>
+      </w:pPr>
+      <w:r>
+        <w:rPr>
+          <w:rFonts w:eastAsia="Times New Roman" w:cs="" w:asciiTheme="majorBidi" w:cstheme="majorBidi" w:hAnsiTheme="majorBidi"/>
+          <w:color w:val="0000FF"/>
+          <w:kern w:val="0"/>
+          <w:sz w:val="20"/>
+          <w:szCs w:val="20"/>
+          <w:lang w:eastAsia="en-GB"/>
+          <w14:ligatures w14:val="none"/>
+        </w:rPr>
+        <w:t>Staff will interact with a local management website interface.</w:t>
+      </w:r>
+    </w:p>
+    <w:p>
+      <w:pPr>
+        <w:pStyle w:val="Normal"/>
+        <w:shd w:val="clear" w:color="auto" w:fill="FFFFFF"/>
+        <w:spacing w:lineRule="auto" w:line="240" w:before="240" w:after="0"/>
+        <w:jc w:val="both"/>
+        <w:rPr>
+          <w:rFonts w:eastAsia="Times New Roman" w:cs="" w:asciiTheme="majorBidi" w:cstheme="majorBidi" w:hAnsiTheme="majorBidi"/>
+          <w:color w:val="373D3F"/>
+          <w:kern w:val="0"/>
+          <w:sz w:val="20"/>
+          <w:szCs w:val="20"/>
+          <w:lang w:eastAsia="en-GB"/>
+          <w14:ligatures w14:val="none"/>
+        </w:rPr>
+      </w:pPr>
+      <w:r>
+        <w:rPr>
+          <w:rFonts w:eastAsia="Times New Roman" w:cs="" w:asciiTheme="majorBidi" w:cstheme="majorBidi" w:hAnsiTheme="majorBidi"/>
+          <w:color w:val="0000FF"/>
+          <w:kern w:val="0"/>
+          <w:sz w:val="20"/>
+          <w:szCs w:val="20"/>
+          <w:lang w:eastAsia="en-GB"/>
+          <w14:ligatures w14:val="none"/>
+        </w:rPr>
+        <w:t>User documentation components will be tailored around navigating the web-based system features across supported network devices.</w:t>
+      </w:r>
+    </w:p>
+    <w:p>
+      <w:pPr>
+        <w:pStyle w:val="Normal"/>
+        <w:shd w:val="clear" w:color="auto" w:fill="FFFFFF"/>
+        <w:spacing w:lineRule="auto" w:line="240" w:before="240" w:after="0"/>
+        <w:jc w:val="both"/>
+        <w:rPr>
+          <w:rFonts w:eastAsia="Times New Roman" w:cs="" w:asciiTheme="majorBidi" w:cstheme="majorBidi" w:hAnsiTheme="majorBidi"/>
+          <w:color w:val="373D3F"/>
+          <w:kern w:val="0"/>
+          <w:sz w:val="20"/>
+          <w:szCs w:val="20"/>
+          <w:lang w:eastAsia="en-GB"/>
+          <w14:ligatures w14:val="none"/>
+        </w:rPr>
+      </w:pPr>
+      <w:r>
+        <w:rPr>
+          <w:rFonts w:eastAsia="Times New Roman" w:cs="" w:asciiTheme="majorBidi" w:cstheme="majorBidi" w:hAnsiTheme="majorBidi"/>
+          <w:color w:val="0000FF"/>
+          <w:kern w:val="0"/>
+          <w:sz w:val="20"/>
+          <w:szCs w:val="20"/>
+          <w:lang w:eastAsia="en-GB"/>
+          <w14:ligatures w14:val="none"/>
+        </w:rPr>
+        <w:t>User documentation will also be provided after logging in to the web page application.</w:t>
+      </w:r>
+    </w:p>
+    <w:p>
+      <w:pPr>
+        <w:pStyle w:val="Normal"/>
+        <w:shd w:val="clear" w:color="auto" w:fill="FFFFFF"/>
+        <w:spacing w:lineRule="auto" w:line="240" w:before="240" w:after="0"/>
+        <w:jc w:val="both"/>
+        <w:rPr>
+          <w:rFonts w:eastAsia="Times New Roman" w:cs="" w:asciiTheme="majorBidi" w:cstheme="majorBidi" w:hAnsiTheme="majorBidi"/>
+          <w:color w:val="373D3F"/>
+          <w:kern w:val="0"/>
+          <w:sz w:val="20"/>
+          <w:szCs w:val="20"/>
+          <w:lang w:eastAsia="en-GB"/>
+          <w14:ligatures w14:val="none"/>
+        </w:rPr>
+      </w:pPr>
+      <w:r>
+        <w:rPr>
+          <w:rFonts w:eastAsia="Times New Roman" w:cs="" w:asciiTheme="majorBidi" w:cstheme="majorBidi" w:hAnsiTheme="majorBidi"/>
+          <w:color w:val="0000FF"/>
+          <w:kern w:val="0"/>
+          <w:sz w:val="20"/>
+          <w:szCs w:val="20"/>
+          <w:lang w:eastAsia="en-GB"/>
+          <w14:ligatures w14:val="none"/>
+        </w:rPr>
       </w:r>
     </w:p>
     <w:p>
@@ -2247,7 +2668,65 @@
           <w:lang w:eastAsia="en-GB"/>
           <w14:ligatures w14:val="none"/>
         </w:rPr>
-        <w:t>«List any assumed factors (as opposed to known facts) that could affect the requirements stated in the specification. These could include third-party or commercial components that you plan to use, issues around the development or operating environment, or constraints. The project could be affected if these assumptions are incorrect, are not shared, or change. Also identify any dependencies the project has on external factors, such as software components that you intend to reuse from another project, unless they are already documented elsewhere (for example, in the vision and scope document or the project plan).»</w:t>
+        <w:t>It is assumed that all client interaction devices (tablets, laptops, or workstations) maintain a reliable connection to the hotel’s local network environment</w:t>
+      </w:r>
+    </w:p>
+    <w:p>
+      <w:pPr>
+        <w:pStyle w:val="Normal"/>
+        <w:shd w:val="clear" w:color="auto" w:fill="FFFFFF"/>
+        <w:spacing w:lineRule="auto" w:line="240" w:before="240" w:after="0"/>
+        <w:jc w:val="both"/>
+        <w:rPr>
+          <w:rFonts w:eastAsia="Times New Roman" w:cs="" w:asciiTheme="majorBidi" w:cstheme="majorBidi" w:hAnsiTheme="majorBidi"/>
+          <w:color w:val="373D3F"/>
+          <w:kern w:val="0"/>
+          <w:sz w:val="20"/>
+          <w:szCs w:val="20"/>
+          <w:lang w:eastAsia="en-GB"/>
+          <w14:ligatures w14:val="none"/>
+        </w:rPr>
+      </w:pPr>
+      <w:r>
+        <w:rPr>
+          <w:rFonts w:eastAsia="Times New Roman" w:cs="" w:asciiTheme="majorBidi" w:cstheme="majorBidi" w:hAnsiTheme="majorBidi"/>
+          <w:color w:val="0000FF"/>
+          <w:kern w:val="0"/>
+          <w:sz w:val="20"/>
+          <w:szCs w:val="20"/>
+          <w:lang w:eastAsia="en-GB"/>
+          <w14:ligatures w14:val="none"/>
+        </w:rPr>
+        <w:t>The system relies on the local server computer remaining powered and active to ensure uninterrupted data sovereignty and front-of-house operations during external internet outages</w:t>
+      </w:r>
+    </w:p>
+    <w:p>
+      <w:pPr>
+        <w:pStyle w:val="Normal"/>
+        <w:shd w:val="clear" w:color="auto" w:fill="FFFFFF"/>
+        <w:spacing w:lineRule="auto" w:line="240" w:before="240" w:after="0"/>
+        <w:jc w:val="both"/>
+        <w:rPr>
+          <w:rFonts w:eastAsia="Times New Roman" w:cs="" w:asciiTheme="majorBidi" w:cstheme="majorBidi" w:hAnsiTheme="majorBidi"/>
+          <w:color w:val="373D3F"/>
+          <w:kern w:val="0"/>
+          <w:sz w:val="20"/>
+          <w:szCs w:val="20"/>
+          <w:lang w:eastAsia="en-GB"/>
+          <w14:ligatures w14:val="none"/>
+        </w:rPr>
+      </w:pPr>
+      <w:r>
+        <w:rPr>
+          <w:rFonts w:eastAsia="Times New Roman" w:cs="" w:asciiTheme="majorBidi" w:cstheme="majorBidi" w:hAnsiTheme="majorBidi"/>
+          <w:color w:val="0000FF"/>
+          <w:kern w:val="0"/>
+          <w:sz w:val="20"/>
+          <w:szCs w:val="20"/>
+          <w:lang w:eastAsia="en-GB"/>
+          <w14:ligatures w14:val="none"/>
+        </w:rPr>
+        <w:t>It is assumed that end-users will access the platform exclusively using up-to-date, modern web browsers</w:t>
       </w:r>
     </w:p>
     <w:p>
@@ -2352,109 +2831,344 @@
           <w:lang w:eastAsia="en-GB"/>
           <w14:ligatures w14:val="none"/>
         </w:rPr>
-        <w:t>«Feature Name»</w:t>
-      </w:r>
-    </w:p>
-    <w:p>
-      <w:pPr>
-        <w:pStyle w:val="Normal"/>
-        <w:shd w:val="clear" w:color="auto" w:fill="FFFFFF"/>
-        <w:spacing w:lineRule="auto" w:line="240" w:before="240" w:after="0"/>
-        <w:jc w:val="both"/>
-        <w:rPr>
-          <w:rFonts w:eastAsia="Times New Roman" w:cs="" w:asciiTheme="majorBidi" w:cstheme="majorBidi" w:hAnsiTheme="majorBidi"/>
-          <w:color w:val="373D3F"/>
-          <w:kern w:val="0"/>
-          <w:sz w:val="20"/>
-          <w:szCs w:val="20"/>
-          <w:lang w:eastAsia="en-GB"/>
-          <w14:ligatures w14:val="none"/>
-        </w:rPr>
-      </w:pPr>
-      <w:r>
-        <w:rPr>
-          <w:rFonts w:eastAsia="Times New Roman" w:cs="" w:asciiTheme="majorBidi" w:cstheme="majorBidi" w:hAnsiTheme="majorBidi"/>
-          <w:color w:val="0000FF"/>
-          <w:kern w:val="0"/>
-          <w:sz w:val="20"/>
-          <w:szCs w:val="20"/>
-          <w:lang w:eastAsia="en-GB"/>
-          <w14:ligatures w14:val="none"/>
-        </w:rPr>
-        <w:t>«Brief description of the feature, generally 1-3 sentences»</w:t>
-      </w:r>
-    </w:p>
-    <w:p>
-      <w:pPr>
-        <w:pStyle w:val="Normal"/>
-        <w:shd w:val="clear" w:color="auto" w:fill="FFFFFF"/>
-        <w:spacing w:lineRule="auto" w:line="240" w:before="240" w:after="0"/>
-        <w:jc w:val="both"/>
-        <w:rPr>
-          <w:rFonts w:eastAsia="Times New Roman" w:cs="" w:asciiTheme="majorBidi" w:cstheme="majorBidi" w:hAnsiTheme="majorBidi"/>
-          <w:color w:val="373D3F"/>
-          <w:kern w:val="0"/>
-          <w:sz w:val="20"/>
-          <w:szCs w:val="20"/>
-          <w:lang w:eastAsia="en-GB"/>
-          <w14:ligatures w14:val="none"/>
-        </w:rPr>
-      </w:pPr>
-      <w:r>
-        <w:rPr>
-          <w:rFonts w:eastAsia="Times New Roman" w:cs="" w:asciiTheme="majorBidi" w:cstheme="majorBidi" w:hAnsiTheme="majorBidi"/>
-          <w:b/>
-          <w:bCs/>
-          <w:color w:val="373D3F"/>
-          <w:kern w:val="0"/>
-          <w:sz w:val="20"/>
-          <w:szCs w:val="20"/>
-          <w:lang w:eastAsia="en-GB"/>
-          <w14:ligatures w14:val="none"/>
-        </w:rPr>
-        <w:t>3.</w:t>
-      </w:r>
-      <w:r>
-        <w:rPr>
-          <w:rFonts w:eastAsia="Times New Roman" w:cs="" w:asciiTheme="majorBidi" w:cstheme="majorBidi" w:hAnsiTheme="majorBidi"/>
-          <w:b/>
-          <w:bCs/>
-          <w:color w:val="0000FF"/>
-          <w:kern w:val="0"/>
-          <w:sz w:val="20"/>
-          <w:szCs w:val="20"/>
-          <w:lang w:eastAsia="en-GB"/>
-          <w14:ligatures w14:val="none"/>
-        </w:rPr>
-        <w:t>«N»</w:t>
-      </w:r>
-      <w:r>
-        <w:rPr>
-          <w:rFonts w:eastAsia="Times New Roman" w:cs="" w:asciiTheme="majorBidi" w:cstheme="majorBidi" w:hAnsiTheme="majorBidi"/>
-          <w:b/>
-          <w:bCs/>
-          <w:color w:val="373D3F"/>
-          <w:kern w:val="0"/>
-          <w:sz w:val="20"/>
-          <w:szCs w:val="20"/>
-          <w:lang w:eastAsia="en-GB"/>
-          <w14:ligatures w14:val="none"/>
-        </w:rPr>
-        <w:t>. </w:t>
-      </w:r>
-      <w:r>
-        <w:rPr>
-          <w:rFonts w:eastAsia="Times New Roman" w:cs="" w:asciiTheme="majorBidi" w:cstheme="majorBidi" w:hAnsiTheme="majorBidi"/>
-          <w:b/>
-          <w:bCs/>
-          <w:color w:val="0000FF"/>
-          <w:kern w:val="0"/>
-          <w:sz w:val="20"/>
-          <w:szCs w:val="20"/>
-          <w:lang w:eastAsia="en-GB"/>
-          <w14:ligatures w14:val="none"/>
-        </w:rPr>
-        <w:t>«Additional feature blocks as needed»</w:t>
+        <w:t>U</w:t>
+      </w:r>
+      <w:r>
+        <w:rPr>
+          <w:rFonts w:eastAsia="Times New Roman" w:cs="" w:asciiTheme="majorBidi" w:cstheme="majorBidi" w:hAnsiTheme="majorBidi"/>
+          <w:b/>
+          <w:bCs/>
+          <w:color w:val="0000FF"/>
+          <w:kern w:val="0"/>
+          <w:sz w:val="20"/>
+          <w:szCs w:val="20"/>
+          <w:lang w:eastAsia="en-GB"/>
+          <w14:ligatures w14:val="none"/>
+        </w:rPr>
+        <w:t>s</w:t>
+      </w:r>
+      <w:r>
+        <w:rPr>
+          <w:rFonts w:eastAsia="Times New Roman" w:cs="" w:asciiTheme="majorBidi" w:cstheme="majorBidi" w:hAnsiTheme="majorBidi"/>
+          <w:b/>
+          <w:bCs/>
+          <w:color w:val="0000FF"/>
+          <w:kern w:val="0"/>
+          <w:sz w:val="20"/>
+          <w:szCs w:val="20"/>
+          <w:lang w:eastAsia="en-GB"/>
+          <w14:ligatures w14:val="none"/>
+        </w:rPr>
+        <w:t>e</w:t>
+      </w:r>
+      <w:r>
+        <w:rPr>
+          <w:rFonts w:eastAsia="Times New Roman" w:cs="" w:asciiTheme="majorBidi" w:cstheme="majorBidi" w:hAnsiTheme="majorBidi"/>
+          <w:b/>
+          <w:bCs/>
+          <w:color w:val="0000FF"/>
+          <w:kern w:val="0"/>
+          <w:sz w:val="20"/>
+          <w:szCs w:val="20"/>
+          <w:lang w:eastAsia="en-GB"/>
+          <w14:ligatures w14:val="none"/>
+        </w:rPr>
+        <w:t xml:space="preserve">r </w:t>
+      </w:r>
+      <w:r>
+        <w:rPr>
+          <w:rFonts w:eastAsia="Times New Roman" w:cs="" w:asciiTheme="majorBidi" w:cstheme="majorBidi" w:hAnsiTheme="majorBidi"/>
+          <w:b/>
+          <w:bCs/>
+          <w:color w:val="0000FF"/>
+          <w:kern w:val="0"/>
+          <w:sz w:val="20"/>
+          <w:szCs w:val="20"/>
+          <w:lang w:eastAsia="en-GB"/>
+          <w14:ligatures w14:val="none"/>
+        </w:rPr>
+        <w:t>R</w:t>
+      </w:r>
+      <w:r>
+        <w:rPr>
+          <w:rFonts w:eastAsia="Times New Roman" w:cs="" w:asciiTheme="majorBidi" w:cstheme="majorBidi" w:hAnsiTheme="majorBidi"/>
+          <w:b/>
+          <w:bCs/>
+          <w:color w:val="0000FF"/>
+          <w:kern w:val="0"/>
+          <w:sz w:val="20"/>
+          <w:szCs w:val="20"/>
+          <w:lang w:eastAsia="en-GB"/>
+          <w14:ligatures w14:val="none"/>
+        </w:rPr>
+        <w:t>o</w:t>
+      </w:r>
+      <w:r>
+        <w:rPr>
+          <w:rFonts w:eastAsia="Times New Roman" w:cs="" w:asciiTheme="majorBidi" w:cstheme="majorBidi" w:hAnsiTheme="majorBidi"/>
+          <w:b/>
+          <w:bCs/>
+          <w:color w:val="0000FF"/>
+          <w:kern w:val="0"/>
+          <w:sz w:val="20"/>
+          <w:szCs w:val="20"/>
+          <w:lang w:eastAsia="en-GB"/>
+          <w14:ligatures w14:val="none"/>
+        </w:rPr>
+        <w:t>l</w:t>
+      </w:r>
+      <w:r>
+        <w:rPr>
+          <w:rFonts w:eastAsia="Times New Roman" w:cs="" w:asciiTheme="majorBidi" w:cstheme="majorBidi" w:hAnsiTheme="majorBidi"/>
+          <w:b/>
+          <w:bCs/>
+          <w:color w:val="0000FF"/>
+          <w:kern w:val="0"/>
+          <w:sz w:val="20"/>
+          <w:szCs w:val="20"/>
+          <w:lang w:eastAsia="en-GB"/>
+          <w14:ligatures w14:val="none"/>
+        </w:rPr>
+        <w:t>e</w:t>
+      </w:r>
+      <w:r>
+        <w:rPr>
+          <w:rFonts w:eastAsia="Times New Roman" w:cs="" w:asciiTheme="majorBidi" w:cstheme="majorBidi" w:hAnsiTheme="majorBidi"/>
+          <w:b/>
+          <w:bCs/>
+          <w:color w:val="0000FF"/>
+          <w:kern w:val="0"/>
+          <w:sz w:val="20"/>
+          <w:szCs w:val="20"/>
+          <w:lang w:eastAsia="en-GB"/>
+          <w14:ligatures w14:val="none"/>
+        </w:rPr>
+        <w:t>s</w:t>
+      </w:r>
+    </w:p>
+    <w:p>
+      <w:pPr>
+        <w:pStyle w:val="Normal"/>
+        <w:shd w:val="clear" w:color="auto" w:fill="FFFFFF"/>
+        <w:spacing w:lineRule="auto" w:line="240" w:before="240" w:after="0"/>
+        <w:jc w:val="both"/>
+        <w:rPr>
+          <w:rFonts w:eastAsia="Times New Roman" w:cs="" w:asciiTheme="majorBidi" w:cstheme="majorBidi" w:hAnsiTheme="majorBidi"/>
+          <w:color w:val="373D3F"/>
+          <w:kern w:val="0"/>
+          <w:sz w:val="20"/>
+          <w:szCs w:val="20"/>
+          <w:lang w:eastAsia="en-GB"/>
+          <w14:ligatures w14:val="none"/>
+        </w:rPr>
+      </w:pPr>
+      <w:r>
+        <w:rPr>
+          <w:rFonts w:eastAsia="Times New Roman" w:cs="" w:asciiTheme="majorBidi" w:cstheme="majorBidi" w:hAnsiTheme="majorBidi"/>
+          <w:color w:val="0000FF"/>
+          <w:kern w:val="0"/>
+          <w:sz w:val="20"/>
+          <w:szCs w:val="20"/>
+          <w:lang w:eastAsia="en-GB"/>
+          <w14:ligatures w14:val="none"/>
+        </w:rPr>
+        <w:t>User Authentication &amp; Security Control: Secures local system access dynamically based on designated employee roles</w:t>
+      </w:r>
+    </w:p>
+    <w:p>
+      <w:pPr>
+        <w:pStyle w:val="Normal"/>
+        <w:shd w:val="clear" w:color="auto" w:fill="FFFFFF"/>
+        <w:spacing w:lineRule="auto" w:line="240" w:before="240" w:after="0"/>
+        <w:jc w:val="both"/>
+        <w:rPr>
+          <w:rFonts w:eastAsia="Times New Roman" w:cs="" w:asciiTheme="majorBidi" w:cstheme="majorBidi" w:hAnsiTheme="majorBidi"/>
+          <w:color w:val="373D3F"/>
+          <w:kern w:val="0"/>
+          <w:sz w:val="20"/>
+          <w:szCs w:val="20"/>
+          <w:lang w:eastAsia="en-GB"/>
+          <w14:ligatures w14:val="none"/>
+        </w:rPr>
+      </w:pPr>
+      <w:r>
+        <w:rPr>
+          <w:rFonts w:eastAsia="Times New Roman" w:cs="" w:asciiTheme="majorBidi" w:cstheme="majorBidi" w:hAnsiTheme="majorBidi"/>
+          <w:b/>
+          <w:bCs/>
+          <w:color w:val="0000FF"/>
+          <w:kern w:val="0"/>
+          <w:sz w:val="20"/>
+          <w:szCs w:val="20"/>
+          <w:lang w:eastAsia="en-GB"/>
+          <w14:ligatures w14:val="none"/>
+        </w:rPr>
+        <w:t>3.2. Room management</w:t>
+      </w:r>
+    </w:p>
+    <w:p>
+      <w:pPr>
+        <w:pStyle w:val="Normal"/>
+        <w:shd w:val="clear" w:color="auto" w:fill="FFFFFF"/>
+        <w:spacing w:lineRule="auto" w:line="240" w:before="240" w:after="0"/>
+        <w:jc w:val="both"/>
+        <w:rPr>
+          <w:rFonts w:eastAsia="Times New Roman" w:cs="" w:asciiTheme="majorBidi" w:cstheme="majorBidi" w:hAnsiTheme="majorBidi"/>
+          <w:b w:val="false"/>
+          <w:bCs w:val="false"/>
+          <w:color w:val="0000FF"/>
+          <w:kern w:val="0"/>
+          <w:sz w:val="20"/>
+          <w:szCs w:val="20"/>
+          <w:lang w:eastAsia="en-GB"/>
+          <w14:ligatures w14:val="none"/>
+        </w:rPr>
+      </w:pPr>
+      <w:r>
+        <w:rPr>
+          <w:rFonts w:eastAsia="Times New Roman" w:cs="" w:asciiTheme="majorBidi" w:cstheme="majorBidi" w:hAnsiTheme="majorBidi"/>
+          <w:b w:val="false"/>
+          <w:bCs w:val="false"/>
+          <w:color w:val="0000FF"/>
+          <w:kern w:val="0"/>
+          <w:sz w:val="20"/>
+          <w:szCs w:val="20"/>
+          <w:lang w:eastAsia="en-GB"/>
+          <w14:ligatures w14:val="none"/>
+        </w:rPr>
+        <w:t>Room Inventory Management: Provides real-time digital allocation, filtering, and automated updates of room cleanliness statuses</w:t>
+      </w:r>
+    </w:p>
+    <w:p>
+      <w:pPr>
+        <w:pStyle w:val="Normal"/>
+        <w:shd w:val="clear" w:color="auto" w:fill="FFFFFF"/>
+        <w:spacing w:lineRule="auto" w:line="240" w:before="240" w:after="0"/>
+        <w:jc w:val="both"/>
+        <w:rPr>
+          <w:rFonts w:eastAsia="Times New Roman" w:cs="" w:asciiTheme="majorBidi" w:cstheme="majorBidi" w:hAnsiTheme="majorBidi"/>
+          <w:b/>
+          <w:bCs/>
+          <w:color w:val="0000FF"/>
+          <w:kern w:val="0"/>
+          <w:sz w:val="20"/>
+          <w:szCs w:val="20"/>
+          <w:lang w:eastAsia="en-GB"/>
+          <w14:ligatures w14:val="none"/>
+        </w:rPr>
+      </w:pPr>
+      <w:r>
+        <w:rPr>
+          <w:rFonts w:eastAsia="Times New Roman" w:cs="" w:asciiTheme="majorBidi" w:cstheme="majorBidi" w:hAnsiTheme="majorBidi"/>
+          <w:b/>
+          <w:bCs/>
+          <w:color w:val="0000FF"/>
+          <w:kern w:val="0"/>
+          <w:sz w:val="20"/>
+          <w:szCs w:val="20"/>
+          <w:lang w:eastAsia="en-GB"/>
+          <w14:ligatures w14:val="none"/>
+        </w:rPr>
+        <w:t>3.3. Reservations</w:t>
+      </w:r>
+    </w:p>
+    <w:p>
+      <w:pPr>
+        <w:pStyle w:val="Normal"/>
+        <w:shd w:val="clear" w:color="auto" w:fill="FFFFFF"/>
+        <w:spacing w:lineRule="auto" w:line="240" w:before="240" w:after="0"/>
+        <w:jc w:val="both"/>
+        <w:rPr>
+          <w:rFonts w:eastAsia="Times New Roman" w:cs="" w:asciiTheme="majorBidi" w:cstheme="majorBidi" w:hAnsiTheme="majorBidi"/>
+          <w:b w:val="false"/>
+          <w:bCs w:val="false"/>
+          <w:color w:val="0000FF"/>
+          <w:kern w:val="0"/>
+          <w:sz w:val="20"/>
+          <w:szCs w:val="20"/>
+          <w:lang w:eastAsia="en-GB"/>
+          <w14:ligatures w14:val="none"/>
+        </w:rPr>
+      </w:pPr>
+      <w:r>
+        <w:rPr>
+          <w:rFonts w:eastAsia="Times New Roman" w:cs="" w:asciiTheme="majorBidi" w:cstheme="majorBidi" w:hAnsiTheme="majorBidi"/>
+          <w:b w:val="false"/>
+          <w:bCs w:val="false"/>
+          <w:color w:val="0000FF"/>
+          <w:kern w:val="0"/>
+          <w:sz w:val="20"/>
+          <w:szCs w:val="20"/>
+          <w:lang w:eastAsia="en-GB"/>
+          <w14:ligatures w14:val="none"/>
+        </w:rPr>
+        <w:t xml:space="preserve">Guest Reservation &amp; Booking Engine: Manages guest data entries, check-in operations, and conditional booking cancellations </w:t>
+      </w:r>
+    </w:p>
+    <w:p>
+      <w:pPr>
+        <w:pStyle w:val="Normal"/>
+        <w:shd w:val="clear" w:color="auto" w:fill="FFFFFF"/>
+        <w:spacing w:lineRule="auto" w:line="240" w:before="240" w:after="0"/>
+        <w:jc w:val="both"/>
+        <w:rPr>
+          <w:rFonts w:eastAsia="Times New Roman" w:cs="" w:asciiTheme="majorBidi" w:cstheme="majorBidi" w:hAnsiTheme="majorBidi"/>
+          <w:b/>
+          <w:bCs/>
+          <w:color w:val="0000FF"/>
+          <w:kern w:val="0"/>
+          <w:sz w:val="20"/>
+          <w:szCs w:val="20"/>
+          <w:lang w:eastAsia="en-GB"/>
+          <w14:ligatures w14:val="none"/>
+        </w:rPr>
+      </w:pPr>
+      <w:r>
+        <w:rPr>
+          <w:rFonts w:eastAsia="Times New Roman" w:cs="" w:asciiTheme="majorBidi" w:cstheme="majorBidi" w:hAnsiTheme="majorBidi"/>
+          <w:b/>
+          <w:bCs/>
+          <w:color w:val="0000FF"/>
+          <w:kern w:val="0"/>
+          <w:sz w:val="20"/>
+          <w:szCs w:val="20"/>
+          <w:lang w:eastAsia="en-GB"/>
+          <w14:ligatures w14:val="none"/>
+        </w:rPr>
+        <w:t>3.4. Billing calculation</w:t>
+      </w:r>
+    </w:p>
+    <w:p>
+      <w:pPr>
+        <w:pStyle w:val="Normal"/>
+        <w:shd w:val="clear" w:color="auto" w:fill="FFFFFF"/>
+        <w:spacing w:lineRule="auto" w:line="240" w:before="240" w:after="0"/>
+        <w:jc w:val="both"/>
+        <w:rPr>
+          <w:rFonts w:eastAsia="Times New Roman" w:cs="" w:asciiTheme="majorBidi" w:cstheme="majorBidi" w:hAnsiTheme="majorBidi"/>
+          <w:b w:val="false"/>
+          <w:bCs w:val="false"/>
+          <w:color w:val="0000FF"/>
+          <w:kern w:val="0"/>
+          <w:sz w:val="20"/>
+          <w:szCs w:val="20"/>
+          <w:lang w:eastAsia="en-GB"/>
+          <w14:ligatures w14:val="none"/>
+        </w:rPr>
+      </w:pPr>
+      <w:r>
+        <w:rPr>
+          <w:rFonts w:eastAsia="Times New Roman" w:cs="" w:asciiTheme="majorBidi" w:cstheme="majorBidi" w:hAnsiTheme="majorBidi"/>
+          <w:b w:val="false"/>
+          <w:bCs w:val="false"/>
+          <w:color w:val="0000FF"/>
+          <w:kern w:val="0"/>
+          <w:sz w:val="20"/>
+          <w:szCs w:val="20"/>
+          <w:lang w:eastAsia="en-GB"/>
+          <w14:ligatures w14:val="none"/>
+        </w:rPr>
+        <w:t>Automated Billing Processing: Dynamically handles calculations for client invoicing upon checkout based on localized system parameters</w:t>
       </w:r>
     </w:p>
     <w:p>
@@ -5301,11 +6015,25 @@
       <w:bCs/>
     </w:rPr>
   </w:style>
+  <w:style w:type="character" w:styleId="Bulletsuser">
+    <w:name w:val="Bullets (user)"/>
+    <w:qFormat/>
+    <w:rPr>
+      <w:rFonts w:ascii="OpenSymbol" w:hAnsi="OpenSymbol" w:eastAsia="OpenSymbol" w:cs="OpenSymbol"/>
+    </w:rPr>
+  </w:style>
   <w:style w:type="character" w:styleId="Bullets">
     <w:name w:val="Bullets"/>
     <w:qFormat/>
     <w:rPr>
       <w:rFonts w:ascii="OpenSymbol" w:hAnsi="OpenSymbol" w:eastAsia="OpenSymbol" w:cs="OpenSymbol"/>
+    </w:rPr>
+  </w:style>
+  <w:style w:type="character" w:styleId="SourceText">
+    <w:name w:val="Source Text"/>
+    <w:qFormat/>
+    <w:rPr>
+      <w:rFonts w:ascii="Liberation Mono" w:hAnsi="Liberation Mono" w:eastAsia="Liberation Mono" w:cs="Liberation Mono"/>
     </w:rPr>
   </w:style>
   <w:style w:type="paragraph" w:styleId="Heading">

</xml_diff>

<commit_message>
feat: v2 - update use cases
</commit_message>
<xml_diff>
--- a/Adrian Kucyk SRS.docx
+++ b/Adrian Kucyk SRS.docx
@@ -122,21 +122,65 @@
           <w:lang w:eastAsia="en-GB"/>
           <w14:ligatures w14:val="none"/>
         </w:rPr>
-        <w:t>«</w:t>
-      </w:r>
+        <w:t>«StayEase – Hotel Management System»</w:t>
+      </w:r>
+    </w:p>
+    <w:p>
+      <w:pPr>
+        <w:pStyle w:val="Normal"/>
+        <w:shd w:val="clear" w:color="auto" w:fill="FFFFFF"/>
+        <w:spacing w:lineRule="auto" w:line="240" w:before="240" w:after="0"/>
+        <w:rPr>
+          <w:rFonts w:eastAsia="Times New Roman" w:cs="" w:asciiTheme="majorBidi" w:cstheme="majorBidi" w:hAnsiTheme="majorBidi"/>
+          <w:color w:val="373D3F"/>
+          <w:kern w:val="0"/>
+          <w:sz w:val="20"/>
+          <w:szCs w:val="20"/>
+          <w:lang w:eastAsia="en-GB"/>
+          <w14:ligatures w14:val="none"/>
+        </w:rPr>
+      </w:pPr>
+      <w:r>
+        <w:rPr>
+          <w:rFonts w:eastAsia="Times New Roman" w:cs="" w:asciiTheme="majorBidi" w:cstheme="majorBidi" w:hAnsiTheme="majorBidi"/>
+          <w:color w:val="373D3F"/>
+          <w:kern w:val="0"/>
+          <w:sz w:val="20"/>
+          <w:szCs w:val="20"/>
+          <w:lang w:eastAsia="en-GB"/>
+          <w14:ligatures w14:val="none"/>
+        </w:rPr>
+      </w:r>
+    </w:p>
+    <w:p>
+      <w:pPr>
+        <w:pStyle w:val="Normal"/>
+        <w:shd w:val="clear" w:color="auto" w:fill="FFFFFF"/>
+        <w:bidi w:val="0"/>
+        <w:spacing w:lineRule="auto" w:line="240" w:before="240" w:after="0"/>
+        <w:rPr>
+          <w:rFonts w:eastAsia="Times New Roman" w:cs="" w:asciiTheme="majorBidi" w:cstheme="majorBidi" w:hAnsiTheme="majorBidi"/>
+          <w:color w:val="373D3F"/>
+          <w:kern w:val="0"/>
+          <w:sz w:val="20"/>
+          <w:szCs w:val="20"/>
+          <w:lang w:eastAsia="en-GB"/>
+          <w14:ligatures w14:val="none"/>
+        </w:rPr>
+      </w:pPr>
       <w:r>
         <w:rPr>
           <w:rFonts w:eastAsia="Times New Roman" w:cs="" w:asciiTheme="majorBidi" w:cstheme="majorBidi" w:hAnsiTheme="majorBidi"/>
           <w:b/>
           <w:bCs/>
-          <w:color w:val="0000FF"/>
-          <w:kern w:val="0"/>
-          <w:sz w:val="20"/>
-          <w:szCs w:val="20"/>
-          <w:lang w:eastAsia="en-GB"/>
-          <w14:ligatures w14:val="none"/>
-        </w:rPr>
-        <w:t>S</w:t>
+          <w:color w:val="373D3F"/>
+          <w:kern w:val="0"/>
+          <w:sz w:val="20"/>
+          <w:szCs w:val="20"/>
+          <w:lang w:eastAsia="en-GB"/>
+          <w14:ligatures w14:val="none"/>
+        </w:rPr>
+        <w:t>Version </w:t>
       </w:r>
       <w:r>
         <w:rPr>
@@ -150,471 +194,7 @@
           <w:lang w:eastAsia="en-GB"/>
           <w14:ligatures w14:val="none"/>
         </w:rPr>
-        <w:t>t</w:t>
-      </w:r>
-      <w:r>
-        <w:rPr>
-          <w:rFonts w:eastAsia="Times New Roman" w:cs="" w:asciiTheme="majorBidi" w:cstheme="majorBidi" w:hAnsiTheme="majorBidi"/>
-          <w:b/>
-          <w:bCs/>
-          <w:color w:val="0000FF"/>
-          <w:kern w:val="0"/>
-          <w:sz w:val="20"/>
-          <w:szCs w:val="20"/>
-          <w:lang w:eastAsia="en-GB"/>
-          <w14:ligatures w14:val="none"/>
-        </w:rPr>
-        <w:t>a</w:t>
-      </w:r>
-      <w:r>
-        <w:rPr>
-          <w:rFonts w:eastAsia="Times New Roman" w:cs="" w:asciiTheme="majorBidi" w:cstheme="majorBidi" w:hAnsiTheme="majorBidi"/>
-          <w:b/>
-          <w:bCs/>
-          <w:color w:val="0000FF"/>
-          <w:kern w:val="0"/>
-          <w:sz w:val="20"/>
-          <w:szCs w:val="20"/>
-          <w:lang w:eastAsia="en-GB"/>
-          <w14:ligatures w14:val="none"/>
-        </w:rPr>
-        <w:t>y</w:t>
-      </w:r>
-      <w:r>
-        <w:rPr>
-          <w:rFonts w:eastAsia="Times New Roman" w:cs="" w:asciiTheme="majorBidi" w:cstheme="majorBidi" w:hAnsiTheme="majorBidi"/>
-          <w:b/>
-          <w:bCs/>
-          <w:color w:val="0000FF"/>
-          <w:kern w:val="0"/>
-          <w:sz w:val="20"/>
-          <w:szCs w:val="20"/>
-          <w:lang w:eastAsia="en-GB"/>
-          <w14:ligatures w14:val="none"/>
-        </w:rPr>
-        <w:t>E</w:t>
-      </w:r>
-      <w:r>
-        <w:rPr>
-          <w:rFonts w:eastAsia="Times New Roman" w:cs="" w:asciiTheme="majorBidi" w:cstheme="majorBidi" w:hAnsiTheme="majorBidi"/>
-          <w:b/>
-          <w:bCs/>
-          <w:color w:val="0000FF"/>
-          <w:kern w:val="0"/>
-          <w:sz w:val="20"/>
-          <w:szCs w:val="20"/>
-          <w:lang w:eastAsia="en-GB"/>
-          <w14:ligatures w14:val="none"/>
-        </w:rPr>
-        <w:t>a</w:t>
-      </w:r>
-      <w:r>
-        <w:rPr>
-          <w:rFonts w:eastAsia="Times New Roman" w:cs="" w:asciiTheme="majorBidi" w:cstheme="majorBidi" w:hAnsiTheme="majorBidi"/>
-          <w:b/>
-          <w:bCs/>
-          <w:color w:val="0000FF"/>
-          <w:kern w:val="0"/>
-          <w:sz w:val="20"/>
-          <w:szCs w:val="20"/>
-          <w:lang w:eastAsia="en-GB"/>
-          <w14:ligatures w14:val="none"/>
-        </w:rPr>
-        <w:t>s</w:t>
-      </w:r>
-      <w:r>
-        <w:rPr>
-          <w:rFonts w:eastAsia="Times New Roman" w:cs="" w:asciiTheme="majorBidi" w:cstheme="majorBidi" w:hAnsiTheme="majorBidi"/>
-          <w:b/>
-          <w:bCs/>
-          <w:color w:val="0000FF"/>
-          <w:kern w:val="0"/>
-          <w:sz w:val="20"/>
-          <w:szCs w:val="20"/>
-          <w:lang w:eastAsia="en-GB"/>
-          <w14:ligatures w14:val="none"/>
-        </w:rPr>
-        <w:t xml:space="preserve">e – </w:t>
-      </w:r>
-      <w:r>
-        <w:rPr>
-          <w:rFonts w:eastAsia="Times New Roman" w:cs="" w:asciiTheme="majorBidi" w:cstheme="majorBidi" w:hAnsiTheme="majorBidi"/>
-          <w:b/>
-          <w:bCs/>
-          <w:color w:val="0000FF"/>
-          <w:kern w:val="0"/>
-          <w:sz w:val="20"/>
-          <w:szCs w:val="20"/>
-          <w:lang w:eastAsia="en-GB"/>
-          <w14:ligatures w14:val="none"/>
-        </w:rPr>
-        <w:t>H</w:t>
-      </w:r>
-      <w:r>
-        <w:rPr>
-          <w:rFonts w:eastAsia="Times New Roman" w:cs="" w:asciiTheme="majorBidi" w:cstheme="majorBidi" w:hAnsiTheme="majorBidi"/>
-          <w:b/>
-          <w:bCs/>
-          <w:color w:val="0000FF"/>
-          <w:kern w:val="0"/>
-          <w:sz w:val="20"/>
-          <w:szCs w:val="20"/>
-          <w:lang w:eastAsia="en-GB"/>
-          <w14:ligatures w14:val="none"/>
-        </w:rPr>
-        <w:t>o</w:t>
-      </w:r>
-      <w:r>
-        <w:rPr>
-          <w:rFonts w:eastAsia="Times New Roman" w:cs="" w:asciiTheme="majorBidi" w:cstheme="majorBidi" w:hAnsiTheme="majorBidi"/>
-          <w:b/>
-          <w:bCs/>
-          <w:color w:val="0000FF"/>
-          <w:kern w:val="0"/>
-          <w:sz w:val="20"/>
-          <w:szCs w:val="20"/>
-          <w:lang w:eastAsia="en-GB"/>
-          <w14:ligatures w14:val="none"/>
-        </w:rPr>
-        <w:t>t</w:t>
-      </w:r>
-      <w:r>
-        <w:rPr>
-          <w:rFonts w:eastAsia="Times New Roman" w:cs="" w:asciiTheme="majorBidi" w:cstheme="majorBidi" w:hAnsiTheme="majorBidi"/>
-          <w:b/>
-          <w:bCs/>
-          <w:color w:val="0000FF"/>
-          <w:kern w:val="0"/>
-          <w:sz w:val="20"/>
-          <w:szCs w:val="20"/>
-          <w:lang w:eastAsia="en-GB"/>
-          <w14:ligatures w14:val="none"/>
-        </w:rPr>
-        <w:t>e</w:t>
-      </w:r>
-      <w:r>
-        <w:rPr>
-          <w:rFonts w:eastAsia="Times New Roman" w:cs="" w:asciiTheme="majorBidi" w:cstheme="majorBidi" w:hAnsiTheme="majorBidi"/>
-          <w:b/>
-          <w:bCs/>
-          <w:color w:val="0000FF"/>
-          <w:kern w:val="0"/>
-          <w:sz w:val="20"/>
-          <w:szCs w:val="20"/>
-          <w:lang w:eastAsia="en-GB"/>
-          <w14:ligatures w14:val="none"/>
-        </w:rPr>
-        <w:t xml:space="preserve">l </w:t>
-      </w:r>
-      <w:r>
-        <w:rPr>
-          <w:rFonts w:eastAsia="Times New Roman" w:cs="" w:asciiTheme="majorBidi" w:cstheme="majorBidi" w:hAnsiTheme="majorBidi"/>
-          <w:b/>
-          <w:bCs/>
-          <w:color w:val="0000FF"/>
-          <w:kern w:val="0"/>
-          <w:sz w:val="20"/>
-          <w:szCs w:val="20"/>
-          <w:lang w:eastAsia="en-GB"/>
-          <w14:ligatures w14:val="none"/>
-        </w:rPr>
-        <w:t>M</w:t>
-      </w:r>
-      <w:r>
-        <w:rPr>
-          <w:rFonts w:eastAsia="Times New Roman" w:cs="" w:asciiTheme="majorBidi" w:cstheme="majorBidi" w:hAnsiTheme="majorBidi"/>
-          <w:b/>
-          <w:bCs/>
-          <w:color w:val="0000FF"/>
-          <w:kern w:val="0"/>
-          <w:sz w:val="20"/>
-          <w:szCs w:val="20"/>
-          <w:lang w:eastAsia="en-GB"/>
-          <w14:ligatures w14:val="none"/>
-        </w:rPr>
-        <w:t>a</w:t>
-      </w:r>
-      <w:r>
-        <w:rPr>
-          <w:rFonts w:eastAsia="Times New Roman" w:cs="" w:asciiTheme="majorBidi" w:cstheme="majorBidi" w:hAnsiTheme="majorBidi"/>
-          <w:b/>
-          <w:bCs/>
-          <w:color w:val="0000FF"/>
-          <w:kern w:val="0"/>
-          <w:sz w:val="20"/>
-          <w:szCs w:val="20"/>
-          <w:lang w:eastAsia="en-GB"/>
-          <w14:ligatures w14:val="none"/>
-        </w:rPr>
-        <w:t>n</w:t>
-      </w:r>
-      <w:r>
-        <w:rPr>
-          <w:rFonts w:eastAsia="Times New Roman" w:cs="" w:asciiTheme="majorBidi" w:cstheme="majorBidi" w:hAnsiTheme="majorBidi"/>
-          <w:b/>
-          <w:bCs/>
-          <w:color w:val="0000FF"/>
-          <w:kern w:val="0"/>
-          <w:sz w:val="20"/>
-          <w:szCs w:val="20"/>
-          <w:lang w:eastAsia="en-GB"/>
-          <w14:ligatures w14:val="none"/>
-        </w:rPr>
-        <w:t>a</w:t>
-      </w:r>
-      <w:r>
-        <w:rPr>
-          <w:rFonts w:eastAsia="Times New Roman" w:cs="" w:asciiTheme="majorBidi" w:cstheme="majorBidi" w:hAnsiTheme="majorBidi"/>
-          <w:b/>
-          <w:bCs/>
-          <w:color w:val="0000FF"/>
-          <w:kern w:val="0"/>
-          <w:sz w:val="20"/>
-          <w:szCs w:val="20"/>
-          <w:lang w:eastAsia="en-GB"/>
-          <w14:ligatures w14:val="none"/>
-        </w:rPr>
-        <w:t>g</w:t>
-      </w:r>
-      <w:r>
-        <w:rPr>
-          <w:rFonts w:eastAsia="Times New Roman" w:cs="" w:asciiTheme="majorBidi" w:cstheme="majorBidi" w:hAnsiTheme="majorBidi"/>
-          <w:b/>
-          <w:bCs/>
-          <w:color w:val="0000FF"/>
-          <w:kern w:val="0"/>
-          <w:sz w:val="20"/>
-          <w:szCs w:val="20"/>
-          <w:lang w:eastAsia="en-GB"/>
-          <w14:ligatures w14:val="none"/>
-        </w:rPr>
-        <w:t>e</w:t>
-      </w:r>
-      <w:r>
-        <w:rPr>
-          <w:rFonts w:eastAsia="Times New Roman" w:cs="" w:asciiTheme="majorBidi" w:cstheme="majorBidi" w:hAnsiTheme="majorBidi"/>
-          <w:b/>
-          <w:bCs/>
-          <w:color w:val="0000FF"/>
-          <w:kern w:val="0"/>
-          <w:sz w:val="20"/>
-          <w:szCs w:val="20"/>
-          <w:lang w:eastAsia="en-GB"/>
-          <w14:ligatures w14:val="none"/>
-        </w:rPr>
-        <w:t>m</w:t>
-      </w:r>
-      <w:r>
-        <w:rPr>
-          <w:rFonts w:eastAsia="Times New Roman" w:cs="" w:asciiTheme="majorBidi" w:cstheme="majorBidi" w:hAnsiTheme="majorBidi"/>
-          <w:b/>
-          <w:bCs/>
-          <w:color w:val="0000FF"/>
-          <w:kern w:val="0"/>
-          <w:sz w:val="20"/>
-          <w:szCs w:val="20"/>
-          <w:lang w:eastAsia="en-GB"/>
-          <w14:ligatures w14:val="none"/>
-        </w:rPr>
-        <w:t>e</w:t>
-      </w:r>
-      <w:r>
-        <w:rPr>
-          <w:rFonts w:eastAsia="Times New Roman" w:cs="" w:asciiTheme="majorBidi" w:cstheme="majorBidi" w:hAnsiTheme="majorBidi"/>
-          <w:b/>
-          <w:bCs/>
-          <w:color w:val="0000FF"/>
-          <w:kern w:val="0"/>
-          <w:sz w:val="20"/>
-          <w:szCs w:val="20"/>
-          <w:lang w:eastAsia="en-GB"/>
-          <w14:ligatures w14:val="none"/>
-        </w:rPr>
-        <w:t>n</w:t>
-      </w:r>
-      <w:r>
-        <w:rPr>
-          <w:rFonts w:eastAsia="Times New Roman" w:cs="" w:asciiTheme="majorBidi" w:cstheme="majorBidi" w:hAnsiTheme="majorBidi"/>
-          <w:b/>
-          <w:bCs/>
-          <w:color w:val="0000FF"/>
-          <w:kern w:val="0"/>
-          <w:sz w:val="20"/>
-          <w:szCs w:val="20"/>
-          <w:lang w:eastAsia="en-GB"/>
-          <w14:ligatures w14:val="none"/>
-        </w:rPr>
-        <w:t xml:space="preserve">t </w:t>
-      </w:r>
-      <w:r>
-        <w:rPr>
-          <w:rFonts w:eastAsia="Times New Roman" w:cs="" w:asciiTheme="majorBidi" w:cstheme="majorBidi" w:hAnsiTheme="majorBidi"/>
-          <w:b/>
-          <w:bCs/>
-          <w:color w:val="0000FF"/>
-          <w:kern w:val="0"/>
-          <w:sz w:val="20"/>
-          <w:szCs w:val="20"/>
-          <w:lang w:eastAsia="en-GB"/>
-          <w14:ligatures w14:val="none"/>
-        </w:rPr>
-        <w:t>S</w:t>
-      </w:r>
-      <w:r>
-        <w:rPr>
-          <w:rFonts w:eastAsia="Times New Roman" w:cs="" w:asciiTheme="majorBidi" w:cstheme="majorBidi" w:hAnsiTheme="majorBidi"/>
-          <w:b/>
-          <w:bCs/>
-          <w:color w:val="0000FF"/>
-          <w:kern w:val="0"/>
-          <w:sz w:val="20"/>
-          <w:szCs w:val="20"/>
-          <w:lang w:eastAsia="en-GB"/>
-          <w14:ligatures w14:val="none"/>
-        </w:rPr>
-        <w:t>y</w:t>
-      </w:r>
-      <w:r>
-        <w:rPr>
-          <w:rFonts w:eastAsia="Times New Roman" w:cs="" w:asciiTheme="majorBidi" w:cstheme="majorBidi" w:hAnsiTheme="majorBidi"/>
-          <w:b/>
-          <w:bCs/>
-          <w:color w:val="0000FF"/>
-          <w:kern w:val="0"/>
-          <w:sz w:val="20"/>
-          <w:szCs w:val="20"/>
-          <w:lang w:eastAsia="en-GB"/>
-          <w14:ligatures w14:val="none"/>
-        </w:rPr>
-        <w:t>s</w:t>
-      </w:r>
-      <w:r>
-        <w:rPr>
-          <w:rFonts w:eastAsia="Times New Roman" w:cs="" w:asciiTheme="majorBidi" w:cstheme="majorBidi" w:hAnsiTheme="majorBidi"/>
-          <w:b/>
-          <w:bCs/>
-          <w:color w:val="0000FF"/>
-          <w:kern w:val="0"/>
-          <w:sz w:val="20"/>
-          <w:szCs w:val="20"/>
-          <w:lang w:eastAsia="en-GB"/>
-          <w14:ligatures w14:val="none"/>
-        </w:rPr>
-        <w:t>t</w:t>
-      </w:r>
-      <w:r>
-        <w:rPr>
-          <w:rFonts w:eastAsia="Times New Roman" w:cs="" w:asciiTheme="majorBidi" w:cstheme="majorBidi" w:hAnsiTheme="majorBidi"/>
-          <w:b/>
-          <w:bCs/>
-          <w:color w:val="0000FF"/>
-          <w:kern w:val="0"/>
-          <w:sz w:val="20"/>
-          <w:szCs w:val="20"/>
-          <w:lang w:eastAsia="en-GB"/>
-          <w14:ligatures w14:val="none"/>
-        </w:rPr>
-        <w:t>e</w:t>
-      </w:r>
-      <w:r>
-        <w:rPr>
-          <w:rFonts w:eastAsia="Times New Roman" w:cs="" w:asciiTheme="majorBidi" w:cstheme="majorBidi" w:hAnsiTheme="majorBidi"/>
-          <w:b/>
-          <w:bCs/>
-          <w:color w:val="0000FF"/>
-          <w:kern w:val="0"/>
-          <w:sz w:val="20"/>
-          <w:szCs w:val="20"/>
-          <w:lang w:eastAsia="en-GB"/>
-          <w14:ligatures w14:val="none"/>
-        </w:rPr>
-        <w:t>m</w:t>
-      </w:r>
-      <w:r>
-        <w:rPr>
-          <w:rFonts w:eastAsia="Times New Roman" w:cs="" w:asciiTheme="majorBidi" w:cstheme="majorBidi" w:hAnsiTheme="majorBidi"/>
-          <w:b/>
-          <w:bCs/>
-          <w:color w:val="0000FF"/>
-          <w:kern w:val="0"/>
-          <w:sz w:val="20"/>
-          <w:szCs w:val="20"/>
-          <w:lang w:eastAsia="en-GB"/>
-          <w14:ligatures w14:val="none"/>
-        </w:rPr>
-        <w:t>»</w:t>
-      </w:r>
-    </w:p>
-    <w:p>
-      <w:pPr>
-        <w:pStyle w:val="Normal"/>
-        <w:shd w:val="clear" w:color="auto" w:fill="FFFFFF"/>
-        <w:spacing w:lineRule="auto" w:line="240" w:before="240" w:after="0"/>
-        <w:rPr>
-          <w:rFonts w:eastAsia="Times New Roman" w:cs="" w:asciiTheme="majorBidi" w:cstheme="majorBidi" w:hAnsiTheme="majorBidi"/>
-          <w:color w:val="373D3F"/>
-          <w:kern w:val="0"/>
-          <w:sz w:val="20"/>
-          <w:szCs w:val="20"/>
-          <w:lang w:eastAsia="en-GB"/>
-          <w14:ligatures w14:val="none"/>
-        </w:rPr>
-      </w:pPr>
-      <w:r>
-        <w:rPr>
-          <w:rFonts w:eastAsia="Times New Roman" w:cs="" w:asciiTheme="majorBidi" w:cstheme="majorBidi" w:hAnsiTheme="majorBidi"/>
-          <w:color w:val="373D3F"/>
-          <w:kern w:val="0"/>
-          <w:sz w:val="20"/>
-          <w:szCs w:val="20"/>
-          <w:lang w:eastAsia="en-GB"/>
-          <w14:ligatures w14:val="none"/>
-        </w:rPr>
-      </w:r>
-    </w:p>
-    <w:p>
-      <w:pPr>
-        <w:pStyle w:val="Normal"/>
-        <w:shd w:val="clear" w:color="auto" w:fill="FFFFFF"/>
-        <w:bidi w:val="0"/>
-        <w:spacing w:lineRule="auto" w:line="240" w:before="240" w:after="0"/>
-        <w:rPr>
-          <w:rFonts w:eastAsia="Times New Roman" w:cs="" w:asciiTheme="majorBidi" w:cstheme="majorBidi" w:hAnsiTheme="majorBidi"/>
-          <w:color w:val="373D3F"/>
-          <w:kern w:val="0"/>
-          <w:sz w:val="20"/>
-          <w:szCs w:val="20"/>
-          <w:lang w:eastAsia="en-GB"/>
-          <w14:ligatures w14:val="none"/>
-        </w:rPr>
-      </w:pPr>
-      <w:r>
-        <w:rPr>
-          <w:rFonts w:eastAsia="Times New Roman" w:cs="" w:asciiTheme="majorBidi" w:cstheme="majorBidi" w:hAnsiTheme="majorBidi"/>
-          <w:b/>
-          <w:bCs/>
-          <w:color w:val="373D3F"/>
-          <w:kern w:val="0"/>
-          <w:sz w:val="20"/>
-          <w:szCs w:val="20"/>
-          <w:lang w:eastAsia="en-GB"/>
-          <w14:ligatures w14:val="none"/>
-        </w:rPr>
-        <w:t>Version </w:t>
-      </w:r>
-      <w:r>
-        <w:rPr>
-          <w:rFonts w:eastAsia="Times New Roman" w:cs="" w:asciiTheme="majorBidi" w:cstheme="majorBidi" w:hAnsiTheme="majorBidi"/>
-          <w:b/>
-          <w:bCs/>
-          <w:color w:val="0000FF"/>
-          <w:kern w:val="0"/>
-          <w:sz w:val="20"/>
-          <w:szCs w:val="20"/>
-          <w:lang w:eastAsia="en-GB"/>
-          <w14:ligatures w14:val="none"/>
-        </w:rPr>
-        <w:t>«v1»</w:t>
+        <w:t>«v2»</w:t>
       </w:r>
     </w:p>
     <w:p>
@@ -883,16 +463,16 @@
         <w:tblLook w:noHBand="0" w:noVBand="1" w:firstColumn="1" w:lastRow="0" w:lastColumn="0" w:firstRow="1" w:val="04a0"/>
       </w:tblPr>
       <w:tblGrid>
-        <w:gridCol w:w="1090"/>
+        <w:gridCol w:w="1088"/>
         <w:gridCol w:w="786"/>
-        <w:gridCol w:w="2467"/>
+        <w:gridCol w:w="2469"/>
         <w:gridCol w:w="884"/>
       </w:tblGrid>
       <w:tr>
         <w:trPr/>
         <w:tc>
           <w:tcPr>
-            <w:tcW w:w="1090" w:type="dxa"/>
+            <w:tcW w:w="1088" w:type="dxa"/>
             <w:tcBorders>
               <w:top w:val="single" w:sz="6" w:space="0" w:color="000000"/>
               <w:start w:val="single" w:sz="6" w:space="0" w:color="000000"/>
@@ -972,7 +552,7 @@
         </w:tc>
         <w:tc>
           <w:tcPr>
-            <w:tcW w:w="2467" w:type="dxa"/>
+            <w:tcW w:w="2469" w:type="dxa"/>
             <w:tcBorders>
               <w:top w:val="single" w:sz="6" w:space="0" w:color="000000"/>
               <w:start w:val="single" w:sz="6" w:space="0" w:color="000000"/>
@@ -1055,7 +635,7 @@
         <w:trPr/>
         <w:tc>
           <w:tcPr>
-            <w:tcW w:w="1090" w:type="dxa"/>
+            <w:tcW w:w="1088" w:type="dxa"/>
             <w:tcBorders>
               <w:top w:val="single" w:sz="6" w:space="0" w:color="000000"/>
               <w:start w:val="single" w:sz="6" w:space="0" w:color="000000"/>
@@ -1135,7 +715,7 @@
         </w:tc>
         <w:tc>
           <w:tcPr>
-            <w:tcW w:w="2467" w:type="dxa"/>
+            <w:tcW w:w="2469" w:type="dxa"/>
             <w:tcBorders>
               <w:top w:val="single" w:sz="6" w:space="0" w:color="000000"/>
               <w:start w:val="single" w:sz="6" w:space="0" w:color="000000"/>
@@ -1218,7 +798,7 @@
         <w:trPr/>
         <w:tc>
           <w:tcPr>
-            <w:tcW w:w="1090" w:type="dxa"/>
+            <w:tcW w:w="1088" w:type="dxa"/>
             <w:tcBorders>
               <w:start w:val="single" w:sz="6" w:space="0" w:color="000000"/>
               <w:bottom w:val="single" w:sz="6" w:space="0" w:color="000000"/>
@@ -1233,7 +813,7 @@
               <w:spacing w:lineRule="atLeast" w:line="264" w:before="360" w:after="360"/>
               <w:rPr>
                 <w:rFonts w:eastAsia="Times New Roman" w:cs="" w:asciiTheme="majorBidi" w:cstheme="majorBidi" w:hAnsiTheme="majorBidi"/>
-                <w:color w:val="373D3F"/>
+                <w:color w:val="0301FA"/>
                 <w:kern w:val="0"/>
                 <w:sz w:val="16"/>
                 <w:szCs w:val="16"/>
@@ -1244,13 +824,14 @@
             <w:r>
               <w:rPr>
                 <w:rFonts w:eastAsia="Times New Roman" w:cs="" w:asciiTheme="majorBidi" w:cstheme="majorBidi" w:hAnsiTheme="majorBidi"/>
-                <w:color w:val="373D3F"/>
+                <w:color w:val="0301FA"/>
                 <w:kern w:val="0"/>
                 <w:sz w:val="16"/>
                 <w:szCs w:val="16"/>
                 <w:lang w:eastAsia="en-GB"/>
                 <w14:ligatures w14:val="none"/>
               </w:rPr>
+              <w:t>Second version</w:t>
             </w:r>
           </w:p>
         </w:tc>
@@ -1289,12 +870,13 @@
                 <w:lang w:eastAsia="en-GB"/>
                 <w14:ligatures w14:val="none"/>
               </w:rPr>
+              <w:t>08.05.2026</w:t>
             </w:r>
           </w:p>
         </w:tc>
         <w:tc>
           <w:tcPr>
-            <w:tcW w:w="2467" w:type="dxa"/>
+            <w:tcW w:w="2469" w:type="dxa"/>
             <w:tcBorders>
               <w:start w:val="single" w:sz="6" w:space="0" w:color="000000"/>
               <w:bottom w:val="single" w:sz="6" w:space="0" w:color="000000"/>
@@ -1309,7 +891,7 @@
               <w:spacing w:lineRule="atLeast" w:line="264" w:before="360" w:after="360"/>
               <w:rPr>
                 <w:rFonts w:eastAsia="Times New Roman" w:cs="" w:asciiTheme="majorBidi" w:cstheme="majorBidi" w:hAnsiTheme="majorBidi"/>
-                <w:color w:val="373D3F"/>
+                <w:color w:val="0301FA"/>
                 <w:kern w:val="0"/>
                 <w:sz w:val="16"/>
                 <w:szCs w:val="16"/>
@@ -1320,13 +902,14 @@
             <w:r>
               <w:rPr>
                 <w:rFonts w:eastAsia="Times New Roman" w:cs="" w:asciiTheme="majorBidi" w:cstheme="majorBidi" w:hAnsiTheme="majorBidi"/>
-                <w:color w:val="373D3F"/>
+                <w:color w:val="0301FA"/>
                 <w:kern w:val="0"/>
                 <w:sz w:val="16"/>
                 <w:szCs w:val="16"/>
                 <w:lang w:eastAsia="en-GB"/>
                 <w14:ligatures w14:val="none"/>
               </w:rPr>
+              <w:t>Update to include the Use Case diagram and update some srs sections</w:t>
             </w:r>
           </w:p>
         </w:tc>
@@ -1347,7 +930,7 @@
               <w:spacing w:lineRule="atLeast" w:line="264" w:before="360" w:after="360"/>
               <w:rPr>
                 <w:rFonts w:eastAsia="Times New Roman" w:cs="" w:asciiTheme="majorBidi" w:cstheme="majorBidi" w:hAnsiTheme="majorBidi"/>
-                <w:color w:val="373D3F"/>
+                <w:color w:val="0301FA"/>
                 <w:kern w:val="0"/>
                 <w:sz w:val="16"/>
                 <w:szCs w:val="16"/>
@@ -1358,13 +941,14 @@
             <w:r>
               <w:rPr>
                 <w:rFonts w:eastAsia="Times New Roman" w:cs="" w:asciiTheme="majorBidi" w:cstheme="majorBidi" w:hAnsiTheme="majorBidi"/>
-                <w:color w:val="373D3F"/>
+                <w:color w:val="0301FA"/>
                 <w:kern w:val="0"/>
                 <w:sz w:val="16"/>
                 <w:szCs w:val="16"/>
                 <w:lang w:eastAsia="en-GB"/>
                 <w14:ligatures w14:val="none"/>
               </w:rPr>
+              <w:t>v2</w:t>
             </w:r>
           </w:p>
         </w:tc>
@@ -1752,103 +1336,7 @@
           <w:lang w:eastAsia="en-GB"/>
           <w14:ligatures w14:val="none"/>
         </w:rPr>
-        <w:t xml:space="preserve">StayEase </w:t>
-      </w:r>
-      <w:r>
-        <w:rPr>
-          <w:rFonts w:eastAsia="Times New Roman" w:cs="" w:asciiTheme="majorBidi" w:cstheme="majorBidi" w:hAnsiTheme="majorBidi"/>
-          <w:color w:val="0000FF"/>
-          <w:kern w:val="0"/>
-          <w:sz w:val="20"/>
-          <w:szCs w:val="20"/>
-          <w:lang w:eastAsia="en-GB"/>
-          <w14:ligatures w14:val="none"/>
-        </w:rPr>
-        <w:t>shall be</w:t>
-      </w:r>
-      <w:r>
-        <w:rPr>
-          <w:rFonts w:eastAsia="Times New Roman" w:cs="" w:asciiTheme="majorBidi" w:cstheme="majorBidi" w:hAnsiTheme="majorBidi"/>
-          <w:color w:val="0000FF"/>
-          <w:kern w:val="0"/>
-          <w:sz w:val="20"/>
-          <w:szCs w:val="20"/>
-          <w:lang w:eastAsia="en-GB"/>
-          <w14:ligatures w14:val="none"/>
-        </w:rPr>
-        <w:t xml:space="preserve"> a web-based management platform that </w:t>
-      </w:r>
-      <w:r>
-        <w:rPr>
-          <w:rFonts w:eastAsia="Times New Roman" w:cs="" w:asciiTheme="majorBidi" w:cstheme="majorBidi" w:hAnsiTheme="majorBidi"/>
-          <w:color w:val="0000FF"/>
-          <w:kern w:val="0"/>
-          <w:sz w:val="20"/>
-          <w:szCs w:val="20"/>
-          <w:lang w:eastAsia="en-GB"/>
-          <w14:ligatures w14:val="none"/>
-        </w:rPr>
-        <w:t xml:space="preserve">shall </w:t>
-      </w:r>
-      <w:r>
-        <w:rPr>
-          <w:rFonts w:eastAsia="Times New Roman" w:cs="" w:asciiTheme="majorBidi" w:cstheme="majorBidi" w:hAnsiTheme="majorBidi"/>
-          <w:color w:val="0000FF"/>
-          <w:kern w:val="0"/>
-          <w:sz w:val="20"/>
-          <w:szCs w:val="20"/>
-          <w:lang w:eastAsia="en-GB"/>
-          <w14:ligatures w14:val="none"/>
-        </w:rPr>
-        <w:t>automate</w:t>
-      </w:r>
-      <w:r>
-        <w:rPr>
-          <w:rFonts w:eastAsia="Times New Roman" w:cs="" w:asciiTheme="majorBidi" w:cstheme="majorBidi" w:hAnsiTheme="majorBidi"/>
-          <w:color w:val="0000FF"/>
-          <w:kern w:val="0"/>
-          <w:sz w:val="20"/>
-          <w:szCs w:val="20"/>
-          <w:lang w:eastAsia="en-GB"/>
-          <w14:ligatures w14:val="none"/>
-        </w:rPr>
-        <w:t>e</w:t>
-      </w:r>
-      <w:r>
-        <w:rPr>
-          <w:rFonts w:eastAsia="Times New Roman" w:cs="" w:asciiTheme="majorBidi" w:cstheme="majorBidi" w:hAnsiTheme="majorBidi"/>
-          <w:color w:val="0000FF"/>
-          <w:kern w:val="0"/>
-          <w:sz w:val="20"/>
-          <w:szCs w:val="20"/>
-          <w:lang w:eastAsia="en-GB"/>
-          <w14:ligatures w14:val="none"/>
-        </w:rPr>
-        <w:t xml:space="preserve"> room inventory and guest reservations. It </w:t>
-      </w:r>
-      <w:r>
-        <w:rPr>
-          <w:rFonts w:eastAsia="Times New Roman" w:cs="" w:asciiTheme="majorBidi" w:cstheme="majorBidi" w:hAnsiTheme="majorBidi"/>
-          <w:color w:val="0000FF"/>
-          <w:kern w:val="0"/>
-          <w:sz w:val="20"/>
-          <w:szCs w:val="20"/>
-          <w:lang w:eastAsia="en-GB"/>
-          <w14:ligatures w14:val="none"/>
-        </w:rPr>
-        <w:t xml:space="preserve">shall </w:t>
-      </w:r>
-      <w:r>
-        <w:rPr>
-          <w:rFonts w:eastAsia="Times New Roman" w:cs="" w:asciiTheme="majorBidi" w:cstheme="majorBidi" w:hAnsiTheme="majorBidi"/>
-          <w:color w:val="0000FF"/>
-          <w:kern w:val="0"/>
-          <w:sz w:val="20"/>
-          <w:szCs w:val="20"/>
-          <w:lang w:eastAsia="en-GB"/>
-          <w14:ligatures w14:val="none"/>
-        </w:rPr>
-        <w:t>replace manual scheduling with a synchronized digital environment, excluding hardware-level integrations like smart locks for this version.</w:t>
+        <w:t>StayEase shall be a web-based management platform that shall automatee room inventory and guest reservations. It shall replace manual scheduling with a synchronized digital environment, excluding hardware-level integrations like smart locks for this version.</w:t>
       </w:r>
     </w:p>
     <w:p>
@@ -1970,8 +1458,112 @@
           <w:lang w:eastAsia="en-GB"/>
           <w14:ligatures w14:val="none"/>
         </w:rPr>
-        <w:t>2.</w:t>
-      </w:r>
+        <w:t>2.1. Product Perspective and problem statement  </w:t>
+      </w:r>
+    </w:p>
+    <w:p>
+      <w:pPr>
+        <w:pStyle w:val="BodyText"/>
+        <w:shd w:val="clear" w:color="auto" w:fill="FFFFFF"/>
+        <w:spacing w:lineRule="auto" w:line="240" w:before="240" w:after="0"/>
+        <w:jc w:val="both"/>
+        <w:rPr>
+          <w:rFonts w:eastAsia="Times New Roman" w:cs="" w:asciiTheme="majorBidi" w:cstheme="majorBidi" w:hAnsiTheme="majorBidi"/>
+          <w:color w:val="373D3F"/>
+          <w:kern w:val="0"/>
+          <w:sz w:val="20"/>
+          <w:szCs w:val="20"/>
+          <w:lang w:eastAsia="en-GB"/>
+          <w14:ligatures w14:val="none"/>
+        </w:rPr>
+      </w:pPr>
+      <w:r>
+        <w:rPr>
+          <w:rFonts w:eastAsia="Times New Roman" w:cs="" w:asciiTheme="majorBidi" w:cstheme="majorBidi" w:hAnsiTheme="majorBidi"/>
+          <w:color w:val="0000FF"/>
+          <w:kern w:val="0"/>
+          <w:sz w:val="20"/>
+          <w:szCs w:val="20"/>
+          <w:lang w:eastAsia="en-GB"/>
+          <w14:ligatures w14:val="none"/>
+        </w:rPr>
+        <w:t>Small and medium-sized hotels often face a dilemma when choosing management software. Enterprise cloud solutions frequently come with high recurring subscription fees that eat into the small margins of boutique businesses. Furthermore, these hotels are often located in areas where internet stability may fluctuate; a purely cloud-based system means that if the internet goes down, the hotel loses all access to its guest list, room status, and billing information.</w:t>
+      </w:r>
+    </w:p>
+    <w:p>
+      <w:pPr>
+        <w:pStyle w:val="BodyText"/>
+        <w:shd w:val="clear" w:fill="FFFFFF"/>
+        <w:spacing w:lineRule="auto" w:line="240" w:before="240" w:after="283"/>
+        <w:jc w:val="both"/>
+        <w:rPr>
+          <w:rFonts w:eastAsia="Times New Roman" w:cs="" w:asciiTheme="majorBidi" w:cstheme="majorBidi" w:hAnsiTheme="majorBidi"/>
+          <w:color w:val="0000FF"/>
+          <w:kern w:val="0"/>
+          <w:sz w:val="20"/>
+          <w:szCs w:val="20"/>
+          <w:lang w:eastAsia="en-GB"/>
+          <w14:ligatures w14:val="none"/>
+        </w:rPr>
+      </w:pPr>
+      <w:r>
+        <w:rPr>
+          <w:rFonts w:eastAsia="Times New Roman" w:cs="" w:asciiTheme="majorBidi" w:cstheme="majorBidi" w:hAnsiTheme="majorBidi"/>
+          <w:color w:val="0000FF"/>
+          <w:kern w:val="0"/>
+          <w:sz w:val="20"/>
+          <w:szCs w:val="20"/>
+          <w:lang w:eastAsia="en-GB"/>
+          <w14:ligatures w14:val="none"/>
+        </w:rPr>
+        <w:t>Additionally, small hotel owners are increasingly concerned about data privacy and the security of their guests' personal information when stored on third-party servers. Storing sensitive guest details on a platform they do not control presents a significant long-term risk.</w:t>
+      </w:r>
+    </w:p>
+    <w:p>
+      <w:pPr>
+        <w:pStyle w:val="BodyText"/>
+        <w:shd w:val="clear" w:fill="FFFFFF"/>
+        <w:spacing w:lineRule="auto" w:line="240" w:before="240" w:after="283"/>
+        <w:jc w:val="both"/>
+        <w:rPr>
+          <w:rFonts w:eastAsia="Times New Roman" w:cs="" w:asciiTheme="majorBidi" w:cstheme="majorBidi" w:hAnsiTheme="majorBidi"/>
+          <w:color w:val="0000FF"/>
+          <w:kern w:val="0"/>
+          <w:sz w:val="20"/>
+          <w:szCs w:val="20"/>
+          <w:lang w:eastAsia="en-GB"/>
+          <w14:ligatures w14:val="none"/>
+        </w:rPr>
+      </w:pPr>
+      <w:r>
+        <w:rPr>
+          <w:rFonts w:eastAsia="Times New Roman" w:cs="" w:asciiTheme="majorBidi" w:cstheme="majorBidi" w:hAnsiTheme="majorBidi"/>
+          <w:color w:val="0000FF"/>
+          <w:kern w:val="0"/>
+          <w:sz w:val="20"/>
+          <w:szCs w:val="20"/>
+          <w:lang w:eastAsia="en-GB"/>
+          <w14:ligatures w14:val="none"/>
+        </w:rPr>
+        <w:t>StayEase shall adress these issues by being a self-hosted, full-stack application. By running the system on their own local infrastructure, hotel owners shall eliminate monthly subscription costs and maintain 100% ownership of their data. This architecture shall ensure that the "front of house" can continue to operate and access the "Single Source of Truth" during internet outages. StayEase shall provide small hotels with the professional tools of a large chain while respecting their need for autonomy, affordability, and data sovereignty.</w:t>
+      </w:r>
+    </w:p>
+    <w:p>
+      <w:pPr>
+        <w:pStyle w:val="Normal"/>
+        <w:shd w:val="clear" w:color="auto" w:fill="FFFFFF"/>
+        <w:spacing w:lineRule="auto" w:line="240" w:before="240" w:after="0"/>
+        <w:jc w:val="both"/>
+        <w:rPr>
+          <w:rFonts w:eastAsia="Times New Roman" w:cs="" w:asciiTheme="majorBidi" w:cstheme="majorBidi" w:hAnsiTheme="majorBidi"/>
+          <w:color w:val="373D3F"/>
+          <w:kern w:val="0"/>
+          <w:sz w:val="20"/>
+          <w:szCs w:val="20"/>
+          <w:lang w:eastAsia="en-GB"/>
+          <w14:ligatures w14:val="none"/>
+        </w:rPr>
+      </w:pPr>
       <w:r>
         <w:rPr>
           <w:rFonts w:eastAsia="Times New Roman" w:cs="" w:asciiTheme="majorBidi" w:cstheme="majorBidi" w:hAnsiTheme="majorBidi"/>
@@ -1984,514 +1576,6 @@
           <w:lang w:eastAsia="en-GB"/>
           <w14:ligatures w14:val="none"/>
         </w:rPr>
-        <w:t>1</w:t>
-      </w:r>
-      <w:r>
-        <w:rPr>
-          <w:rFonts w:eastAsia="Times New Roman" w:cs="" w:asciiTheme="majorBidi" w:cstheme="majorBidi" w:hAnsiTheme="majorBidi"/>
-          <w:b/>
-          <w:bCs/>
-          <w:color w:val="373D3F"/>
-          <w:kern w:val="0"/>
-          <w:sz w:val="20"/>
-          <w:szCs w:val="20"/>
-          <w:lang w:eastAsia="en-GB"/>
-          <w14:ligatures w14:val="none"/>
-        </w:rPr>
-        <w:t xml:space="preserve">. Product Perspective </w:t>
-      </w:r>
-      <w:r>
-        <w:rPr>
-          <w:rFonts w:eastAsia="Times New Roman" w:cs="" w:asciiTheme="majorBidi" w:cstheme="majorBidi" w:hAnsiTheme="majorBidi"/>
-          <w:b/>
-          <w:bCs/>
-          <w:color w:val="373D3F"/>
-          <w:kern w:val="0"/>
-          <w:sz w:val="20"/>
-          <w:szCs w:val="20"/>
-          <w:lang w:eastAsia="en-GB"/>
-          <w14:ligatures w14:val="none"/>
-        </w:rPr>
-        <w:t>a</w:t>
-      </w:r>
-      <w:r>
-        <w:rPr>
-          <w:rFonts w:eastAsia="Times New Roman" w:cs="" w:asciiTheme="majorBidi" w:cstheme="majorBidi" w:hAnsiTheme="majorBidi"/>
-          <w:b/>
-          <w:bCs/>
-          <w:color w:val="373D3F"/>
-          <w:kern w:val="0"/>
-          <w:sz w:val="20"/>
-          <w:szCs w:val="20"/>
-          <w:lang w:eastAsia="en-GB"/>
-          <w14:ligatures w14:val="none"/>
-        </w:rPr>
-        <w:t>n</w:t>
-      </w:r>
-      <w:r>
-        <w:rPr>
-          <w:rFonts w:eastAsia="Times New Roman" w:cs="" w:asciiTheme="majorBidi" w:cstheme="majorBidi" w:hAnsiTheme="majorBidi"/>
-          <w:b/>
-          <w:bCs/>
-          <w:color w:val="373D3F"/>
-          <w:kern w:val="0"/>
-          <w:sz w:val="20"/>
-          <w:szCs w:val="20"/>
-          <w:lang w:eastAsia="en-GB"/>
-          <w14:ligatures w14:val="none"/>
-        </w:rPr>
-        <w:t xml:space="preserve">d </w:t>
-      </w:r>
-      <w:r>
-        <w:rPr>
-          <w:rFonts w:eastAsia="Times New Roman" w:cs="" w:asciiTheme="majorBidi" w:cstheme="majorBidi" w:hAnsiTheme="majorBidi"/>
-          <w:b/>
-          <w:bCs/>
-          <w:color w:val="373D3F"/>
-          <w:kern w:val="0"/>
-          <w:sz w:val="20"/>
-          <w:szCs w:val="20"/>
-          <w:lang w:eastAsia="en-GB"/>
-          <w14:ligatures w14:val="none"/>
-        </w:rPr>
-        <w:t>p</w:t>
-      </w:r>
-      <w:r>
-        <w:rPr>
-          <w:rFonts w:eastAsia="Times New Roman" w:cs="" w:asciiTheme="majorBidi" w:cstheme="majorBidi" w:hAnsiTheme="majorBidi"/>
-          <w:b/>
-          <w:bCs/>
-          <w:color w:val="373D3F"/>
-          <w:kern w:val="0"/>
-          <w:sz w:val="20"/>
-          <w:szCs w:val="20"/>
-          <w:lang w:eastAsia="en-GB"/>
-          <w14:ligatures w14:val="none"/>
-        </w:rPr>
-        <w:t>r</w:t>
-      </w:r>
-      <w:r>
-        <w:rPr>
-          <w:rFonts w:eastAsia="Times New Roman" w:cs="" w:asciiTheme="majorBidi" w:cstheme="majorBidi" w:hAnsiTheme="majorBidi"/>
-          <w:b/>
-          <w:bCs/>
-          <w:color w:val="373D3F"/>
-          <w:kern w:val="0"/>
-          <w:sz w:val="20"/>
-          <w:szCs w:val="20"/>
-          <w:lang w:eastAsia="en-GB"/>
-          <w14:ligatures w14:val="none"/>
-        </w:rPr>
-        <w:t>o</w:t>
-      </w:r>
-      <w:r>
-        <w:rPr>
-          <w:rFonts w:eastAsia="Times New Roman" w:cs="" w:asciiTheme="majorBidi" w:cstheme="majorBidi" w:hAnsiTheme="majorBidi"/>
-          <w:b/>
-          <w:bCs/>
-          <w:color w:val="373D3F"/>
-          <w:kern w:val="0"/>
-          <w:sz w:val="20"/>
-          <w:szCs w:val="20"/>
-          <w:lang w:eastAsia="en-GB"/>
-          <w14:ligatures w14:val="none"/>
-        </w:rPr>
-        <w:t>b</w:t>
-      </w:r>
-      <w:r>
-        <w:rPr>
-          <w:rFonts w:eastAsia="Times New Roman" w:cs="" w:asciiTheme="majorBidi" w:cstheme="majorBidi" w:hAnsiTheme="majorBidi"/>
-          <w:b/>
-          <w:bCs/>
-          <w:color w:val="373D3F"/>
-          <w:kern w:val="0"/>
-          <w:sz w:val="20"/>
-          <w:szCs w:val="20"/>
-          <w:lang w:eastAsia="en-GB"/>
-          <w14:ligatures w14:val="none"/>
-        </w:rPr>
-        <w:t>l</w:t>
-      </w:r>
-      <w:r>
-        <w:rPr>
-          <w:rFonts w:eastAsia="Times New Roman" w:cs="" w:asciiTheme="majorBidi" w:cstheme="majorBidi" w:hAnsiTheme="majorBidi"/>
-          <w:b/>
-          <w:bCs/>
-          <w:color w:val="373D3F"/>
-          <w:kern w:val="0"/>
-          <w:sz w:val="20"/>
-          <w:szCs w:val="20"/>
-          <w:lang w:eastAsia="en-GB"/>
-          <w14:ligatures w14:val="none"/>
-        </w:rPr>
-        <w:t>e</w:t>
-      </w:r>
-      <w:r>
-        <w:rPr>
-          <w:rFonts w:eastAsia="Times New Roman" w:cs="" w:asciiTheme="majorBidi" w:cstheme="majorBidi" w:hAnsiTheme="majorBidi"/>
-          <w:b/>
-          <w:bCs/>
-          <w:color w:val="373D3F"/>
-          <w:kern w:val="0"/>
-          <w:sz w:val="20"/>
-          <w:szCs w:val="20"/>
-          <w:lang w:eastAsia="en-GB"/>
-          <w14:ligatures w14:val="none"/>
-        </w:rPr>
-        <w:t xml:space="preserve">m </w:t>
-      </w:r>
-      <w:r>
-        <w:rPr>
-          <w:rFonts w:eastAsia="Times New Roman" w:cs="" w:asciiTheme="majorBidi" w:cstheme="majorBidi" w:hAnsiTheme="majorBidi"/>
-          <w:b/>
-          <w:bCs/>
-          <w:color w:val="373D3F"/>
-          <w:kern w:val="0"/>
-          <w:sz w:val="20"/>
-          <w:szCs w:val="20"/>
-          <w:lang w:eastAsia="en-GB"/>
-          <w14:ligatures w14:val="none"/>
-        </w:rPr>
-        <w:t>s</w:t>
-      </w:r>
-      <w:r>
-        <w:rPr>
-          <w:rFonts w:eastAsia="Times New Roman" w:cs="" w:asciiTheme="majorBidi" w:cstheme="majorBidi" w:hAnsiTheme="majorBidi"/>
-          <w:b/>
-          <w:bCs/>
-          <w:color w:val="373D3F"/>
-          <w:kern w:val="0"/>
-          <w:sz w:val="20"/>
-          <w:szCs w:val="20"/>
-          <w:lang w:eastAsia="en-GB"/>
-          <w14:ligatures w14:val="none"/>
-        </w:rPr>
-        <w:t>t</w:t>
-      </w:r>
-      <w:r>
-        <w:rPr>
-          <w:rFonts w:eastAsia="Times New Roman" w:cs="" w:asciiTheme="majorBidi" w:cstheme="majorBidi" w:hAnsiTheme="majorBidi"/>
-          <w:b/>
-          <w:bCs/>
-          <w:color w:val="373D3F"/>
-          <w:kern w:val="0"/>
-          <w:sz w:val="20"/>
-          <w:szCs w:val="20"/>
-          <w:lang w:eastAsia="en-GB"/>
-          <w14:ligatures w14:val="none"/>
-        </w:rPr>
-        <w:t>a</w:t>
-      </w:r>
-      <w:r>
-        <w:rPr>
-          <w:rFonts w:eastAsia="Times New Roman" w:cs="" w:asciiTheme="majorBidi" w:cstheme="majorBidi" w:hAnsiTheme="majorBidi"/>
-          <w:b/>
-          <w:bCs/>
-          <w:color w:val="373D3F"/>
-          <w:kern w:val="0"/>
-          <w:sz w:val="20"/>
-          <w:szCs w:val="20"/>
-          <w:lang w:eastAsia="en-GB"/>
-          <w14:ligatures w14:val="none"/>
-        </w:rPr>
-        <w:t>t</w:t>
-      </w:r>
-      <w:r>
-        <w:rPr>
-          <w:rFonts w:eastAsia="Times New Roman" w:cs="" w:asciiTheme="majorBidi" w:cstheme="majorBidi" w:hAnsiTheme="majorBidi"/>
-          <w:b/>
-          <w:bCs/>
-          <w:color w:val="373D3F"/>
-          <w:kern w:val="0"/>
-          <w:sz w:val="20"/>
-          <w:szCs w:val="20"/>
-          <w:lang w:eastAsia="en-GB"/>
-          <w14:ligatures w14:val="none"/>
-        </w:rPr>
-        <w:t>e</w:t>
-      </w:r>
-      <w:r>
-        <w:rPr>
-          <w:rFonts w:eastAsia="Times New Roman" w:cs="" w:asciiTheme="majorBidi" w:cstheme="majorBidi" w:hAnsiTheme="majorBidi"/>
-          <w:b/>
-          <w:bCs/>
-          <w:color w:val="373D3F"/>
-          <w:kern w:val="0"/>
-          <w:sz w:val="20"/>
-          <w:szCs w:val="20"/>
-          <w:lang w:eastAsia="en-GB"/>
-          <w14:ligatures w14:val="none"/>
-        </w:rPr>
-        <w:t>m</w:t>
-      </w:r>
-      <w:r>
-        <w:rPr>
-          <w:rFonts w:eastAsia="Times New Roman" w:cs="" w:asciiTheme="majorBidi" w:cstheme="majorBidi" w:hAnsiTheme="majorBidi"/>
-          <w:b/>
-          <w:bCs/>
-          <w:color w:val="373D3F"/>
-          <w:kern w:val="0"/>
-          <w:sz w:val="20"/>
-          <w:szCs w:val="20"/>
-          <w:lang w:eastAsia="en-GB"/>
-          <w14:ligatures w14:val="none"/>
-        </w:rPr>
-        <w:t>e</w:t>
-      </w:r>
-      <w:r>
-        <w:rPr>
-          <w:rFonts w:eastAsia="Times New Roman" w:cs="" w:asciiTheme="majorBidi" w:cstheme="majorBidi" w:hAnsiTheme="majorBidi"/>
-          <w:b/>
-          <w:bCs/>
-          <w:color w:val="373D3F"/>
-          <w:kern w:val="0"/>
-          <w:sz w:val="20"/>
-          <w:szCs w:val="20"/>
-          <w:lang w:eastAsia="en-GB"/>
-          <w14:ligatures w14:val="none"/>
-        </w:rPr>
-        <w:t>n</w:t>
-      </w:r>
-      <w:r>
-        <w:rPr>
-          <w:rFonts w:eastAsia="Times New Roman" w:cs="" w:asciiTheme="majorBidi" w:cstheme="majorBidi" w:hAnsiTheme="majorBidi"/>
-          <w:b/>
-          <w:bCs/>
-          <w:color w:val="373D3F"/>
-          <w:kern w:val="0"/>
-          <w:sz w:val="20"/>
-          <w:szCs w:val="20"/>
-          <w:lang w:eastAsia="en-GB"/>
-          <w14:ligatures w14:val="none"/>
-        </w:rPr>
-        <w:t>t</w:t>
-      </w:r>
-      <w:r>
-        <w:rPr>
-          <w:rFonts w:eastAsia="Times New Roman" w:cs="" w:asciiTheme="majorBidi" w:cstheme="majorBidi" w:hAnsiTheme="majorBidi"/>
-          <w:b/>
-          <w:bCs/>
-          <w:color w:val="373D3F"/>
-          <w:kern w:val="0"/>
-          <w:sz w:val="20"/>
-          <w:szCs w:val="20"/>
-          <w:lang w:eastAsia="en-GB"/>
-          <w14:ligatures w14:val="none"/>
-        </w:rPr>
-        <w:t xml:space="preserve">  </w:t>
-      </w:r>
-    </w:p>
-    <w:p>
-      <w:pPr>
-        <w:pStyle w:val="BodyText"/>
-        <w:shd w:val="clear" w:color="auto" w:fill="FFFFFF"/>
-        <w:spacing w:lineRule="auto" w:line="240" w:before="240" w:after="0"/>
-        <w:jc w:val="both"/>
-        <w:rPr>
-          <w:rFonts w:eastAsia="Times New Roman" w:cs="" w:asciiTheme="majorBidi" w:cstheme="majorBidi" w:hAnsiTheme="majorBidi"/>
-          <w:color w:val="373D3F"/>
-          <w:kern w:val="0"/>
-          <w:sz w:val="20"/>
-          <w:szCs w:val="20"/>
-          <w:lang w:eastAsia="en-GB"/>
-          <w14:ligatures w14:val="none"/>
-        </w:rPr>
-      </w:pPr>
-      <w:r>
-        <w:rPr>
-          <w:rFonts w:eastAsia="Times New Roman" w:cs="" w:asciiTheme="majorBidi" w:cstheme="majorBidi" w:hAnsiTheme="majorBidi"/>
-          <w:color w:val="0000FF"/>
-          <w:kern w:val="0"/>
-          <w:sz w:val="20"/>
-          <w:szCs w:val="20"/>
-          <w:lang w:eastAsia="en-GB"/>
-          <w14:ligatures w14:val="none"/>
-        </w:rPr>
-        <w:t>Small and medium-sized hotels often face a dilemma when choosing management software. Enterprise cloud solutions frequently come with high recurring subscription fees that eat into the small margins of boutique businesses. Furthermore, these hotels are often located in areas where internet stability may fluctuate; a purely cloud-based system means that if the internet goes down, the hotel loses all access to its guest list, room status, and billing information.</w:t>
-      </w:r>
-    </w:p>
-    <w:p>
-      <w:pPr>
-        <w:pStyle w:val="BodyText"/>
-        <w:shd w:fill="FFFFFF" w:val="clear"/>
-        <w:spacing w:lineRule="auto" w:line="240" w:before="240" w:after="283"/>
-        <w:jc w:val="both"/>
-        <w:rPr>
-          <w:rFonts w:eastAsia="Times New Roman" w:asciiTheme="majorBidi" w:cstheme="majorBidi" w:hAnsiTheme="majorBidi"/>
-          <w:color w:val="0000FF"/>
-          <w:kern w:val="0"/>
-          <w:sz w:val="20"/>
-          <w:szCs w:val="20"/>
-          <w:lang w:eastAsia="en-GB"/>
-          <w14:ligatures w14:val="none"/>
-        </w:rPr>
-      </w:pPr>
-      <w:r>
-        <w:rPr>
-          <w:rFonts w:eastAsia="Times New Roman" w:asciiTheme="majorBidi" w:cstheme="majorBidi" w:hAnsiTheme="majorBidi"/>
-          <w:color w:val="0000FF"/>
-          <w:kern w:val="0"/>
-          <w:sz w:val="20"/>
-          <w:szCs w:val="20"/>
-          <w:lang w:eastAsia="en-GB"/>
-          <w14:ligatures w14:val="none"/>
-        </w:rPr>
-        <w:t>Additionally, small hotel owners are increasingly concerned about data privacy and the security of their guests' personal information when stored on third-party servers. Storing sensitive guest details on a platform they do not control presents a significant long-term risk.</w:t>
-      </w:r>
-    </w:p>
-    <w:p>
-      <w:pPr>
-        <w:pStyle w:val="BodyText"/>
-        <w:shd w:fill="FFFFFF" w:val="clear"/>
-        <w:spacing w:lineRule="auto" w:line="240" w:before="240" w:after="283"/>
-        <w:jc w:val="both"/>
-        <w:rPr>
-          <w:rFonts w:eastAsia="Times New Roman" w:asciiTheme="majorBidi" w:cstheme="majorBidi" w:hAnsiTheme="majorBidi"/>
-          <w:color w:val="0000FF"/>
-          <w:kern w:val="0"/>
-          <w:sz w:val="20"/>
-          <w:szCs w:val="20"/>
-          <w:lang w:eastAsia="en-GB"/>
-          <w14:ligatures w14:val="none"/>
-        </w:rPr>
-      </w:pPr>
-      <w:r>
-        <w:rPr>
-          <w:rFonts w:eastAsia="Times New Roman" w:asciiTheme="majorBidi" w:cstheme="majorBidi" w:hAnsiTheme="majorBidi"/>
-          <w:color w:val="0000FF"/>
-          <w:kern w:val="0"/>
-          <w:sz w:val="20"/>
-          <w:szCs w:val="20"/>
-          <w:lang w:eastAsia="en-GB"/>
-          <w14:ligatures w14:val="none"/>
-        </w:rPr>
-        <w:t xml:space="preserve">StayEase </w:t>
-      </w:r>
-      <w:r>
-        <w:rPr>
-          <w:rFonts w:eastAsia="Times New Roman" w:asciiTheme="majorBidi" w:cstheme="majorBidi" w:hAnsiTheme="majorBidi"/>
-          <w:color w:val="0000FF"/>
-          <w:kern w:val="0"/>
-          <w:sz w:val="20"/>
-          <w:szCs w:val="20"/>
-          <w:lang w:eastAsia="en-GB"/>
-          <w14:ligatures w14:val="none"/>
-        </w:rPr>
-        <w:t>shall adress</w:t>
-      </w:r>
-      <w:r>
-        <w:rPr>
-          <w:rFonts w:eastAsia="Times New Roman" w:asciiTheme="majorBidi" w:cstheme="majorBidi" w:hAnsiTheme="majorBidi"/>
-          <w:color w:val="0000FF"/>
-          <w:kern w:val="0"/>
-          <w:sz w:val="20"/>
-          <w:szCs w:val="20"/>
-          <w:lang w:eastAsia="en-GB"/>
-          <w14:ligatures w14:val="none"/>
-        </w:rPr>
-        <w:t xml:space="preserve"> these issues by being a self-hosted, full-stack application. By running the system on their own local infrastructure, hotel owners </w:t>
-      </w:r>
-      <w:r>
-        <w:rPr>
-          <w:rFonts w:eastAsia="Times New Roman" w:asciiTheme="majorBidi" w:cstheme="majorBidi" w:hAnsiTheme="majorBidi"/>
-          <w:color w:val="0000FF"/>
-          <w:kern w:val="0"/>
-          <w:sz w:val="20"/>
-          <w:szCs w:val="20"/>
-          <w:lang w:eastAsia="en-GB"/>
-          <w14:ligatures w14:val="none"/>
-        </w:rPr>
-        <w:t>shall</w:t>
-      </w:r>
-      <w:r>
-        <w:rPr>
-          <w:rFonts w:eastAsia="Times New Roman" w:asciiTheme="majorBidi" w:cstheme="majorBidi" w:hAnsiTheme="majorBidi"/>
-          <w:color w:val="0000FF"/>
-          <w:kern w:val="0"/>
-          <w:sz w:val="20"/>
-          <w:szCs w:val="20"/>
-          <w:lang w:eastAsia="en-GB"/>
-          <w14:ligatures w14:val="none"/>
-        </w:rPr>
-        <w:t xml:space="preserve"> eliminate monthly subscription costs and maintain 100% ownership of their data. This architecture </w:t>
-      </w:r>
-      <w:r>
-        <w:rPr>
-          <w:rFonts w:eastAsia="Times New Roman" w:asciiTheme="majorBidi" w:cstheme="majorBidi" w:hAnsiTheme="majorBidi"/>
-          <w:color w:val="0000FF"/>
-          <w:kern w:val="0"/>
-          <w:sz w:val="20"/>
-          <w:szCs w:val="20"/>
-          <w:lang w:eastAsia="en-GB"/>
-          <w14:ligatures w14:val="none"/>
-        </w:rPr>
-        <w:t xml:space="preserve">shall </w:t>
-      </w:r>
-      <w:r>
-        <w:rPr>
-          <w:rFonts w:eastAsia="Times New Roman" w:asciiTheme="majorBidi" w:cstheme="majorBidi" w:hAnsiTheme="majorBidi"/>
-          <w:color w:val="0000FF"/>
-          <w:kern w:val="0"/>
-          <w:sz w:val="20"/>
-          <w:szCs w:val="20"/>
-          <w:lang w:eastAsia="en-GB"/>
-          <w14:ligatures w14:val="none"/>
-        </w:rPr>
-        <w:t xml:space="preserve">ensure that the "front of house" can continue to operate and access the "Single Source of Truth" during internet outages. StayEase </w:t>
-      </w:r>
-      <w:r>
-        <w:rPr>
-          <w:rFonts w:eastAsia="Times New Roman" w:asciiTheme="majorBidi" w:cstheme="majorBidi" w:hAnsiTheme="majorBidi"/>
-          <w:color w:val="0000FF"/>
-          <w:kern w:val="0"/>
-          <w:sz w:val="20"/>
-          <w:szCs w:val="20"/>
-          <w:lang w:eastAsia="en-GB"/>
-          <w14:ligatures w14:val="none"/>
-        </w:rPr>
-        <w:t>shall provide</w:t>
-      </w:r>
-      <w:r>
-        <w:rPr>
-          <w:rFonts w:eastAsia="Times New Roman" w:asciiTheme="majorBidi" w:cstheme="majorBidi" w:hAnsiTheme="majorBidi"/>
-          <w:color w:val="0000FF"/>
-          <w:kern w:val="0"/>
-          <w:sz w:val="20"/>
-          <w:szCs w:val="20"/>
-          <w:lang w:eastAsia="en-GB"/>
-          <w14:ligatures w14:val="none"/>
-        </w:rPr>
-        <w:t xml:space="preserve"> small hotels with the professional tools of a large chain while respecting their need for autonomy, affordability, and data sovereignty.</w:t>
-      </w:r>
-    </w:p>
-    <w:p>
-      <w:pPr>
-        <w:pStyle w:val="Normal"/>
-        <w:shd w:val="clear" w:color="auto" w:fill="FFFFFF"/>
-        <w:spacing w:lineRule="auto" w:line="240" w:before="240" w:after="0"/>
-        <w:jc w:val="both"/>
-        <w:rPr>
-          <w:rFonts w:eastAsia="Times New Roman" w:cs="" w:asciiTheme="majorBidi" w:cstheme="majorBidi" w:hAnsiTheme="majorBidi"/>
-          <w:color w:val="373D3F"/>
-          <w:kern w:val="0"/>
-          <w:sz w:val="20"/>
-          <w:szCs w:val="20"/>
-          <w:lang w:eastAsia="en-GB"/>
-          <w14:ligatures w14:val="none"/>
-        </w:rPr>
-      </w:pPr>
-      <w:r>
-        <w:rPr>
-          <w:rFonts w:eastAsia="Times New Roman" w:cs="" w:asciiTheme="majorBidi" w:cstheme="majorBidi" w:hAnsiTheme="majorBidi"/>
-          <w:b/>
-          <w:bCs/>
-          <w:color w:val="373D3F"/>
-          <w:kern w:val="0"/>
-          <w:sz w:val="20"/>
-          <w:szCs w:val="20"/>
-          <w:lang w:eastAsia="en-GB"/>
-          <w14:ligatures w14:val="none"/>
-        </w:rPr>
         <w:t>2.2. Product Features  </w:t>
       </w:r>
     </w:p>
@@ -2521,7 +1605,7 @@
           <w:lang w:eastAsia="en-GB"/>
           <w14:ligatures w14:val="none"/>
         </w:rPr>
-        <w:t>«Summarize the major features the product must perform or must let the user perform. Details will be provided in Section 3, so only a bullet list is needed here. Organize the features to make them understandable to any reader of the specification. A picture of the major groups of related requirements and how they relate, such as a top level data flow diagram or object class diagram, is often effective.»</w:t>
+        <w:t>StayEase centralizes operations locally into four primary operational areas:</w:t>
       </w:r>
     </w:p>
     <w:p>
@@ -2532,28 +1616,29 @@
           <w:numId w:val="1"/>
         </w:numPr>
         <w:shd w:val="clear" w:color="auto" w:fill="FFFFFF"/>
-        <w:spacing w:lineRule="auto" w:line="240" w:beforeAutospacing="1" w:after="0"/>
-        <w:rPr>
-          <w:rFonts w:eastAsia="Times New Roman" w:cs="" w:asciiTheme="majorBidi" w:cstheme="majorBidi" w:hAnsiTheme="majorBidi"/>
-          <w:color w:val="373D3F"/>
-          <w:kern w:val="0"/>
-          <w:sz w:val="20"/>
-          <w:szCs w:val="20"/>
-          <w:lang w:eastAsia="en-GB"/>
-          <w14:ligatures w14:val="none"/>
-        </w:rPr>
-      </w:pPr>
-      <w:r>
-        <w:rPr>
-          <w:rFonts w:eastAsia="Times New Roman" w:cs="" w:asciiTheme="majorBidi" w:cstheme="majorBidi" w:hAnsiTheme="majorBidi"/>
-          <w:color w:val="0000FF"/>
-          <w:kern w:val="0"/>
-          <w:sz w:val="20"/>
-          <w:szCs w:val="20"/>
-          <w:lang w:eastAsia="en-GB"/>
-          <w14:ligatures w14:val="none"/>
-        </w:rPr>
-        <w:t>«Thing 1»</w:t>
+        <w:spacing w:lineRule="auto" w:line="240" w:before="240" w:after="0"/>
+        <w:jc w:val="both"/>
+        <w:rPr>
+          <w:rFonts w:eastAsia="Times New Roman" w:cs="" w:asciiTheme="majorBidi" w:cstheme="majorBidi" w:hAnsiTheme="majorBidi"/>
+          <w:color w:val="0000FF"/>
+          <w:kern w:val="0"/>
+          <w:sz w:val="20"/>
+          <w:szCs w:val="20"/>
+          <w:lang w:eastAsia="en-GB"/>
+          <w14:ligatures w14:val="none"/>
+        </w:rPr>
+      </w:pPr>
+      <w:r>
+        <w:rPr>
+          <w:rFonts w:eastAsia="Times New Roman" w:cs="" w:asciiTheme="majorBidi" w:cstheme="majorBidi" w:hAnsiTheme="majorBidi"/>
+          <w:color w:val="0000FF"/>
+          <w:kern w:val="0"/>
+          <w:sz w:val="20"/>
+          <w:szCs w:val="20"/>
+          <w:lang w:eastAsia="en-GB"/>
+          <w14:ligatures w14:val="none"/>
+        </w:rPr>
+        <w:t>User Authentication &amp; Security Control: Secures local system access based on employee roles.</w:t>
       </w:r>
     </w:p>
     <w:p>
@@ -2564,28 +1649,95 @@
           <w:numId w:val="1"/>
         </w:numPr>
         <w:shd w:val="clear" w:color="auto" w:fill="FFFFFF"/>
-        <w:spacing w:lineRule="auto" w:line="240" w:before="0" w:afterAutospacing="1"/>
-        <w:rPr>
-          <w:rFonts w:eastAsia="Times New Roman" w:cs="" w:asciiTheme="majorBidi" w:cstheme="majorBidi" w:hAnsiTheme="majorBidi"/>
-          <w:color w:val="373D3F"/>
-          <w:kern w:val="0"/>
-          <w:sz w:val="20"/>
-          <w:szCs w:val="20"/>
-          <w:lang w:eastAsia="en-GB"/>
-          <w14:ligatures w14:val="none"/>
-        </w:rPr>
-      </w:pPr>
-      <w:r>
-        <w:rPr>
-          <w:rFonts w:eastAsia="Times New Roman" w:cs="" w:asciiTheme="majorBidi" w:cstheme="majorBidi" w:hAnsiTheme="majorBidi"/>
-          <w:color w:val="0000FF"/>
-          <w:kern w:val="0"/>
-          <w:sz w:val="20"/>
-          <w:szCs w:val="20"/>
-          <w:lang w:eastAsia="en-GB"/>
-          <w14:ligatures w14:val="none"/>
-        </w:rPr>
-        <w:t>«More things as required»</w:t>
+        <w:spacing w:lineRule="auto" w:line="240" w:before="240" w:after="0"/>
+        <w:jc w:val="both"/>
+        <w:rPr>
+          <w:rFonts w:eastAsia="Times New Roman" w:cs="" w:asciiTheme="majorBidi" w:cstheme="majorBidi" w:hAnsiTheme="majorBidi"/>
+          <w:color w:val="0000FF"/>
+          <w:kern w:val="0"/>
+          <w:sz w:val="20"/>
+          <w:szCs w:val="20"/>
+          <w:lang w:eastAsia="en-GB"/>
+          <w14:ligatures w14:val="none"/>
+        </w:rPr>
+      </w:pPr>
+      <w:r>
+        <w:rPr>
+          <w:rFonts w:eastAsia="Times New Roman" w:cs="" w:asciiTheme="majorBidi" w:cstheme="majorBidi" w:hAnsiTheme="majorBidi"/>
+          <w:color w:val="0000FF"/>
+          <w:kern w:val="0"/>
+          <w:sz w:val="20"/>
+          <w:szCs w:val="20"/>
+          <w:lang w:eastAsia="en-GB"/>
+          <w14:ligatures w14:val="none"/>
+        </w:rPr>
+        <w:t>Room inventory Management: Real-time digital allocation, filtering and automated updates of rom cleanlines statuses.</w:t>
+      </w:r>
+    </w:p>
+    <w:p>
+      <w:pPr>
+        <w:pStyle w:val="Normal"/>
+        <w:numPr>
+          <w:ilvl w:val="0"/>
+          <w:numId w:val="1"/>
+        </w:numPr>
+        <w:shd w:val="clear" w:color="auto" w:fill="FFFFFF"/>
+        <w:spacing w:lineRule="auto" w:line="240" w:before="240" w:after="0"/>
+        <w:jc w:val="both"/>
+        <w:rPr>
+          <w:rFonts w:eastAsia="Times New Roman" w:cs="" w:asciiTheme="majorBidi" w:cstheme="majorBidi" w:hAnsiTheme="majorBidi"/>
+          <w:color w:val="0000FF"/>
+          <w:kern w:val="0"/>
+          <w:sz w:val="20"/>
+          <w:szCs w:val="20"/>
+          <w:lang w:eastAsia="en-GB"/>
+          <w14:ligatures w14:val="none"/>
+        </w:rPr>
+      </w:pPr>
+      <w:r>
+        <w:rPr>
+          <w:rFonts w:eastAsia="Times New Roman" w:cs="" w:asciiTheme="majorBidi" w:cstheme="majorBidi" w:hAnsiTheme="majorBidi"/>
+          <w:color w:val="0000FF"/>
+          <w:kern w:val="0"/>
+          <w:sz w:val="20"/>
+          <w:szCs w:val="20"/>
+          <w:lang w:eastAsia="en-GB"/>
+          <w14:ligatures w14:val="none"/>
+        </w:rPr>
+        <w:t>Guest Reservation &amp; booking engine: creates and updates guest data, handling check-ins and conditional cancelations.</w:t>
+      </w:r>
+    </w:p>
+    <w:p>
+      <w:pPr>
+        <w:pStyle w:val="Normal"/>
+        <w:numPr>
+          <w:ilvl w:val="0"/>
+          <w:numId w:val="1"/>
+        </w:numPr>
+        <w:shd w:val="clear" w:color="auto" w:fill="FFFFFF"/>
+        <w:spacing w:lineRule="auto" w:line="240" w:before="240" w:after="0"/>
+        <w:jc w:val="both"/>
+        <w:rPr>
+          <w:rFonts w:eastAsia="Times New Roman" w:cs="" w:asciiTheme="majorBidi" w:cstheme="majorBidi" w:hAnsiTheme="majorBidi"/>
+          <w:color w:val="0000FF"/>
+          <w:kern w:val="0"/>
+          <w:sz w:val="20"/>
+          <w:szCs w:val="20"/>
+          <w:lang w:eastAsia="en-GB"/>
+          <w14:ligatures w14:val="none"/>
+        </w:rPr>
+      </w:pPr>
+      <w:r>
+        <w:rPr>
+          <w:rFonts w:eastAsia="Times New Roman" w:cs="" w:asciiTheme="majorBidi" w:cstheme="majorBidi" w:hAnsiTheme="majorBidi"/>
+          <w:color w:val="0000FF"/>
+          <w:kern w:val="0"/>
+          <w:sz w:val="20"/>
+          <w:szCs w:val="20"/>
+          <w:lang w:eastAsia="en-GB"/>
+          <w14:ligatures w14:val="none"/>
+        </w:rPr>
+        <w:t>Automated Billing Processing: Dynamically calculates client invoicing upon checkout based on localized parameters.</w:t>
       </w:r>
     </w:p>
     <w:p>
@@ -2644,7 +1796,218 @@
           <w:lang w:eastAsia="en-GB"/>
           <w14:ligatures w14:val="none"/>
         </w:rPr>
-        <w:t>«Identify the various user classes (intended target for the product) that you anticipate will use this product. User classes may be differentiated based on frequency of use, subset of product functions used, technical expertise, security or privilege levels, educational level, or experience. Describe the pertinent characteristics of each user class. Certain requirements may pertain only to certain user classes. Distinguish the most important user classes for this product from those who are less important to satisfy.»</w:t>
+        <w:t>The classes of users:</w:t>
+      </w:r>
+    </w:p>
+    <w:p>
+      <w:pPr>
+        <w:pStyle w:val="Normal"/>
+        <w:numPr>
+          <w:ilvl w:val="0"/>
+          <w:numId w:val="2"/>
+        </w:numPr>
+        <w:shd w:val="clear" w:color="auto" w:fill="FFFFFF"/>
+        <w:spacing w:lineRule="auto" w:line="240" w:before="240" w:after="0"/>
+        <w:jc w:val="both"/>
+        <w:rPr>
+          <w:rFonts w:eastAsia="Times New Roman" w:cs="" w:asciiTheme="majorBidi" w:cstheme="majorBidi" w:hAnsiTheme="majorBidi"/>
+          <w:color w:val="0000FF"/>
+          <w:kern w:val="0"/>
+          <w:sz w:val="20"/>
+          <w:szCs w:val="20"/>
+          <w:lang w:eastAsia="en-GB"/>
+          <w14:ligatures w14:val="none"/>
+        </w:rPr>
+      </w:pPr>
+      <w:r>
+        <w:rPr>
+          <w:rFonts w:eastAsia="Times New Roman" w:cs="" w:asciiTheme="majorBidi" w:cstheme="majorBidi" w:hAnsiTheme="majorBidi"/>
+          <w:color w:val="0000FF"/>
+          <w:kern w:val="0"/>
+          <w:sz w:val="20"/>
+          <w:szCs w:val="20"/>
+          <w:lang w:eastAsia="en-GB"/>
+          <w14:ligatures w14:val="none"/>
+        </w:rPr>
+        <w:t>Hotel Owner/Administrator</w:t>
+      </w:r>
+    </w:p>
+    <w:p>
+      <w:pPr>
+        <w:pStyle w:val="Normal"/>
+        <w:numPr>
+          <w:ilvl w:val="0"/>
+          <w:numId w:val="2"/>
+        </w:numPr>
+        <w:shd w:val="clear" w:color="auto" w:fill="FFFFFF"/>
+        <w:spacing w:lineRule="auto" w:line="240" w:before="240" w:after="0"/>
+        <w:jc w:val="both"/>
+        <w:rPr>
+          <w:rFonts w:eastAsia="Times New Roman" w:cs="" w:asciiTheme="majorBidi" w:cstheme="majorBidi" w:hAnsiTheme="majorBidi"/>
+          <w:color w:val="0000FF"/>
+          <w:kern w:val="0"/>
+          <w:sz w:val="20"/>
+          <w:szCs w:val="20"/>
+          <w:lang w:eastAsia="en-GB"/>
+          <w14:ligatures w14:val="none"/>
+        </w:rPr>
+      </w:pPr>
+      <w:r>
+        <w:rPr>
+          <w:rFonts w:eastAsia="Times New Roman" w:cs="" w:asciiTheme="majorBidi" w:cstheme="majorBidi" w:hAnsiTheme="majorBidi"/>
+          <w:color w:val="0000FF"/>
+          <w:kern w:val="0"/>
+          <w:sz w:val="20"/>
+          <w:szCs w:val="20"/>
+          <w:lang w:eastAsia="en-GB"/>
+          <w14:ligatures w14:val="none"/>
+        </w:rPr>
+        <w:t>Manager</w:t>
+      </w:r>
+    </w:p>
+    <w:p>
+      <w:pPr>
+        <w:pStyle w:val="Normal"/>
+        <w:numPr>
+          <w:ilvl w:val="0"/>
+          <w:numId w:val="2"/>
+        </w:numPr>
+        <w:shd w:val="clear" w:color="auto" w:fill="FFFFFF"/>
+        <w:spacing w:lineRule="auto" w:line="240" w:before="240" w:after="0"/>
+        <w:jc w:val="both"/>
+        <w:rPr>
+          <w:rFonts w:eastAsia="Times New Roman" w:cs="" w:asciiTheme="majorBidi" w:cstheme="majorBidi" w:hAnsiTheme="majorBidi"/>
+          <w:color w:val="0000FF"/>
+          <w:kern w:val="0"/>
+          <w:sz w:val="20"/>
+          <w:szCs w:val="20"/>
+          <w:lang w:eastAsia="en-GB"/>
+          <w14:ligatures w14:val="none"/>
+        </w:rPr>
+      </w:pPr>
+      <w:r>
+        <w:rPr>
+          <w:rFonts w:eastAsia="Times New Roman" w:cs="" w:asciiTheme="majorBidi" w:cstheme="majorBidi" w:hAnsiTheme="majorBidi"/>
+          <w:color w:val="0000FF"/>
+          <w:kern w:val="0"/>
+          <w:sz w:val="20"/>
+          <w:szCs w:val="20"/>
+          <w:lang w:eastAsia="en-GB"/>
+          <w14:ligatures w14:val="none"/>
+        </w:rPr>
+        <w:t>Receptionist</w:t>
+      </w:r>
+    </w:p>
+    <w:p>
+      <w:pPr>
+        <w:pStyle w:val="Normal"/>
+        <w:numPr>
+          <w:ilvl w:val="0"/>
+          <w:numId w:val="2"/>
+        </w:numPr>
+        <w:shd w:val="clear" w:color="auto" w:fill="FFFFFF"/>
+        <w:spacing w:lineRule="auto" w:line="240" w:before="240" w:after="0"/>
+        <w:jc w:val="both"/>
+        <w:rPr>
+          <w:rFonts w:eastAsia="Times New Roman" w:cs="" w:asciiTheme="majorBidi" w:cstheme="majorBidi" w:hAnsiTheme="majorBidi"/>
+          <w:color w:val="0000FF"/>
+          <w:kern w:val="0"/>
+          <w:sz w:val="20"/>
+          <w:szCs w:val="20"/>
+          <w:lang w:eastAsia="en-GB"/>
+          <w14:ligatures w14:val="none"/>
+        </w:rPr>
+      </w:pPr>
+      <w:r>
+        <w:rPr>
+          <w:rFonts w:eastAsia="Times New Roman" w:cs="" w:asciiTheme="majorBidi" w:cstheme="majorBidi" w:hAnsiTheme="majorBidi"/>
+          <w:color w:val="0000FF"/>
+          <w:kern w:val="0"/>
+          <w:sz w:val="20"/>
+          <w:szCs w:val="20"/>
+          <w:lang w:eastAsia="en-GB"/>
+          <w14:ligatures w14:val="none"/>
+        </w:rPr>
+        <w:t>Room cleaners</w:t>
+      </w:r>
+    </w:p>
+    <w:p>
+      <w:pPr>
+        <w:pStyle w:val="Normal"/>
+        <w:numPr>
+          <w:ilvl w:val="0"/>
+          <w:numId w:val="0"/>
+        </w:numPr>
+        <w:shd w:val="clear" w:color="auto" w:fill="FFFFFF"/>
+        <w:spacing w:lineRule="auto" w:line="240" w:before="240" w:after="0"/>
+        <w:ind w:hanging="0" w:start="720"/>
+        <w:jc w:val="both"/>
+        <w:rPr>
+          <w:rFonts w:eastAsia="Times New Roman" w:cs="" w:asciiTheme="majorBidi" w:cstheme="majorBidi" w:hAnsiTheme="majorBidi"/>
+          <w:color w:val="0000FF"/>
+          <w:kern w:val="0"/>
+          <w:sz w:val="20"/>
+          <w:szCs w:val="20"/>
+          <w:lang w:eastAsia="en-GB"/>
+          <w14:ligatures w14:val="none"/>
+        </w:rPr>
+      </w:pPr>
+      <w:r>
+        <w:rPr>
+          <w:rFonts w:eastAsia="Times New Roman" w:cs="" w:asciiTheme="majorBidi" w:cstheme="majorBidi" w:hAnsiTheme="majorBidi"/>
+          <w:color w:val="0000FF"/>
+          <w:kern w:val="0"/>
+          <w:sz w:val="20"/>
+          <w:szCs w:val="20"/>
+          <w:lang w:eastAsia="en-GB"/>
+          <w14:ligatures w14:val="none"/>
+        </w:rPr>
+        <w:drawing>
+          <wp:anchor distT="0" distB="0" distL="0" distR="0" simplePos="0" relativeHeight="2" behindDoc="0" locked="0" layoutInCell="0" allowOverlap="1">
+            <wp:simplePos x="0" y="0"/>
+            <wp:positionH relativeFrom="column">
+              <wp:align>center</wp:align>
+            </wp:positionH>
+            <wp:positionV relativeFrom="paragraph">
+              <wp:posOffset>635</wp:posOffset>
+            </wp:positionV>
+            <wp:extent cx="3790315" cy="3141345"/>
+            <wp:effectExtent l="0" t="0" r="0" b="0"/>
+            <wp:wrapTopAndBottom/>
+            <wp:docPr id="1" name="Image1"/>
+            <wp:cNvGraphicFramePr>
+              <a:graphicFrameLocks xmlns:a="http://schemas.openxmlformats.org/drawingml/2006/main" noChangeAspect="1"/>
+            </wp:cNvGraphicFramePr>
+            <a:graphic xmlns:a="http://schemas.openxmlformats.org/drawingml/2006/main">
+              <a:graphicData uri="http://schemas.openxmlformats.org/drawingml/2006/picture">
+                <pic:pic xmlns:pic="http://schemas.openxmlformats.org/drawingml/2006/picture">
+                  <pic:nvPicPr>
+                    <pic:cNvPr id="1" name="Image1"/>
+                    <pic:cNvPicPr>
+                      <a:picLocks noChangeAspect="1" noChangeArrowheads="1"/>
+                    </pic:cNvPicPr>
+                  </pic:nvPicPr>
+                  <pic:blipFill>
+                    <a:blip r:embed="rId2"/>
+                    <a:stretch>
+                      <a:fillRect/>
+                    </a:stretch>
+                  </pic:blipFill>
+                  <pic:spPr bwMode="auto">
+                    <a:xfrm>
+                      <a:off x="0" y="0"/>
+                      <a:ext cx="3790315" cy="3141345"/>
+                    </a:xfrm>
+                    <a:prstGeom prst="rect">
+                      <a:avLst/>
+                    </a:prstGeom>
+                    <a:noFill/>
+                  </pic:spPr>
+                </pic:pic>
+              </a:graphicData>
+            </a:graphic>
+          </wp:anchor>
+        </w:drawing>
       </w:r>
     </w:p>
     <w:p>
@@ -2704,7 +2067,7 @@
           <w:lang w:eastAsia="en-GB"/>
           <w14:ligatures w14:val="none"/>
         </w:rPr>
-        <w:t>«Describe the environment in which the software will operate, including the hardware platform, operating system and versions, and any other software components or applications with which it must peacefully coexist.»</w:t>
+        <w:t>The platofrm will be dedicated local computer acting as the sever, it will have ubuntu operation sysstem in one of the latest distributions, from as the database the PostgreSQL will be used. Any device in the hotel, such as tablets, laptops or other workstations will need to be connected to the local network and by using one from modern browsers, access the management website.</w:t>
       </w:r>
     </w:p>
     <w:p>
@@ -3743,7 +3106,7 @@
       </w:r>
       <w:r>
         <w:rPr>
-          <w:rFonts w:eastAsia="Times New Roman" w:asciiTheme="majorBidi" w:cstheme="majorBidi" w:hAnsiTheme="majorBidi"/>
+          <w:rFonts w:eastAsia="Times New Roman" w:cs="" w:asciiTheme="majorBidi" w:cstheme="majorBidi" w:hAnsiTheme="majorBidi"/>
           <w:color w:val="0000FF"/>
           <w:kern w:val="0"/>
           <w:sz w:val="20"/>
@@ -3755,7 +3118,7 @@
       </w:r>
       <w:r>
         <w:rPr>
-          <w:rFonts w:eastAsia="Times New Roman" w:asciiTheme="majorBidi" w:cstheme="majorBidi" w:hAnsiTheme="majorBidi"/>
+          <w:rFonts w:eastAsia="Times New Roman" w:cs="" w:asciiTheme="majorBidi" w:cstheme="majorBidi" w:hAnsiTheme="majorBidi"/>
           <w:b w:val="false"/>
           <w:bCs w:val="false"/>
           <w:color w:val="0000FF"/>
@@ -3770,7 +3133,7 @@
       <w:r>
         <w:rPr>
           <w:rStyle w:val="Strong"/>
-          <w:rFonts w:eastAsia="Times New Roman" w:asciiTheme="majorBidi" w:cstheme="majorBidi" w:hAnsiTheme="majorBidi"/>
+          <w:rFonts w:eastAsia="Times New Roman" w:cs="" w:asciiTheme="majorBidi" w:cstheme="majorBidi" w:hAnsiTheme="majorBidi"/>
           <w:b w:val="false"/>
           <w:bCs w:val="false"/>
           <w:color w:val="0000FF"/>
@@ -3784,7 +3147,7 @@
       </w:r>
       <w:r>
         <w:rPr>
-          <w:rFonts w:eastAsia="Times New Roman" w:asciiTheme="majorBidi" w:cstheme="majorBidi" w:hAnsiTheme="majorBidi"/>
+          <w:rFonts w:eastAsia="Times New Roman" w:cs="" w:asciiTheme="majorBidi" w:cstheme="majorBidi" w:hAnsiTheme="majorBidi"/>
           <w:color w:val="0000FF"/>
           <w:kern w:val="0"/>
           <w:sz w:val="20"/>
@@ -3849,7 +3212,7 @@
       </w:r>
       <w:r>
         <w:rPr>
-          <w:rFonts w:eastAsia="Times New Roman" w:asciiTheme="majorBidi" w:cstheme="majorBidi" w:hAnsiTheme="majorBidi"/>
+          <w:rFonts w:eastAsia="Times New Roman" w:cs="" w:asciiTheme="majorBidi" w:cstheme="majorBidi" w:hAnsiTheme="majorBidi"/>
           <w:color w:val="0000FF"/>
           <w:kern w:val="0"/>
           <w:sz w:val="20"/>
@@ -3862,7 +3225,7 @@
       <w:r>
         <w:rPr>
           <w:rStyle w:val="Strong"/>
-          <w:rFonts w:eastAsia="Times New Roman" w:asciiTheme="majorBidi" w:cstheme="majorBidi" w:hAnsiTheme="majorBidi"/>
+          <w:rFonts w:eastAsia="Times New Roman" w:cs="" w:asciiTheme="majorBidi" w:cstheme="majorBidi" w:hAnsiTheme="majorBidi"/>
           <w:b w:val="false"/>
           <w:bCs w:val="false"/>
           <w:color w:val="0000FF"/>
@@ -3876,7 +3239,7 @@
       </w:r>
       <w:r>
         <w:rPr>
-          <w:rFonts w:eastAsia="Times New Roman" w:asciiTheme="majorBidi" w:cstheme="majorBidi" w:hAnsiTheme="majorBidi"/>
+          <w:rFonts w:eastAsia="Times New Roman" w:cs="" w:asciiTheme="majorBidi" w:cstheme="majorBidi" w:hAnsiTheme="majorBidi"/>
           <w:b w:val="false"/>
           <w:bCs w:val="false"/>
           <w:color w:val="0000FF"/>
@@ -3890,7 +3253,7 @@
       </w:r>
       <w:r>
         <w:rPr>
-          <w:rFonts w:eastAsia="Times New Roman" w:asciiTheme="majorBidi" w:cstheme="majorBidi" w:hAnsiTheme="majorBidi"/>
+          <w:rFonts w:eastAsia="Times New Roman" w:cs="" w:asciiTheme="majorBidi" w:cstheme="majorBidi" w:hAnsiTheme="majorBidi"/>
           <w:color w:val="0000FF"/>
           <w:kern w:val="0"/>
           <w:sz w:val="20"/>
@@ -3955,7 +3318,7 @@
       </w:r>
       <w:r>
         <w:rPr>
-          <w:rFonts w:eastAsia="Times New Roman" w:asciiTheme="majorBidi" w:cstheme="majorBidi" w:hAnsiTheme="majorBidi"/>
+          <w:rFonts w:eastAsia="Times New Roman" w:cs="" w:asciiTheme="majorBidi" w:cstheme="majorBidi" w:hAnsiTheme="majorBidi"/>
           <w:color w:val="0000FF"/>
           <w:kern w:val="0"/>
           <w:sz w:val="20"/>
@@ -3968,7 +3331,7 @@
       <w:r>
         <w:rPr>
           <w:rStyle w:val="Strong"/>
-          <w:rFonts w:eastAsia="Times New Roman" w:asciiTheme="majorBidi" w:cstheme="majorBidi" w:hAnsiTheme="majorBidi"/>
+          <w:rFonts w:eastAsia="Times New Roman" w:cs="" w:asciiTheme="majorBidi" w:cstheme="majorBidi" w:hAnsiTheme="majorBidi"/>
           <w:b w:val="false"/>
           <w:bCs w:val="false"/>
           <w:color w:val="0000FF"/>
@@ -3982,7 +3345,7 @@
       </w:r>
       <w:r>
         <w:rPr>
-          <w:rFonts w:eastAsia="Times New Roman" w:asciiTheme="majorBidi" w:cstheme="majorBidi" w:hAnsiTheme="majorBidi"/>
+          <w:rFonts w:eastAsia="Times New Roman" w:cs="" w:asciiTheme="majorBidi" w:cstheme="majorBidi" w:hAnsiTheme="majorBidi"/>
           <w:b/>
           <w:bCs/>
           <w:color w:val="0000FF"/>
@@ -3996,7 +3359,7 @@
       </w:r>
       <w:r>
         <w:rPr>
-          <w:rFonts w:eastAsia="Times New Roman" w:asciiTheme="majorBidi" w:cstheme="majorBidi" w:hAnsiTheme="majorBidi"/>
+          <w:rFonts w:eastAsia="Times New Roman" w:cs="" w:asciiTheme="majorBidi" w:cstheme="majorBidi" w:hAnsiTheme="majorBidi"/>
           <w:color w:val="0000FF"/>
           <w:kern w:val="0"/>
           <w:sz w:val="20"/>
@@ -4025,7 +3388,7 @@
       </w:pPr>
       <w:r>
         <w:rPr>
-          <w:rFonts w:eastAsia="Times New Roman" w:asciiTheme="majorBidi" w:cstheme="majorBidi" w:hAnsiTheme="majorBidi"/>
+          <w:rFonts w:eastAsia="Times New Roman" w:cs="" w:asciiTheme="majorBidi" w:cstheme="majorBidi" w:hAnsiTheme="majorBidi"/>
           <w:color w:val="0000FF"/>
           <w:kern w:val="0"/>
           <w:sz w:val="20"/>
@@ -4037,7 +3400,7 @@
       </w:r>
       <w:r>
         <w:rPr>
-          <w:rFonts w:eastAsia="Times New Roman" w:asciiTheme="majorBidi" w:cstheme="majorBidi" w:hAnsiTheme="majorBidi"/>
+          <w:rFonts w:eastAsia="Times New Roman" w:cs="" w:asciiTheme="majorBidi" w:cstheme="majorBidi" w:hAnsiTheme="majorBidi"/>
           <w:b w:val="false"/>
           <w:bCs w:val="false"/>
           <w:color w:val="0000FF"/>
@@ -4052,7 +3415,7 @@
       <w:r>
         <w:rPr>
           <w:rStyle w:val="Strong"/>
-          <w:rFonts w:eastAsia="Times New Roman" w:asciiTheme="majorBidi" w:cstheme="majorBidi" w:hAnsiTheme="majorBidi"/>
+          <w:rFonts w:eastAsia="Times New Roman" w:cs="" w:asciiTheme="majorBidi" w:cstheme="majorBidi" w:hAnsiTheme="majorBidi"/>
           <w:b w:val="false"/>
           <w:bCs w:val="false"/>
           <w:color w:val="0000FF"/>
@@ -4066,7 +3429,7 @@
       </w:r>
       <w:r>
         <w:rPr>
-          <w:rFonts w:eastAsia="Times New Roman" w:asciiTheme="majorBidi" w:cstheme="majorBidi" w:hAnsiTheme="majorBidi"/>
+          <w:rFonts w:eastAsia="Times New Roman" w:cs="" w:asciiTheme="majorBidi" w:cstheme="majorBidi" w:hAnsiTheme="majorBidi"/>
           <w:b w:val="false"/>
           <w:bCs w:val="false"/>
           <w:color w:val="0000FF"/>
@@ -4097,7 +3460,7 @@
       </w:pPr>
       <w:r>
         <w:rPr>
-          <w:rFonts w:eastAsia="Times New Roman" w:asciiTheme="majorBidi" w:cstheme="majorBidi" w:hAnsiTheme="majorBidi"/>
+          <w:rFonts w:eastAsia="Times New Roman" w:cs="" w:asciiTheme="majorBidi" w:cstheme="majorBidi" w:hAnsiTheme="majorBidi"/>
           <w:b w:val="false"/>
           <w:bCs w:val="false"/>
           <w:color w:val="0000FF"/>
@@ -4275,7 +3638,7 @@
       </w:r>
       <w:r>
         <w:rPr>
-          <w:rFonts w:eastAsia="Times New Roman" w:asciiTheme="majorBidi" w:cstheme="majorBidi" w:hAnsiTheme="majorBidi"/>
+          <w:rFonts w:eastAsia="Times New Roman" w:cs="" w:asciiTheme="majorBidi" w:cstheme="majorBidi" w:hAnsiTheme="majorBidi"/>
           <w:color w:val="0000FF"/>
           <w:kern w:val="0"/>
           <w:sz w:val="20"/>
@@ -4287,7 +3650,7 @@
       </w:r>
       <w:r>
         <w:rPr>
-          <w:rFonts w:eastAsia="Times New Roman" w:asciiTheme="majorBidi" w:cstheme="majorBidi" w:hAnsiTheme="majorBidi"/>
+          <w:rFonts w:eastAsia="Times New Roman" w:cs="" w:asciiTheme="majorBidi" w:cstheme="majorBidi" w:hAnsiTheme="majorBidi"/>
           <w:b w:val="false"/>
           <w:bCs w:val="false"/>
           <w:color w:val="0000FF"/>
@@ -4302,7 +3665,7 @@
       <w:r>
         <w:rPr>
           <w:rStyle w:val="Strong"/>
-          <w:rFonts w:eastAsia="Times New Roman" w:asciiTheme="majorBidi" w:cstheme="majorBidi" w:hAnsiTheme="majorBidi"/>
+          <w:rFonts w:eastAsia="Times New Roman" w:cs="" w:asciiTheme="majorBidi" w:cstheme="majorBidi" w:hAnsiTheme="majorBidi"/>
           <w:b w:val="false"/>
           <w:bCs w:val="false"/>
           <w:color w:val="0000FF"/>
@@ -4316,7 +3679,7 @@
       </w:r>
       <w:r>
         <w:rPr>
-          <w:rFonts w:eastAsia="Times New Roman" w:asciiTheme="majorBidi" w:cstheme="majorBidi" w:hAnsiTheme="majorBidi"/>
+          <w:rFonts w:eastAsia="Times New Roman" w:cs="" w:asciiTheme="majorBidi" w:cstheme="majorBidi" w:hAnsiTheme="majorBidi"/>
           <w:b w:val="false"/>
           <w:bCs w:val="false"/>
           <w:color w:val="0000FF"/>
@@ -4331,7 +3694,7 @@
       <w:r>
         <w:rPr>
           <w:rStyle w:val="Strong"/>
-          <w:rFonts w:eastAsia="Times New Roman" w:asciiTheme="majorBidi" w:cstheme="majorBidi" w:hAnsiTheme="majorBidi"/>
+          <w:rFonts w:eastAsia="Times New Roman" w:cs="" w:asciiTheme="majorBidi" w:cstheme="majorBidi" w:hAnsiTheme="majorBidi"/>
           <w:b w:val="false"/>
           <w:bCs w:val="false"/>
           <w:color w:val="0000FF"/>
@@ -4345,7 +3708,7 @@
       </w:r>
       <w:r>
         <w:rPr>
-          <w:rFonts w:eastAsia="Times New Roman" w:asciiTheme="majorBidi" w:cstheme="majorBidi" w:hAnsiTheme="majorBidi"/>
+          <w:rFonts w:eastAsia="Times New Roman" w:cs="" w:asciiTheme="majorBidi" w:cstheme="majorBidi" w:hAnsiTheme="majorBidi"/>
           <w:b w:val="false"/>
           <w:bCs w:val="false"/>
           <w:color w:val="0000FF"/>
@@ -4359,7 +3722,7 @@
       </w:r>
       <w:r>
         <w:rPr>
-          <w:rFonts w:eastAsia="Times New Roman" w:asciiTheme="majorBidi" w:cstheme="majorBidi" w:hAnsiTheme="majorBidi"/>
+          <w:rFonts w:eastAsia="Times New Roman" w:cs="" w:asciiTheme="majorBidi" w:cstheme="majorBidi" w:hAnsiTheme="majorBidi"/>
           <w:color w:val="0000FF"/>
           <w:kern w:val="0"/>
           <w:sz w:val="20"/>
@@ -4431,7 +3794,7 @@
       </w:r>
       <w:r>
         <w:rPr>
-          <w:rFonts w:eastAsia="Times New Roman" w:asciiTheme="majorBidi" w:cstheme="majorBidi" w:hAnsiTheme="majorBidi"/>
+          <w:rFonts w:eastAsia="Times New Roman" w:cs="" w:asciiTheme="majorBidi" w:cstheme="majorBidi" w:hAnsiTheme="majorBidi"/>
           <w:color w:val="0000FF"/>
           <w:kern w:val="0"/>
           <w:sz w:val="20"/>
@@ -4443,7 +3806,7 @@
       </w:r>
       <w:r>
         <w:rPr>
-          <w:rFonts w:eastAsia="Times New Roman" w:asciiTheme="majorBidi" w:cstheme="majorBidi" w:hAnsiTheme="majorBidi"/>
+          <w:rFonts w:eastAsia="Times New Roman" w:cs="" w:asciiTheme="majorBidi" w:cstheme="majorBidi" w:hAnsiTheme="majorBidi"/>
           <w:b w:val="false"/>
           <w:bCs w:val="false"/>
           <w:color w:val="0000FF"/>
@@ -4458,7 +3821,7 @@
       <w:r>
         <w:rPr>
           <w:rStyle w:val="Strong"/>
-          <w:rFonts w:eastAsia="Times New Roman" w:asciiTheme="majorBidi" w:cstheme="majorBidi" w:hAnsiTheme="majorBidi"/>
+          <w:rFonts w:eastAsia="Times New Roman" w:cs="" w:asciiTheme="majorBidi" w:cstheme="majorBidi" w:hAnsiTheme="majorBidi"/>
           <w:b w:val="false"/>
           <w:bCs w:val="false"/>
           <w:color w:val="0000FF"/>
@@ -4472,7 +3835,7 @@
       </w:r>
       <w:r>
         <w:rPr>
-          <w:rFonts w:eastAsia="Times New Roman" w:asciiTheme="majorBidi" w:cstheme="majorBidi" w:hAnsiTheme="majorBidi"/>
+          <w:rFonts w:eastAsia="Times New Roman" w:cs="" w:asciiTheme="majorBidi" w:cstheme="majorBidi" w:hAnsiTheme="majorBidi"/>
           <w:b w:val="false"/>
           <w:bCs w:val="false"/>
           <w:color w:val="0000FF"/>
@@ -4482,25 +3845,11 @@
           <w:lang w:eastAsia="en-GB"/>
           <w14:ligatures w14:val="none"/>
         </w:rPr>
-        <w:t xml:space="preserve"> </w:t>
-      </w:r>
-      <w:r>
-        <w:rPr>
-          <w:rFonts w:eastAsia="Times New Roman" w:asciiTheme="majorBidi" w:cstheme="majorBidi" w:hAnsiTheme="majorBidi"/>
-          <w:b w:val="false"/>
-          <w:bCs w:val="false"/>
-          <w:color w:val="0000FF"/>
-          <w:kern w:val="0"/>
-          <w:sz w:val="20"/>
-          <w:szCs w:val="20"/>
-          <w:lang w:eastAsia="en-GB"/>
-          <w14:ligatures w14:val="none"/>
-        </w:rPr>
-        <w:t xml:space="preserve">encrypt </w:t>
-      </w:r>
-      <w:r>
-        <w:rPr>
-          <w:rFonts w:eastAsia="Times New Roman" w:asciiTheme="majorBidi" w:cstheme="majorBidi" w:hAnsiTheme="majorBidi"/>
+        <w:t xml:space="preserve"> encrypt </w:t>
+      </w:r>
+      <w:r>
+        <w:rPr>
+          <w:rFonts w:eastAsia="Times New Roman" w:cs="" w:asciiTheme="majorBidi" w:cstheme="majorBidi" w:hAnsiTheme="majorBidi"/>
           <w:color w:val="0000FF"/>
           <w:kern w:val="0"/>
           <w:sz w:val="20"/>
@@ -4562,21 +3911,7 @@
           <w:lang w:eastAsia="en-GB"/>
           <w14:ligatures w14:val="none"/>
         </w:rPr>
-        <w:t>. </w:t>
-      </w:r>
-      <w:r>
-        <w:rPr>
-          <w:rFonts w:eastAsia="Times New Roman" w:cs="" w:asciiTheme="majorBidi" w:cstheme="majorBidi" w:hAnsiTheme="majorBidi"/>
-          <w:b/>
-          <w:bCs/>
-          <w:color w:val="373D3F"/>
-          <w:kern w:val="0"/>
-          <w:sz w:val="20"/>
-          <w:szCs w:val="20"/>
-          <w:lang w:eastAsia="en-GB"/>
-          <w14:ligatures w14:val="none"/>
-        </w:rPr>
-        <w:t xml:space="preserve">Reliability </w:t>
+        <w:t xml:space="preserve">. Reliability </w:t>
       </w:r>
     </w:p>
     <w:p>
@@ -4605,19 +3940,7 @@
           <w:lang w:eastAsia="en-GB"/>
           <w14:ligatures w14:val="none"/>
         </w:rPr>
-        <w:t xml:space="preserve">NF-3.1 </w:t>
-      </w:r>
-      <w:r>
-        <w:rPr>
-          <w:rFonts w:eastAsia="Times New Roman" w:cs="" w:asciiTheme="majorBidi" w:cstheme="majorBidi" w:hAnsiTheme="majorBidi"/>
-          <w:color w:val="0000FF"/>
-          <w:kern w:val="0"/>
-          <w:sz w:val="20"/>
-          <w:szCs w:val="20"/>
-          <w:lang w:eastAsia="en-GB"/>
-          <w14:ligatures w14:val="none"/>
-        </w:rPr>
-        <w:t xml:space="preserve">The System </w:t>
+        <w:t xml:space="preserve">NF-3.1 The System </w:t>
       </w:r>
       <w:r>
         <w:rPr>
@@ -4689,7 +4012,7 @@
       <w:r>
         <w:rPr>
           <w:rFonts w:eastAsia="Times New Roman" w:cs="" w:asciiTheme="majorBidi" w:cstheme="majorBidi" w:hAnsiTheme="majorBidi"/>
-          <w:color w:val="0000FF"/>
+          <w:color w:val="373D3F"/>
           <w:kern w:val="0"/>
           <w:sz w:val="20"/>
           <w:szCs w:val="20"/>
@@ -4745,139 +4068,267 @@
       </w:pPr>
       <w:rPr>
         <w:rFonts w:ascii="Symbol" w:hAnsi="Symbol" w:cs="Symbol" w:hint="default"/>
-        <w:sz w:val="20"/>
       </w:rPr>
     </w:lvl>
     <w:lvl w:ilvl="1">
       <w:start w:val="1"/>
       <w:numFmt w:val="bullet"/>
-      <w:lvlText w:val="o"/>
+      <w:lvlText w:val="◦"/>
       <w:lvlJc w:val="start"/>
       <w:pPr>
         <w:tabs>
-          <w:tab w:val="num" w:pos="1440"/>
+          <w:tab w:val="num" w:pos="1080"/>
         </w:tabs>
-        <w:ind w:start="1440" w:hanging="360"/>
+        <w:ind w:start="1080" w:hanging="360"/>
       </w:pPr>
       <w:rPr>
-        <w:rFonts w:ascii="Courier New" w:hAnsi="Courier New" w:cs="Courier New" w:hint="default"/>
-        <w:sz w:val="20"/>
+        <w:rFonts w:ascii="OpenSymbol" w:hAnsi="OpenSymbol" w:cs="OpenSymbol" w:hint="default"/>
       </w:rPr>
     </w:lvl>
     <w:lvl w:ilvl="2">
       <w:start w:val="1"/>
       <w:numFmt w:val="bullet"/>
-      <w:lvlText w:val=""/>
+      <w:lvlText w:val="▪"/>
       <w:lvlJc w:val="start"/>
       <w:pPr>
         <w:tabs>
-          <w:tab w:val="num" w:pos="2160"/>
+          <w:tab w:val="num" w:pos="1440"/>
         </w:tabs>
-        <w:ind w:start="2160" w:hanging="360"/>
+        <w:ind w:start="1440" w:hanging="360"/>
       </w:pPr>
       <w:rPr>
-        <w:rFonts w:ascii="Wingdings" w:hAnsi="Wingdings" w:cs="Wingdings" w:hint="default"/>
-        <w:sz w:val="20"/>
+        <w:rFonts w:ascii="OpenSymbol" w:hAnsi="OpenSymbol" w:cs="OpenSymbol" w:hint="default"/>
       </w:rPr>
     </w:lvl>
     <w:lvl w:ilvl="3">
       <w:start w:val="1"/>
       <w:numFmt w:val="bullet"/>
-      <w:lvlText w:val=""/>
+      <w:lvlText w:val=""/>
       <w:lvlJc w:val="start"/>
       <w:pPr>
         <w:tabs>
-          <w:tab w:val="num" w:pos="2880"/>
+          <w:tab w:val="num" w:pos="1800"/>
         </w:tabs>
-        <w:ind w:start="2880" w:hanging="360"/>
+        <w:ind w:start="1800" w:hanging="360"/>
       </w:pPr>
       <w:rPr>
-        <w:rFonts w:ascii="Wingdings" w:hAnsi="Wingdings" w:cs="Wingdings" w:hint="default"/>
-        <w:sz w:val="20"/>
+        <w:rFonts w:ascii="Symbol" w:hAnsi="Symbol" w:cs="Symbol" w:hint="default"/>
       </w:rPr>
     </w:lvl>
     <w:lvl w:ilvl="4">
       <w:start w:val="1"/>
       <w:numFmt w:val="bullet"/>
-      <w:lvlText w:val=""/>
+      <w:lvlText w:val="◦"/>
       <w:lvlJc w:val="start"/>
       <w:pPr>
         <w:tabs>
-          <w:tab w:val="num" w:pos="3600"/>
+          <w:tab w:val="num" w:pos="2160"/>
         </w:tabs>
-        <w:ind w:start="3600" w:hanging="360"/>
+        <w:ind w:start="2160" w:hanging="360"/>
       </w:pPr>
       <w:rPr>
-        <w:rFonts w:ascii="Wingdings" w:hAnsi="Wingdings" w:cs="Wingdings" w:hint="default"/>
-        <w:sz w:val="20"/>
+        <w:rFonts w:ascii="OpenSymbol" w:hAnsi="OpenSymbol" w:cs="OpenSymbol" w:hint="default"/>
       </w:rPr>
     </w:lvl>
     <w:lvl w:ilvl="5">
       <w:start w:val="1"/>
       <w:numFmt w:val="bullet"/>
-      <w:lvlText w:val=""/>
+      <w:lvlText w:val="▪"/>
       <w:lvlJc w:val="start"/>
       <w:pPr>
         <w:tabs>
-          <w:tab w:val="num" w:pos="4320"/>
+          <w:tab w:val="num" w:pos="2520"/>
         </w:tabs>
-        <w:ind w:start="4320" w:hanging="360"/>
+        <w:ind w:start="2520" w:hanging="360"/>
       </w:pPr>
       <w:rPr>
-        <w:rFonts w:ascii="Wingdings" w:hAnsi="Wingdings" w:cs="Wingdings" w:hint="default"/>
-        <w:sz w:val="20"/>
+        <w:rFonts w:ascii="OpenSymbol" w:hAnsi="OpenSymbol" w:cs="OpenSymbol" w:hint="default"/>
       </w:rPr>
     </w:lvl>
     <w:lvl w:ilvl="6">
       <w:start w:val="1"/>
       <w:numFmt w:val="bullet"/>
-      <w:lvlText w:val=""/>
+      <w:lvlText w:val=""/>
       <w:lvlJc w:val="start"/>
       <w:pPr>
         <w:tabs>
-          <w:tab w:val="num" w:pos="5040"/>
+          <w:tab w:val="num" w:pos="2880"/>
         </w:tabs>
-        <w:ind w:start="5040" w:hanging="360"/>
+        <w:ind w:start="2880" w:hanging="360"/>
       </w:pPr>
       <w:rPr>
-        <w:rFonts w:ascii="Wingdings" w:hAnsi="Wingdings" w:cs="Wingdings" w:hint="default"/>
-        <w:sz w:val="20"/>
+        <w:rFonts w:ascii="Symbol" w:hAnsi="Symbol" w:cs="Symbol" w:hint="default"/>
       </w:rPr>
     </w:lvl>
     <w:lvl w:ilvl="7">
       <w:start w:val="1"/>
       <w:numFmt w:val="bullet"/>
-      <w:lvlText w:val=""/>
+      <w:lvlText w:val="◦"/>
       <w:lvlJc w:val="start"/>
       <w:pPr>
         <w:tabs>
-          <w:tab w:val="num" w:pos="5760"/>
+          <w:tab w:val="num" w:pos="3240"/>
         </w:tabs>
-        <w:ind w:start="5760" w:hanging="360"/>
+        <w:ind w:start="3240" w:hanging="360"/>
       </w:pPr>
       <w:rPr>
-        <w:rFonts w:ascii="Wingdings" w:hAnsi="Wingdings" w:cs="Wingdings" w:hint="default"/>
-        <w:sz w:val="20"/>
+        <w:rFonts w:ascii="OpenSymbol" w:hAnsi="OpenSymbol" w:cs="OpenSymbol" w:hint="default"/>
       </w:rPr>
     </w:lvl>
     <w:lvl w:ilvl="8">
       <w:start w:val="1"/>
       <w:numFmt w:val="bullet"/>
-      <w:lvlText w:val=""/>
+      <w:lvlText w:val="▪"/>
       <w:lvlJc w:val="start"/>
       <w:pPr>
         <w:tabs>
-          <w:tab w:val="num" w:pos="6480"/>
+          <w:tab w:val="num" w:pos="3600"/>
         </w:tabs>
-        <w:ind w:start="6480" w:hanging="360"/>
+        <w:ind w:start="3600" w:hanging="360"/>
       </w:pPr>
       <w:rPr>
-        <w:rFonts w:ascii="Wingdings" w:hAnsi="Wingdings" w:cs="Wingdings" w:hint="default"/>
-        <w:sz w:val="20"/>
+        <w:rFonts w:ascii="OpenSymbol" w:hAnsi="OpenSymbol" w:cs="OpenSymbol" w:hint="default"/>
       </w:rPr>
     </w:lvl>
   </w:abstractNum>
   <w:abstractNum w:abstractNumId="2">
+    <w:lvl w:ilvl="0">
+      <w:start w:val="1"/>
+      <w:numFmt w:val="bullet"/>
+      <w:lvlText w:val=""/>
+      <w:lvlJc w:val="start"/>
+      <w:pPr>
+        <w:tabs>
+          <w:tab w:val="num" w:pos="720"/>
+        </w:tabs>
+        <w:ind w:start="720" w:hanging="360"/>
+      </w:pPr>
+      <w:rPr>
+        <w:rFonts w:ascii="Symbol" w:hAnsi="Symbol" w:cs="Symbol" w:hint="default"/>
+      </w:rPr>
+    </w:lvl>
+    <w:lvl w:ilvl="1">
+      <w:start w:val="1"/>
+      <w:numFmt w:val="bullet"/>
+      <w:lvlText w:val="◦"/>
+      <w:lvlJc w:val="start"/>
+      <w:pPr>
+        <w:tabs>
+          <w:tab w:val="num" w:pos="1080"/>
+        </w:tabs>
+        <w:ind w:start="1080" w:hanging="360"/>
+      </w:pPr>
+      <w:rPr>
+        <w:rFonts w:ascii="OpenSymbol" w:hAnsi="OpenSymbol" w:cs="OpenSymbol" w:hint="default"/>
+      </w:rPr>
+    </w:lvl>
+    <w:lvl w:ilvl="2">
+      <w:start w:val="1"/>
+      <w:numFmt w:val="bullet"/>
+      <w:lvlText w:val="▪"/>
+      <w:lvlJc w:val="start"/>
+      <w:pPr>
+        <w:tabs>
+          <w:tab w:val="num" w:pos="1440"/>
+        </w:tabs>
+        <w:ind w:start="1440" w:hanging="360"/>
+      </w:pPr>
+      <w:rPr>
+        <w:rFonts w:ascii="OpenSymbol" w:hAnsi="OpenSymbol" w:cs="OpenSymbol" w:hint="default"/>
+      </w:rPr>
+    </w:lvl>
+    <w:lvl w:ilvl="3">
+      <w:start w:val="1"/>
+      <w:numFmt w:val="bullet"/>
+      <w:lvlText w:val=""/>
+      <w:lvlJc w:val="start"/>
+      <w:pPr>
+        <w:tabs>
+          <w:tab w:val="num" w:pos="1800"/>
+        </w:tabs>
+        <w:ind w:start="1800" w:hanging="360"/>
+      </w:pPr>
+      <w:rPr>
+        <w:rFonts w:ascii="Symbol" w:hAnsi="Symbol" w:cs="Symbol" w:hint="default"/>
+      </w:rPr>
+    </w:lvl>
+    <w:lvl w:ilvl="4">
+      <w:start w:val="1"/>
+      <w:numFmt w:val="bullet"/>
+      <w:lvlText w:val="◦"/>
+      <w:lvlJc w:val="start"/>
+      <w:pPr>
+        <w:tabs>
+          <w:tab w:val="num" w:pos="2160"/>
+        </w:tabs>
+        <w:ind w:start="2160" w:hanging="360"/>
+      </w:pPr>
+      <w:rPr>
+        <w:rFonts w:ascii="OpenSymbol" w:hAnsi="OpenSymbol" w:cs="OpenSymbol" w:hint="default"/>
+      </w:rPr>
+    </w:lvl>
+    <w:lvl w:ilvl="5">
+      <w:start w:val="1"/>
+      <w:numFmt w:val="bullet"/>
+      <w:lvlText w:val="▪"/>
+      <w:lvlJc w:val="start"/>
+      <w:pPr>
+        <w:tabs>
+          <w:tab w:val="num" w:pos="2520"/>
+        </w:tabs>
+        <w:ind w:start="2520" w:hanging="360"/>
+      </w:pPr>
+      <w:rPr>
+        <w:rFonts w:ascii="OpenSymbol" w:hAnsi="OpenSymbol" w:cs="OpenSymbol" w:hint="default"/>
+      </w:rPr>
+    </w:lvl>
+    <w:lvl w:ilvl="6">
+      <w:start w:val="1"/>
+      <w:numFmt w:val="bullet"/>
+      <w:lvlText w:val=""/>
+      <w:lvlJc w:val="start"/>
+      <w:pPr>
+        <w:tabs>
+          <w:tab w:val="num" w:pos="2880"/>
+        </w:tabs>
+        <w:ind w:start="2880" w:hanging="360"/>
+      </w:pPr>
+      <w:rPr>
+        <w:rFonts w:ascii="Symbol" w:hAnsi="Symbol" w:cs="Symbol" w:hint="default"/>
+      </w:rPr>
+    </w:lvl>
+    <w:lvl w:ilvl="7">
+      <w:start w:val="1"/>
+      <w:numFmt w:val="bullet"/>
+      <w:lvlText w:val="◦"/>
+      <w:lvlJc w:val="start"/>
+      <w:pPr>
+        <w:tabs>
+          <w:tab w:val="num" w:pos="3240"/>
+        </w:tabs>
+        <w:ind w:start="3240" w:hanging="360"/>
+      </w:pPr>
+      <w:rPr>
+        <w:rFonts w:ascii="OpenSymbol" w:hAnsi="OpenSymbol" w:cs="OpenSymbol" w:hint="default"/>
+      </w:rPr>
+    </w:lvl>
+    <w:lvl w:ilvl="8">
+      <w:start w:val="1"/>
+      <w:numFmt w:val="bullet"/>
+      <w:lvlText w:val="▪"/>
+      <w:lvlJc w:val="start"/>
+      <w:pPr>
+        <w:tabs>
+          <w:tab w:val="num" w:pos="3600"/>
+        </w:tabs>
+        <w:ind w:start="3600" w:hanging="360"/>
+      </w:pPr>
+      <w:rPr>
+        <w:rFonts w:ascii="OpenSymbol" w:hAnsi="OpenSymbol" w:cs="OpenSymbol" w:hint="default"/>
+      </w:rPr>
+    </w:lvl>
+  </w:abstractNum>
+  <w:abstractNum w:abstractNumId="3">
     <w:lvl w:ilvl="0">
       <w:start w:val="1"/>
       <w:numFmt w:val="none"/>
@@ -5001,6 +4452,9 @@
   </w:num>
   <w:num w:numId="2">
     <w:abstractNumId w:val="2"/>
+  </w:num>
+  <w:num w:numId="3">
+    <w:abstractNumId w:val="3"/>
   </w:num>
 </w:numbering>
 </file>
@@ -5847,6 +5301,13 @@
       <w:bCs/>
     </w:rPr>
   </w:style>
+  <w:style w:type="character" w:styleId="Bullets">
+    <w:name w:val="Bullets"/>
+    <w:qFormat/>
+    <w:rPr>
+      <w:rFonts w:ascii="OpenSymbol" w:hAnsi="OpenSymbol" w:eastAsia="OpenSymbol" w:cs="OpenSymbol"/>
+    </w:rPr>
+  </w:style>
   <w:style w:type="paragraph" w:styleId="Heading">
     <w:name w:val="Heading"/>
     <w:basedOn w:val="Normal"/>

</xml_diff>

<commit_message>
feat: v4 - add lab4 state diagrams and more srs changes
</commit_message>
<xml_diff>
--- a/Adrian Kucyk SRS.docx
+++ b/Adrian Kucyk SRS.docx
@@ -122,7 +122,7 @@
           <w:lang w:eastAsia="en-GB"/>
           <w14:ligatures w14:val="none"/>
         </w:rPr>
-        <w:t>«StayEase – Hotel Management System»</w:t>
+        <w:t>StayEase – Hotel Management System</w:t>
       </w:r>
     </w:p>
     <w:p>
@@ -194,7 +194,125 @@
           <w:lang w:eastAsia="en-GB"/>
           <w14:ligatures w14:val="none"/>
         </w:rPr>
-        <w:t>«v</w:t>
+        <w:t>v</w:t>
+      </w:r>
+      <w:r>
+        <w:rPr>
+          <w:rFonts w:eastAsia="Times New Roman" w:cs="" w:asciiTheme="majorBidi" w:cstheme="majorBidi" w:hAnsiTheme="majorBidi"/>
+          <w:b/>
+          <w:bCs/>
+          <w:color w:val="0000FF"/>
+          <w:kern w:val="0"/>
+          <w:sz w:val="20"/>
+          <w:szCs w:val="20"/>
+          <w:lang w:eastAsia="en-GB"/>
+          <w14:ligatures w14:val="none"/>
+        </w:rPr>
+        <w:t>4</w:t>
+      </w:r>
+    </w:p>
+    <w:p>
+      <w:pPr>
+        <w:pStyle w:val="Normal"/>
+        <w:shd w:val="clear" w:color="auto" w:fill="FFFFFF"/>
+        <w:spacing w:lineRule="auto" w:line="240" w:before="240" w:after="0"/>
+        <w:rPr>
+          <w:rFonts w:eastAsia="Times New Roman" w:cs="" w:asciiTheme="majorBidi" w:cstheme="majorBidi" w:hAnsiTheme="majorBidi"/>
+          <w:color w:val="373D3F"/>
+          <w:kern w:val="0"/>
+          <w:sz w:val="20"/>
+          <w:szCs w:val="20"/>
+          <w:lang w:eastAsia="en-GB"/>
+          <w14:ligatures w14:val="none"/>
+        </w:rPr>
+      </w:pPr>
+      <w:r>
+        <w:rPr>
+          <w:rFonts w:eastAsia="Times New Roman" w:cs="" w:asciiTheme="majorBidi" w:cstheme="majorBidi" w:hAnsiTheme="majorBidi"/>
+          <w:b/>
+          <w:bCs/>
+          <w:color w:val="373D3F"/>
+          <w:kern w:val="0"/>
+          <w:sz w:val="20"/>
+          <w:szCs w:val="20"/>
+          <w:lang w:eastAsia="en-GB"/>
+          <w14:ligatures w14:val="none"/>
+        </w:rPr>
+        <w:t>Prepared by </w:t>
+      </w:r>
+      <w:r>
+        <w:rPr>
+          <w:rFonts w:eastAsia="Times New Roman" w:cs="" w:asciiTheme="majorBidi" w:cstheme="majorBidi" w:hAnsiTheme="majorBidi"/>
+          <w:b/>
+          <w:bCs/>
+          <w:color w:val="0000FF"/>
+          <w:kern w:val="0"/>
+          <w:sz w:val="20"/>
+          <w:szCs w:val="20"/>
+          <w:lang w:eastAsia="en-GB"/>
+          <w14:ligatures w14:val="none"/>
+        </w:rPr>
+        <w:t>Adrian Kucyk</w:t>
+      </w:r>
+    </w:p>
+    <w:p>
+      <w:pPr>
+        <w:pStyle w:val="Normal"/>
+        <w:shd w:val="clear" w:color="auto" w:fill="FFFFFF"/>
+        <w:spacing w:lineRule="auto" w:line="240" w:before="240" w:after="0"/>
+        <w:rPr>
+          <w:rFonts w:eastAsia="Times New Roman" w:cs="" w:asciiTheme="majorBidi" w:cstheme="majorBidi" w:hAnsiTheme="majorBidi"/>
+          <w:color w:val="373D3F"/>
+          <w:kern w:val="0"/>
+          <w:sz w:val="20"/>
+          <w:szCs w:val="20"/>
+          <w:lang w:eastAsia="en-GB"/>
+          <w14:ligatures w14:val="none"/>
+        </w:rPr>
+      </w:pPr>
+      <w:r>
+        <w:rPr>
+          <w:rFonts w:eastAsia="Times New Roman" w:cs="" w:asciiTheme="majorBidi" w:cstheme="majorBidi" w:hAnsiTheme="majorBidi"/>
+          <w:b/>
+          <w:bCs/>
+          <w:color w:val="0000FF"/>
+          <w:kern w:val="0"/>
+          <w:sz w:val="20"/>
+          <w:szCs w:val="20"/>
+          <w:lang w:eastAsia="en-GB"/>
+          <w14:ligatures w14:val="none"/>
+        </w:rPr>
+        <w:t>IFE/WEEIA 4CS3</w:t>
+      </w:r>
+    </w:p>
+    <w:p>
+      <w:pPr>
+        <w:pStyle w:val="Normal"/>
+        <w:shd w:val="clear" w:color="auto" w:fill="FFFFFF"/>
+        <w:spacing w:lineRule="auto" w:line="240" w:before="240" w:after="0"/>
+        <w:rPr>
+          <w:rFonts w:eastAsia="Times New Roman" w:cs="" w:asciiTheme="majorBidi" w:cstheme="majorBidi" w:hAnsiTheme="majorBidi"/>
+          <w:color w:val="373D3F"/>
+          <w:kern w:val="0"/>
+          <w:sz w:val="20"/>
+          <w:szCs w:val="20"/>
+          <w:lang w:eastAsia="en-GB"/>
+          <w14:ligatures w14:val="none"/>
+        </w:rPr>
+      </w:pPr>
+      <w:r>
+        <w:rPr>
+          <w:rFonts w:eastAsia="Times New Roman" w:cs="" w:asciiTheme="majorBidi" w:cstheme="majorBidi" w:hAnsiTheme="majorBidi"/>
+          <w:b/>
+          <w:bCs/>
+          <w:color w:val="0000FF"/>
+          <w:kern w:val="0"/>
+          <w:sz w:val="20"/>
+          <w:szCs w:val="20"/>
+          <w:lang w:eastAsia="en-GB"/>
+          <w14:ligatures w14:val="none"/>
+        </w:rPr>
+        <w:t>2</w:t>
       </w:r>
       <w:r>
         <w:rPr>
@@ -222,167 +340,7 @@
           <w:lang w:eastAsia="en-GB"/>
           <w14:ligatures w14:val="none"/>
         </w:rPr>
-        <w:t>»</w:t>
-      </w:r>
-    </w:p>
-    <w:p>
-      <w:pPr>
-        <w:pStyle w:val="Normal"/>
-        <w:shd w:val="clear" w:color="auto" w:fill="FFFFFF"/>
-        <w:spacing w:lineRule="auto" w:line="240" w:before="240" w:after="0"/>
-        <w:rPr>
-          <w:rFonts w:eastAsia="Times New Roman" w:cs="" w:asciiTheme="majorBidi" w:cstheme="majorBidi" w:hAnsiTheme="majorBidi"/>
-          <w:color w:val="373D3F"/>
-          <w:kern w:val="0"/>
-          <w:sz w:val="20"/>
-          <w:szCs w:val="20"/>
-          <w:lang w:eastAsia="en-GB"/>
-          <w14:ligatures w14:val="none"/>
-        </w:rPr>
-      </w:pPr>
-      <w:r>
-        <w:rPr>
-          <w:rFonts w:eastAsia="Times New Roman" w:cs="" w:asciiTheme="majorBidi" w:cstheme="majorBidi" w:hAnsiTheme="majorBidi"/>
-          <w:b/>
-          <w:bCs/>
-          <w:color w:val="373D3F"/>
-          <w:kern w:val="0"/>
-          <w:sz w:val="20"/>
-          <w:szCs w:val="20"/>
-          <w:lang w:eastAsia="en-GB"/>
-          <w14:ligatures w14:val="none"/>
-        </w:rPr>
-        <w:t>Prepared by </w:t>
-      </w:r>
-      <w:r>
-        <w:rPr>
-          <w:rFonts w:eastAsia="Times New Roman" w:cs="" w:asciiTheme="majorBidi" w:cstheme="majorBidi" w:hAnsiTheme="majorBidi"/>
-          <w:b/>
-          <w:bCs/>
-          <w:color w:val="0000FF"/>
-          <w:kern w:val="0"/>
-          <w:sz w:val="20"/>
-          <w:szCs w:val="20"/>
-          <w:lang w:eastAsia="en-GB"/>
-          <w14:ligatures w14:val="none"/>
-        </w:rPr>
-        <w:t>Adrian Kucyk</w:t>
-      </w:r>
-    </w:p>
-    <w:p>
-      <w:pPr>
-        <w:pStyle w:val="Normal"/>
-        <w:shd w:val="clear" w:color="auto" w:fill="FFFFFF"/>
-        <w:spacing w:lineRule="auto" w:line="240" w:before="240" w:after="0"/>
-        <w:rPr>
-          <w:rFonts w:eastAsia="Times New Roman" w:cs="" w:asciiTheme="majorBidi" w:cstheme="majorBidi" w:hAnsiTheme="majorBidi"/>
-          <w:color w:val="373D3F"/>
-          <w:kern w:val="0"/>
-          <w:sz w:val="20"/>
-          <w:szCs w:val="20"/>
-          <w:lang w:eastAsia="en-GB"/>
-          <w14:ligatures w14:val="none"/>
-        </w:rPr>
-      </w:pPr>
-      <w:r>
-        <w:rPr>
-          <w:rFonts w:eastAsia="Times New Roman" w:cs="" w:asciiTheme="majorBidi" w:cstheme="majorBidi" w:hAnsiTheme="majorBidi"/>
-          <w:b/>
-          <w:bCs/>
-          <w:color w:val="0000FF"/>
-          <w:kern w:val="0"/>
-          <w:sz w:val="20"/>
-          <w:szCs w:val="20"/>
-          <w:lang w:eastAsia="en-GB"/>
-          <w14:ligatures w14:val="none"/>
-        </w:rPr>
-        <w:t>IFE/WEEIA 4CS3</w:t>
-      </w:r>
-    </w:p>
-    <w:p>
-      <w:pPr>
-        <w:pStyle w:val="Normal"/>
-        <w:shd w:val="clear" w:color="auto" w:fill="FFFFFF"/>
-        <w:spacing w:lineRule="auto" w:line="240" w:before="240" w:after="0"/>
-        <w:rPr>
-          <w:rFonts w:eastAsia="Times New Roman" w:cs="" w:asciiTheme="majorBidi" w:cstheme="majorBidi" w:hAnsiTheme="majorBidi"/>
-          <w:color w:val="373D3F"/>
-          <w:kern w:val="0"/>
-          <w:sz w:val="20"/>
-          <w:szCs w:val="20"/>
-          <w:lang w:eastAsia="en-GB"/>
-          <w14:ligatures w14:val="none"/>
-        </w:rPr>
-      </w:pPr>
-      <w:r>
-        <w:rPr>
-          <w:rFonts w:eastAsia="Times New Roman" w:cs="" w:asciiTheme="majorBidi" w:cstheme="majorBidi" w:hAnsiTheme="majorBidi"/>
-          <w:b/>
-          <w:bCs/>
-          <w:color w:val="0000FF"/>
-          <w:kern w:val="0"/>
-          <w:sz w:val="20"/>
-          <w:szCs w:val="20"/>
-          <w:lang w:eastAsia="en-GB"/>
-          <w14:ligatures w14:val="none"/>
-        </w:rPr>
-        <w:t>1</w:t>
-      </w:r>
-      <w:r>
-        <w:rPr>
-          <w:rFonts w:eastAsia="Times New Roman" w:cs="" w:asciiTheme="majorBidi" w:cstheme="majorBidi" w:hAnsiTheme="majorBidi"/>
-          <w:b/>
-          <w:bCs/>
-          <w:color w:val="0000FF"/>
-          <w:kern w:val="0"/>
-          <w:sz w:val="20"/>
-          <w:szCs w:val="20"/>
-          <w:lang w:eastAsia="en-GB"/>
-          <w14:ligatures w14:val="none"/>
-        </w:rPr>
-        <w:t>5</w:t>
-      </w:r>
-      <w:r>
-        <w:rPr>
-          <w:rFonts w:eastAsia="Times New Roman" w:cs="" w:asciiTheme="majorBidi" w:cstheme="majorBidi" w:hAnsiTheme="majorBidi"/>
-          <w:b/>
-          <w:bCs/>
-          <w:color w:val="0000FF"/>
-          <w:kern w:val="0"/>
-          <w:sz w:val="20"/>
-          <w:szCs w:val="20"/>
-          <w:lang w:eastAsia="en-GB"/>
-          <w14:ligatures w14:val="none"/>
-        </w:rPr>
-        <w:t>.0</w:t>
-      </w:r>
-      <w:r>
-        <w:rPr>
-          <w:rFonts w:eastAsia="Times New Roman" w:cs="" w:asciiTheme="majorBidi" w:cstheme="majorBidi" w:hAnsiTheme="majorBidi"/>
-          <w:b/>
-          <w:bCs/>
-          <w:color w:val="0000FF"/>
-          <w:kern w:val="0"/>
-          <w:sz w:val="20"/>
-          <w:szCs w:val="20"/>
-          <w:lang w:eastAsia="en-GB"/>
-          <w14:ligatures w14:val="none"/>
-        </w:rPr>
-        <w:t>5</w:t>
-      </w:r>
-      <w:r>
-        <w:rPr>
-          <w:rFonts w:eastAsia="Times New Roman" w:cs="" w:asciiTheme="majorBidi" w:cstheme="majorBidi" w:hAnsiTheme="majorBidi"/>
-          <w:b/>
-          <w:bCs/>
-          <w:color w:val="0000FF"/>
-          <w:kern w:val="0"/>
-          <w:sz w:val="20"/>
-          <w:szCs w:val="20"/>
-          <w:lang w:eastAsia="en-GB"/>
-          <w14:ligatures w14:val="none"/>
-        </w:rPr>
-        <w:t>.2026</w:t>
+        <w:t>.05.2026</w:t>
       </w:r>
     </w:p>
     <w:p>
@@ -548,8 +506,8 @@
       </w:tblPr>
       <w:tblGrid>
         <w:gridCol w:w="1087"/>
-        <w:gridCol w:w="784"/>
-        <w:gridCol w:w="2472"/>
+        <w:gridCol w:w="783"/>
+        <w:gridCol w:w="2473"/>
         <w:gridCol w:w="884"/>
       </w:tblGrid>
       <w:tr>
@@ -596,7 +554,7 @@
         </w:tc>
         <w:tc>
           <w:tcPr>
-            <w:tcW w:w="784" w:type="dxa"/>
+            <w:tcW w:w="783" w:type="dxa"/>
             <w:tcBorders>
               <w:top w:val="single" w:sz="6" w:space="0" w:color="000000"/>
               <w:start w:val="single" w:sz="6" w:space="0" w:color="000000"/>
@@ -636,7 +594,7 @@
         </w:tc>
         <w:tc>
           <w:tcPr>
-            <w:tcW w:w="2472" w:type="dxa"/>
+            <w:tcW w:w="2473" w:type="dxa"/>
             <w:tcBorders>
               <w:top w:val="single" w:sz="6" w:space="0" w:color="000000"/>
               <w:start w:val="single" w:sz="6" w:space="0" w:color="000000"/>
@@ -759,7 +717,7 @@
         </w:tc>
         <w:tc>
           <w:tcPr>
-            <w:tcW w:w="784" w:type="dxa"/>
+            <w:tcW w:w="783" w:type="dxa"/>
             <w:tcBorders>
               <w:top w:val="single" w:sz="6" w:space="0" w:color="000000"/>
               <w:start w:val="single" w:sz="6" w:space="0" w:color="000000"/>
@@ -799,7 +757,7 @@
         </w:tc>
         <w:tc>
           <w:tcPr>
-            <w:tcW w:w="2472" w:type="dxa"/>
+            <w:tcW w:w="2473" w:type="dxa"/>
             <w:tcBorders>
               <w:top w:val="single" w:sz="6" w:space="0" w:color="000000"/>
               <w:start w:val="single" w:sz="6" w:space="0" w:color="000000"/>
@@ -921,7 +879,7 @@
         </w:tc>
         <w:tc>
           <w:tcPr>
-            <w:tcW w:w="784" w:type="dxa"/>
+            <w:tcW w:w="783" w:type="dxa"/>
             <w:tcBorders>
               <w:start w:val="single" w:sz="6" w:space="0" w:color="000000"/>
               <w:bottom w:val="single" w:sz="6" w:space="0" w:color="000000"/>
@@ -960,7 +918,7 @@
         </w:tc>
         <w:tc>
           <w:tcPr>
-            <w:tcW w:w="2472" w:type="dxa"/>
+            <w:tcW w:w="2473" w:type="dxa"/>
             <w:tcBorders>
               <w:start w:val="single" w:sz="6" w:space="0" w:color="000000"/>
               <w:bottom w:val="single" w:sz="6" w:space="0" w:color="000000"/>
@@ -1080,7 +1038,7 @@
         </w:tc>
         <w:tc>
           <w:tcPr>
-            <w:tcW w:w="784" w:type="dxa"/>
+            <w:tcW w:w="783" w:type="dxa"/>
             <w:tcBorders>
               <w:start w:val="single" w:sz="6" w:space="0" w:color="000000"/>
               <w:bottom w:val="single" w:sz="6" w:space="0" w:color="000000"/>
@@ -1119,7 +1077,7 @@
         </w:tc>
         <w:tc>
           <w:tcPr>
-            <w:tcW w:w="2472" w:type="dxa"/>
+            <w:tcW w:w="2473" w:type="dxa"/>
             <w:tcBorders>
               <w:start w:val="single" w:sz="6" w:space="0" w:color="000000"/>
               <w:bottom w:val="single" w:sz="6" w:space="0" w:color="000000"/>
@@ -1196,6 +1154,165 @@
           </w:p>
         </w:tc>
       </w:tr>
+      <w:tr>
+        <w:trPr/>
+        <w:tc>
+          <w:tcPr>
+            <w:tcW w:w="1087" w:type="dxa"/>
+            <w:tcBorders>
+              <w:start w:val="single" w:sz="6" w:space="0" w:color="000000"/>
+              <w:bottom w:val="single" w:sz="6" w:space="0" w:color="000000"/>
+              <w:end w:val="single" w:sz="6" w:space="0" w:color="000000"/>
+            </w:tcBorders>
+            <w:shd w:color="auto" w:fill="FFFFFF" w:val="clear"/>
+            <w:vAlign w:val="center"/>
+          </w:tcPr>
+          <w:p>
+            <w:pPr>
+              <w:pStyle w:val="Normal"/>
+              <w:spacing w:lineRule="atLeast" w:line="264" w:before="360" w:after="360"/>
+              <w:rPr>
+                <w:rFonts w:eastAsia="Times New Roman" w:cs="" w:asciiTheme="majorBidi" w:cstheme="majorBidi" w:hAnsiTheme="majorBidi"/>
+                <w:color w:val="0301FA"/>
+                <w:kern w:val="0"/>
+                <w:sz w:val="16"/>
+                <w:szCs w:val="16"/>
+                <w:lang w:eastAsia="en-GB"/>
+                <w14:ligatures w14:val="none"/>
+              </w:rPr>
+            </w:pPr>
+            <w:r>
+              <w:rPr>
+                <w:rFonts w:eastAsia="Times New Roman" w:cs="" w:asciiTheme="majorBidi" w:cstheme="majorBidi" w:hAnsiTheme="majorBidi"/>
+                <w:color w:val="0301FA"/>
+                <w:kern w:val="0"/>
+                <w:sz w:val="16"/>
+                <w:szCs w:val="16"/>
+                <w:lang w:eastAsia="en-GB"/>
+                <w14:ligatures w14:val="none"/>
+              </w:rPr>
+              <w:t xml:space="preserve">Update: add lab4 state diagrams </w:t>
+            </w:r>
+          </w:p>
+        </w:tc>
+        <w:tc>
+          <w:tcPr>
+            <w:tcW w:w="783" w:type="dxa"/>
+            <w:tcBorders>
+              <w:start w:val="single" w:sz="6" w:space="0" w:color="000000"/>
+              <w:bottom w:val="single" w:sz="6" w:space="0" w:color="000000"/>
+              <w:end w:val="single" w:sz="6" w:space="0" w:color="000000"/>
+            </w:tcBorders>
+            <w:shd w:color="auto" w:fill="FFFFFF" w:val="clear"/>
+            <w:vAlign w:val="center"/>
+          </w:tcPr>
+          <w:p>
+            <w:pPr>
+              <w:pStyle w:val="Normal"/>
+              <w:spacing w:lineRule="atLeast" w:line="264" w:before="360" w:after="360"/>
+              <w:rPr>
+                <w:rFonts w:eastAsia="Times New Roman" w:cs="" w:asciiTheme="majorBidi" w:cstheme="majorBidi" w:hAnsiTheme="majorBidi"/>
+                <w:color w:val="0301FA"/>
+                <w:kern w:val="0"/>
+                <w:sz w:val="16"/>
+                <w:szCs w:val="16"/>
+                <w:lang w:eastAsia="en-GB"/>
+                <w14:ligatures w14:val="none"/>
+              </w:rPr>
+            </w:pPr>
+            <w:r>
+              <w:rPr>
+                <w:rFonts w:eastAsia="Times New Roman" w:cs="" w:asciiTheme="majorBidi" w:cstheme="majorBidi" w:hAnsiTheme="majorBidi"/>
+                <w:color w:val="0301FA"/>
+                <w:kern w:val="0"/>
+                <w:sz w:val="16"/>
+                <w:szCs w:val="16"/>
+                <w:lang w:eastAsia="en-GB"/>
+                <w14:ligatures w14:val="none"/>
+              </w:rPr>
+              <w:t>23.05.2026</w:t>
+            </w:r>
+          </w:p>
+        </w:tc>
+        <w:tc>
+          <w:tcPr>
+            <w:tcW w:w="2473" w:type="dxa"/>
+            <w:tcBorders>
+              <w:start w:val="single" w:sz="6" w:space="0" w:color="000000"/>
+              <w:bottom w:val="single" w:sz="6" w:space="0" w:color="000000"/>
+              <w:end w:val="single" w:sz="6" w:space="0" w:color="000000"/>
+            </w:tcBorders>
+            <w:shd w:color="auto" w:fill="FFFFFF" w:val="clear"/>
+            <w:vAlign w:val="center"/>
+          </w:tcPr>
+          <w:p>
+            <w:pPr>
+              <w:pStyle w:val="Normal"/>
+              <w:spacing w:lineRule="atLeast" w:line="264" w:before="360" w:after="360"/>
+              <w:rPr>
+                <w:rFonts w:eastAsia="Times New Roman" w:cs="" w:asciiTheme="majorBidi" w:cstheme="majorBidi" w:hAnsiTheme="majorBidi"/>
+                <w:color w:val="0301FA"/>
+                <w:kern w:val="0"/>
+                <w:sz w:val="16"/>
+                <w:szCs w:val="16"/>
+                <w:lang w:eastAsia="en-GB"/>
+                <w14:ligatures w14:val="none"/>
+              </w:rPr>
+            </w:pPr>
+            <w:r>
+              <w:rPr>
+                <w:rFonts w:eastAsia="Times New Roman" w:cs="" w:asciiTheme="majorBidi" w:cstheme="majorBidi" w:hAnsiTheme="majorBidi"/>
+                <w:color w:val="0301FA"/>
+                <w:kern w:val="0"/>
+                <w:sz w:val="16"/>
+                <w:szCs w:val="16"/>
+                <w:lang w:eastAsia="en-GB"/>
+                <w14:ligatures w14:val="none"/>
+              </w:rPr>
+              <w:t>Update to include sequence diagram and update External Interface Requirements and System Features/Modules sections</w:t>
+            </w:r>
+          </w:p>
+        </w:tc>
+        <w:tc>
+          <w:tcPr>
+            <w:tcW w:w="884" w:type="dxa"/>
+            <w:tcBorders>
+              <w:start w:val="single" w:sz="6" w:space="0" w:color="000000"/>
+              <w:bottom w:val="single" w:sz="6" w:space="0" w:color="000000"/>
+              <w:end w:val="single" w:sz="6" w:space="0" w:color="000000"/>
+            </w:tcBorders>
+            <w:shd w:color="auto" w:fill="FFFFFF" w:val="clear"/>
+            <w:vAlign w:val="center"/>
+          </w:tcPr>
+          <w:p>
+            <w:pPr>
+              <w:pStyle w:val="Normal"/>
+              <w:spacing w:lineRule="atLeast" w:line="264" w:before="360" w:after="360"/>
+              <w:rPr>
+                <w:rFonts w:eastAsia="Times New Roman" w:cs="" w:asciiTheme="majorBidi" w:cstheme="majorBidi" w:hAnsiTheme="majorBidi"/>
+                <w:color w:val="0301FA"/>
+                <w:kern w:val="0"/>
+                <w:sz w:val="16"/>
+                <w:szCs w:val="16"/>
+                <w:lang w:eastAsia="en-GB"/>
+                <w14:ligatures w14:val="none"/>
+              </w:rPr>
+            </w:pPr>
+            <w:r>
+              <w:rPr>
+                <w:rFonts w:eastAsia="Times New Roman" w:cs="" w:asciiTheme="majorBidi" w:cstheme="majorBidi" w:hAnsiTheme="majorBidi"/>
+                <w:color w:val="0301FA"/>
+                <w:kern w:val="0"/>
+                <w:sz w:val="16"/>
+                <w:szCs w:val="16"/>
+                <w:lang w:eastAsia="en-GB"/>
+                <w14:ligatures w14:val="none"/>
+              </w:rPr>
+              <w:t>v4</w:t>
+            </w:r>
+          </w:p>
+        </w:tc>
+      </w:tr>
     </w:tbl>
     <w:p>
       <w:pPr>
@@ -2111,19 +2228,7 @@
           <w:lang w:eastAsia="en-GB"/>
           <w14:ligatures w14:val="none"/>
         </w:rPr>
-        <w:t xml:space="preserve">Room cleaners – the frequency of use </w:t>
-      </w:r>
-      <w:r>
-        <w:rPr>
-          <w:rFonts w:eastAsia="Times New Roman" w:cs="" w:asciiTheme="majorBidi" w:cstheme="majorBidi" w:hAnsiTheme="majorBidi"/>
-          <w:color w:val="0000FF"/>
-          <w:kern w:val="0"/>
-          <w:sz w:val="20"/>
-          <w:szCs w:val="20"/>
-          <w:lang w:eastAsia="en-GB"/>
-          <w14:ligatures w14:val="none"/>
-        </w:rPr>
-        <w:t>might be daily, they should have access to updating room statuses and viewing raports/status of the rooms.</w:t>
+        <w:t>Room cleaners – the frequency of use might be daily, they should have access to updating room statuses and viewing raports/status of the rooms.</w:t>
       </w:r>
     </w:p>
     <w:p>
@@ -2291,31 +2396,7 @@
           <w:lang w:eastAsia="en-GB"/>
           <w14:ligatures w14:val="none"/>
         </w:rPr>
-        <w:t xml:space="preserve">The platofrm will be dedicated local computer acting as the sever, it will have ubuntu operation system in one of the latest distributions. </w:t>
-      </w:r>
-      <w:r>
-        <w:rPr>
-          <w:rFonts w:eastAsia="Times New Roman" w:cs="" w:asciiTheme="majorBidi" w:cstheme="majorBidi" w:hAnsiTheme="majorBidi"/>
-          <w:color w:val="0000FF"/>
-          <w:kern w:val="0"/>
-          <w:sz w:val="20"/>
-          <w:szCs w:val="20"/>
-          <w:lang w:eastAsia="en-GB"/>
-          <w14:ligatures w14:val="none"/>
-        </w:rPr>
-        <w:t>A</w:t>
-      </w:r>
-      <w:r>
-        <w:rPr>
-          <w:rFonts w:eastAsia="Times New Roman" w:cs="" w:asciiTheme="majorBidi" w:cstheme="majorBidi" w:hAnsiTheme="majorBidi"/>
-          <w:color w:val="0000FF"/>
-          <w:kern w:val="0"/>
-          <w:sz w:val="20"/>
-          <w:szCs w:val="20"/>
-          <w:lang w:eastAsia="en-GB"/>
-          <w14:ligatures w14:val="none"/>
-        </w:rPr>
-        <w:t>s the database the PostgreSQL will be used. Any device in the hotel, such as tablets, laptops or other workstations will need to be connected to the local network and by using modern browser, access the management website.</w:t>
+        <w:t>The platofrm will be dedicated local computer acting as the sever, it will have ubuntu operation system in one of the latest distributions. As the database the PostgreSQL will be used. Any device in the hotel, such as tablets, laptops or other workstations will need to be connected to the local network and by using modern browser, access the management website.</w:t>
       </w:r>
     </w:p>
     <w:p>
@@ -2602,7 +2683,7 @@
       <w:r>
         <w:rPr>
           <w:rFonts w:eastAsia="Times New Roman" w:cs="" w:asciiTheme="majorBidi" w:cstheme="majorBidi" w:hAnsiTheme="majorBidi"/>
-          <w:color w:val="0000FF"/>
+          <w:color w:val="373D3F"/>
           <w:kern w:val="0"/>
           <w:sz w:val="20"/>
           <w:szCs w:val="20"/>
@@ -2668,7 +2749,67 @@
           <w:lang w:eastAsia="en-GB"/>
           <w14:ligatures w14:val="none"/>
         </w:rPr>
-        <w:t>It is assumed that all client interaction devices (tablets, laptops, or workstations) maintain a reliable connection to the hotel’s local network environment</w:t>
+        <w:t>It is assu</w:t>
+      </w:r>
+      <w:r>
+        <w:drawing>
+          <wp:anchor distT="0" distB="0" distL="0" distR="0" simplePos="0" relativeHeight="3" behindDoc="0" locked="0" layoutInCell="0" allowOverlap="1">
+            <wp:simplePos x="0" y="0"/>
+            <wp:positionH relativeFrom="column">
+              <wp:align>center</wp:align>
+            </wp:positionH>
+            <wp:positionV relativeFrom="paragraph">
+              <wp:posOffset>635</wp:posOffset>
+            </wp:positionV>
+            <wp:extent cx="5731510" cy="4946650"/>
+            <wp:effectExtent l="0" t="0" r="0" b="0"/>
+            <wp:wrapSquare wrapText="largest"/>
+            <wp:docPr id="2" name="Image2"/>
+            <wp:cNvGraphicFramePr>
+              <a:graphicFrameLocks xmlns:a="http://schemas.openxmlformats.org/drawingml/2006/main" noChangeAspect="1"/>
+            </wp:cNvGraphicFramePr>
+            <a:graphic xmlns:a="http://schemas.openxmlformats.org/drawingml/2006/main">
+              <a:graphicData uri="http://schemas.openxmlformats.org/drawingml/2006/picture">
+                <pic:pic xmlns:pic="http://schemas.openxmlformats.org/drawingml/2006/picture">
+                  <pic:nvPicPr>
+                    <pic:cNvPr id="2" name="Image2"/>
+                    <pic:cNvPicPr>
+                      <a:picLocks noChangeAspect="1" noChangeArrowheads="1"/>
+                    </pic:cNvPicPr>
+                  </pic:nvPicPr>
+                  <pic:blipFill>
+                    <a:blip r:embed="rId3"/>
+                    <a:stretch>
+                      <a:fillRect/>
+                    </a:stretch>
+                  </pic:blipFill>
+                  <pic:spPr bwMode="auto">
+                    <a:xfrm>
+                      <a:off x="0" y="0"/>
+                      <a:ext cx="5731510" cy="4946650"/>
+                    </a:xfrm>
+                    <a:prstGeom prst="rect">
+                      <a:avLst/>
+                    </a:prstGeom>
+                    <a:noFill/>
+                  </pic:spPr>
+                </pic:pic>
+              </a:graphicData>
+            </a:graphic>
+          </wp:anchor>
+        </w:drawing>
+      </w:r>
+      <w:r>
+        <w:rPr>
+          <w:rFonts w:eastAsia="Times New Roman" w:cs="" w:asciiTheme="majorBidi" w:cstheme="majorBidi" w:hAnsiTheme="majorBidi"/>
+          <w:color w:val="0000FF"/>
+          <w:kern w:val="0"/>
+          <w:sz w:val="20"/>
+          <w:szCs w:val="20"/>
+          <w:lang w:eastAsia="en-GB"/>
+          <w14:ligatures w14:val="none"/>
+        </w:rPr>
+        <w:t>med that all client interaction devices (tablets, laptops, or workstations) maintain a reliable connection to the hotel’s local network environment</w:t>
       </w:r>
     </w:p>
     <w:p>
@@ -2779,35 +2920,6 @@
       <w:r>
         <w:rPr>
           <w:rFonts w:eastAsia="Times New Roman" w:cs="" w:asciiTheme="majorBidi" w:cstheme="majorBidi" w:hAnsiTheme="majorBidi"/>
-          <w:color w:val="0000FF"/>
-          <w:kern w:val="0"/>
-          <w:sz w:val="20"/>
-          <w:szCs w:val="20"/>
-          <w:lang w:eastAsia="en-GB"/>
-          <w14:ligatures w14:val="none"/>
-        </w:rPr>
-        <w:t>«The purpose here is to give a brief introduction to the system features, so that §4 has something to reference. Then, the full explanation of the system features is given in §5, likely referencing §4. The numbering in §3 and §5 should match.»</w:t>
-      </w:r>
-    </w:p>
-    <w:p>
-      <w:pPr>
-        <w:pStyle w:val="Normal"/>
-        <w:shd w:val="clear" w:color="auto" w:fill="FFFFFF"/>
-        <w:spacing w:lineRule="auto" w:line="240" w:before="240" w:after="0"/>
-        <w:jc w:val="both"/>
-        <w:rPr>
-          <w:rFonts w:eastAsia="Times New Roman" w:cs="" w:asciiTheme="majorBidi" w:cstheme="majorBidi" w:hAnsiTheme="majorBidi"/>
-          <w:color w:val="373D3F"/>
-          <w:kern w:val="0"/>
-          <w:sz w:val="20"/>
-          <w:szCs w:val="20"/>
-          <w:lang w:eastAsia="en-GB"/>
-          <w14:ligatures w14:val="none"/>
-        </w:rPr>
-      </w:pPr>
-      <w:r>
-        <w:rPr>
-          <w:rFonts w:eastAsia="Times New Roman" w:cs="" w:asciiTheme="majorBidi" w:cstheme="majorBidi" w:hAnsiTheme="majorBidi"/>
           <w:b/>
           <w:bCs/>
           <w:color w:val="373D3F"/>
@@ -2831,119 +2943,7 @@
           <w:lang w:eastAsia="en-GB"/>
           <w14:ligatures w14:val="none"/>
         </w:rPr>
-        <w:t>U</w:t>
-      </w:r>
-      <w:r>
-        <w:rPr>
-          <w:rFonts w:eastAsia="Times New Roman" w:cs="" w:asciiTheme="majorBidi" w:cstheme="majorBidi" w:hAnsiTheme="majorBidi"/>
-          <w:b/>
-          <w:bCs/>
-          <w:color w:val="0000FF"/>
-          <w:kern w:val="0"/>
-          <w:sz w:val="20"/>
-          <w:szCs w:val="20"/>
-          <w:lang w:eastAsia="en-GB"/>
-          <w14:ligatures w14:val="none"/>
-        </w:rPr>
-        <w:t>s</w:t>
-      </w:r>
-      <w:r>
-        <w:rPr>
-          <w:rFonts w:eastAsia="Times New Roman" w:cs="" w:asciiTheme="majorBidi" w:cstheme="majorBidi" w:hAnsiTheme="majorBidi"/>
-          <w:b/>
-          <w:bCs/>
-          <w:color w:val="0000FF"/>
-          <w:kern w:val="0"/>
-          <w:sz w:val="20"/>
-          <w:szCs w:val="20"/>
-          <w:lang w:eastAsia="en-GB"/>
-          <w14:ligatures w14:val="none"/>
-        </w:rPr>
-        <w:t>e</w:t>
-      </w:r>
-      <w:r>
-        <w:rPr>
-          <w:rFonts w:eastAsia="Times New Roman" w:cs="" w:asciiTheme="majorBidi" w:cstheme="majorBidi" w:hAnsiTheme="majorBidi"/>
-          <w:b/>
-          <w:bCs/>
-          <w:color w:val="0000FF"/>
-          <w:kern w:val="0"/>
-          <w:sz w:val="20"/>
-          <w:szCs w:val="20"/>
-          <w:lang w:eastAsia="en-GB"/>
-          <w14:ligatures w14:val="none"/>
-        </w:rPr>
-        <w:t xml:space="preserve">r </w:t>
-      </w:r>
-      <w:r>
-        <w:rPr>
-          <w:rFonts w:eastAsia="Times New Roman" w:cs="" w:asciiTheme="majorBidi" w:cstheme="majorBidi" w:hAnsiTheme="majorBidi"/>
-          <w:b/>
-          <w:bCs/>
-          <w:color w:val="0000FF"/>
-          <w:kern w:val="0"/>
-          <w:sz w:val="20"/>
-          <w:szCs w:val="20"/>
-          <w:lang w:eastAsia="en-GB"/>
-          <w14:ligatures w14:val="none"/>
-        </w:rPr>
-        <w:t>R</w:t>
-      </w:r>
-      <w:r>
-        <w:rPr>
-          <w:rFonts w:eastAsia="Times New Roman" w:cs="" w:asciiTheme="majorBidi" w:cstheme="majorBidi" w:hAnsiTheme="majorBidi"/>
-          <w:b/>
-          <w:bCs/>
-          <w:color w:val="0000FF"/>
-          <w:kern w:val="0"/>
-          <w:sz w:val="20"/>
-          <w:szCs w:val="20"/>
-          <w:lang w:eastAsia="en-GB"/>
-          <w14:ligatures w14:val="none"/>
-        </w:rPr>
-        <w:t>o</w:t>
-      </w:r>
-      <w:r>
-        <w:rPr>
-          <w:rFonts w:eastAsia="Times New Roman" w:cs="" w:asciiTheme="majorBidi" w:cstheme="majorBidi" w:hAnsiTheme="majorBidi"/>
-          <w:b/>
-          <w:bCs/>
-          <w:color w:val="0000FF"/>
-          <w:kern w:val="0"/>
-          <w:sz w:val="20"/>
-          <w:szCs w:val="20"/>
-          <w:lang w:eastAsia="en-GB"/>
-          <w14:ligatures w14:val="none"/>
-        </w:rPr>
-        <w:t>l</w:t>
-      </w:r>
-      <w:r>
-        <w:rPr>
-          <w:rFonts w:eastAsia="Times New Roman" w:cs="" w:asciiTheme="majorBidi" w:cstheme="majorBidi" w:hAnsiTheme="majorBidi"/>
-          <w:b/>
-          <w:bCs/>
-          <w:color w:val="0000FF"/>
-          <w:kern w:val="0"/>
-          <w:sz w:val="20"/>
-          <w:szCs w:val="20"/>
-          <w:lang w:eastAsia="en-GB"/>
-          <w14:ligatures w14:val="none"/>
-        </w:rPr>
-        <w:t>e</w:t>
-      </w:r>
-      <w:r>
-        <w:rPr>
-          <w:rFonts w:eastAsia="Times New Roman" w:cs="" w:asciiTheme="majorBidi" w:cstheme="majorBidi" w:hAnsiTheme="majorBidi"/>
-          <w:b/>
-          <w:bCs/>
-          <w:color w:val="0000FF"/>
-          <w:kern w:val="0"/>
-          <w:sz w:val="20"/>
-          <w:szCs w:val="20"/>
-          <w:lang w:eastAsia="en-GB"/>
-          <w14:ligatures w14:val="none"/>
-        </w:rPr>
-        <w:t>s</w:t>
+        <w:t>User Roles</w:t>
       </w:r>
     </w:p>
     <w:p>
@@ -2973,6 +2973,18 @@
           <w14:ligatures w14:val="none"/>
         </w:rPr>
         <w:t>User Authentication &amp; Security Control: Secures local system access dynamically based on designated employee roles</w:t>
+      </w:r>
+      <w:r>
+        <w:rPr>
+          <w:rFonts w:eastAsia="Times New Roman" w:cs="" w:asciiTheme="majorBidi" w:cstheme="majorBidi" w:hAnsiTheme="majorBidi"/>
+          <w:color w:val="373D3F"/>
+          <w:kern w:val="0"/>
+          <w:sz w:val="20"/>
+          <w:szCs w:val="20"/>
+          <w:lang w:eastAsia="en-GB"/>
+          <w14:ligatures w14:val="none"/>
+        </w:rPr>
+        <w:t>.</w:t>
       </w:r>
     </w:p>
     <w:p>
@@ -3036,7 +3048,7 @@
           <w:lang w:eastAsia="en-GB"/>
           <w14:ligatures w14:val="none"/>
         </w:rPr>
-        <w:t>Room Inventory Management: Provides real-time digital allocation, filtering, and automated updates of room cleanliness statuses</w:t>
+        <w:t>Room Inventory Management: Provides real-time digital allocation, filtering, and automated updates of room cleanliness statuses.</w:t>
       </w:r>
     </w:p>
     <w:p>
@@ -3102,7 +3114,7 @@
           <w:lang w:eastAsia="en-GB"/>
           <w14:ligatures w14:val="none"/>
         </w:rPr>
-        <w:t xml:space="preserve">Guest Reservation &amp; Booking Engine: Manages guest data entries, check-in operations, and conditional booking cancellations </w:t>
+        <w:t>Guest Reservation &amp; Booking Engine: Manages guest data entries, check-in operations, and conditional booking cancellations.</w:t>
       </w:r>
     </w:p>
     <w:p>
@@ -3168,7 +3180,7 @@
           <w:lang w:eastAsia="en-GB"/>
           <w14:ligatures w14:val="none"/>
         </w:rPr>
-        <w:t>Automated Billing Processing: Dynamically handles calculations for client invoicing upon checkout based on localized system parameters</w:t>
+        <w:t>Automated Billing Processing: Dynamically handles calculations for client invoicing upon checkout based on localized system parameters.</w:t>
       </w:r>
     </w:p>
     <w:p>
@@ -3259,36 +3271,36 @@
           <w:lang w:eastAsia="en-GB"/>
           <w14:ligatures w14:val="none"/>
         </w:rPr>
-        <w:t>«Describe the high level functionality of the system from the user’s perspective. Explain how the user should be able to use your system to complete all the expected features and the feedback information that will be displayed for the user (for each screen the user will see). For example, specify whether it is GUI or text based interface and how at high level it would work. Discuss at high level how user will interact with the game such as clicking buttons, typing in some selection character, etc.»</w:t>
-      </w:r>
-    </w:p>
-    <w:p>
-      <w:pPr>
-        <w:pStyle w:val="Normal"/>
-        <w:shd w:val="clear" w:color="auto" w:fill="FFFFFF"/>
-        <w:spacing w:lineRule="auto" w:line="240" w:before="240" w:after="0"/>
-        <w:jc w:val="both"/>
-        <w:rPr>
-          <w:rFonts w:eastAsia="Times New Roman" w:cs="" w:asciiTheme="majorBidi" w:cstheme="majorBidi" w:hAnsiTheme="majorBidi"/>
-          <w:color w:val="373D3F"/>
-          <w:kern w:val="0"/>
-          <w:sz w:val="20"/>
-          <w:szCs w:val="20"/>
-          <w:lang w:eastAsia="en-GB"/>
-          <w14:ligatures w14:val="none"/>
-        </w:rPr>
-      </w:pPr>
-      <w:r>
-        <w:rPr>
-          <w:rFonts w:eastAsia="Times New Roman" w:cs="" w:asciiTheme="majorBidi" w:cstheme="majorBidi" w:hAnsiTheme="majorBidi"/>
-          <w:color w:val="0000FF"/>
-          <w:kern w:val="0"/>
-          <w:sz w:val="20"/>
-          <w:szCs w:val="20"/>
-          <w:lang w:eastAsia="en-GB"/>
-          <w14:ligatures w14:val="none"/>
-        </w:rPr>
-        <w:t>«Describe the minimum requirements for the interface. This may include some sample screen images whether for text or GUI approach, any GUI standards or product family style guides that are to be followed, screen layout constraints, for GUI standard buttons and functions (e.g., help) that must appear on every screen, keyboard shortcuts, error message display standards, and so on»</w:t>
+        <w:t>StayEase will provide a fully web-based user interface accessed locally via standard web browsers.</w:t>
+      </w:r>
+    </w:p>
+    <w:p>
+      <w:pPr>
+        <w:pStyle w:val="Normal"/>
+        <w:shd w:val="clear" w:color="auto" w:fill="FFFFFF"/>
+        <w:spacing w:lineRule="auto" w:line="240" w:before="240" w:after="0"/>
+        <w:jc w:val="both"/>
+        <w:rPr>
+          <w:rFonts w:eastAsia="Times New Roman" w:cs="" w:asciiTheme="majorBidi" w:cstheme="majorBidi" w:hAnsiTheme="majorBidi"/>
+          <w:color w:val="373D3F"/>
+          <w:kern w:val="0"/>
+          <w:sz w:val="20"/>
+          <w:szCs w:val="20"/>
+          <w:lang w:eastAsia="en-GB"/>
+          <w14:ligatures w14:val="none"/>
+        </w:rPr>
+      </w:pPr>
+      <w:r>
+        <w:rPr>
+          <w:rFonts w:eastAsia="Times New Roman" w:cs="" w:asciiTheme="majorBidi" w:cstheme="majorBidi" w:hAnsiTheme="majorBidi"/>
+          <w:color w:val="0000FF"/>
+          <w:kern w:val="0"/>
+          <w:sz w:val="20"/>
+          <w:szCs w:val="20"/>
+          <w:lang w:eastAsia="en-GB"/>
+          <w14:ligatures w14:val="none"/>
+        </w:rPr>
+        <w:t>The interface dynamically adapts features and view configurations depending on the logged-in user role (Hotel Owner, Manager, Receptionist, or Room Cleaners).</w:t>
       </w:r>
     </w:p>
     <w:p>
@@ -3348,7 +3360,65 @@
           <w:lang w:eastAsia="en-GB"/>
           <w14:ligatures w14:val="none"/>
         </w:rPr>
-        <w:t>«Describe the logical and physical characteristics of each interface between the software product and the hardware components of the system. This may include the supported device types, the nature of the data and control interactions between the software and the hardware, and communication protocols to be used.»</w:t>
+        <w:t>The application interfaces directly with the hardware resources of a dedicated local computer configured as the application server.</w:t>
+      </w:r>
+    </w:p>
+    <w:p>
+      <w:pPr>
+        <w:pStyle w:val="Normal"/>
+        <w:shd w:val="clear" w:color="auto" w:fill="FFFFFF"/>
+        <w:spacing w:lineRule="auto" w:line="240" w:before="240" w:after="0"/>
+        <w:jc w:val="both"/>
+        <w:rPr>
+          <w:rFonts w:eastAsia="Times New Roman" w:cs="" w:asciiTheme="majorBidi" w:cstheme="majorBidi" w:hAnsiTheme="majorBidi"/>
+          <w:color w:val="373D3F"/>
+          <w:kern w:val="0"/>
+          <w:sz w:val="20"/>
+          <w:szCs w:val="20"/>
+          <w:lang w:eastAsia="en-GB"/>
+          <w14:ligatures w14:val="none"/>
+        </w:rPr>
+      </w:pPr>
+      <w:r>
+        <w:rPr>
+          <w:rFonts w:eastAsia="Times New Roman" w:cs="" w:asciiTheme="majorBidi" w:cstheme="majorBidi" w:hAnsiTheme="majorBidi"/>
+          <w:color w:val="0000FF"/>
+          <w:kern w:val="0"/>
+          <w:sz w:val="20"/>
+          <w:szCs w:val="20"/>
+          <w:lang w:eastAsia="en-GB"/>
+          <w14:ligatures w14:val="none"/>
+        </w:rPr>
+        <w:t>Client-side interactions occur over the local area network using end-user hardware, including tablets, laptops, and desktop workstations.</w:t>
+      </w:r>
+    </w:p>
+    <w:p>
+      <w:pPr>
+        <w:pStyle w:val="Normal"/>
+        <w:shd w:val="clear" w:color="auto" w:fill="FFFFFF"/>
+        <w:spacing w:lineRule="auto" w:line="240" w:before="240" w:after="0"/>
+        <w:jc w:val="both"/>
+        <w:rPr>
+          <w:rFonts w:eastAsia="Times New Roman" w:cs="" w:asciiTheme="majorBidi" w:cstheme="majorBidi" w:hAnsiTheme="majorBidi"/>
+          <w:color w:val="373D3F"/>
+          <w:kern w:val="0"/>
+          <w:sz w:val="20"/>
+          <w:szCs w:val="20"/>
+          <w:lang w:eastAsia="en-GB"/>
+          <w14:ligatures w14:val="none"/>
+        </w:rPr>
+      </w:pPr>
+      <w:r>
+        <w:rPr>
+          <w:rFonts w:eastAsia="Times New Roman" w:cs="" w:asciiTheme="majorBidi" w:cstheme="majorBidi" w:hAnsiTheme="majorBidi"/>
+          <w:color w:val="0000FF"/>
+          <w:kern w:val="0"/>
+          <w:sz w:val="20"/>
+          <w:szCs w:val="20"/>
+          <w:lang w:eastAsia="en-GB"/>
+          <w14:ligatures w14:val="none"/>
+        </w:rPr>
+        <w:t>No physical interfaces are established with smart locks or alternative external hardware automation tools in this version.</w:t>
       </w:r>
     </w:p>
     <w:p>
@@ -3408,7 +3478,65 @@
           <w:lang w:eastAsia="en-GB"/>
           <w14:ligatures w14:val="none"/>
         </w:rPr>
-        <w:t>«Describe the connections between this product and other specific software components (name and version), including databases, interpreters, operating systems, tools, libraries, and integrated commercial components. Identify the data items or messages coming into the system and going out and describe the purpose of each. Describe the services needed and the nature of communications. Identify data that will be shared across software components. If the data sharing mechanism must be implemented in a specific way (for example, use of a global data area in a multitasking operating system), specify this as an implementation constraint.»</w:t>
+        <w:t>The server application interfaces directly with the underlying Ubuntu operating system environment.</w:t>
+      </w:r>
+    </w:p>
+    <w:p>
+      <w:pPr>
+        <w:pStyle w:val="Normal"/>
+        <w:shd w:val="clear" w:color="auto" w:fill="FFFFFF"/>
+        <w:spacing w:lineRule="auto" w:line="240" w:before="240" w:after="0"/>
+        <w:jc w:val="both"/>
+        <w:rPr>
+          <w:rFonts w:eastAsia="Times New Roman" w:cs="" w:asciiTheme="majorBidi" w:cstheme="majorBidi" w:hAnsiTheme="majorBidi"/>
+          <w:color w:val="373D3F"/>
+          <w:kern w:val="0"/>
+          <w:sz w:val="20"/>
+          <w:szCs w:val="20"/>
+          <w:lang w:eastAsia="en-GB"/>
+          <w14:ligatures w14:val="none"/>
+        </w:rPr>
+      </w:pPr>
+      <w:r>
+        <w:rPr>
+          <w:rFonts w:eastAsia="Times New Roman" w:cs="" w:asciiTheme="majorBidi" w:cstheme="majorBidi" w:hAnsiTheme="majorBidi"/>
+          <w:color w:val="0000FF"/>
+          <w:kern w:val="0"/>
+          <w:sz w:val="20"/>
+          <w:szCs w:val="20"/>
+          <w:lang w:eastAsia="en-GB"/>
+          <w14:ligatures w14:val="none"/>
+        </w:rPr>
+        <w:t>Data persistence interfaces directly with a local instance of the PostgreSQL database engine.</w:t>
+      </w:r>
+    </w:p>
+    <w:p>
+      <w:pPr>
+        <w:pStyle w:val="Normal"/>
+        <w:shd w:val="clear" w:color="auto" w:fill="FFFFFF"/>
+        <w:spacing w:lineRule="auto" w:line="240" w:before="240" w:after="0"/>
+        <w:jc w:val="both"/>
+        <w:rPr>
+          <w:rFonts w:eastAsia="Times New Roman" w:cs="" w:asciiTheme="majorBidi" w:cstheme="majorBidi" w:hAnsiTheme="majorBidi"/>
+          <w:color w:val="373D3F"/>
+          <w:kern w:val="0"/>
+          <w:sz w:val="20"/>
+          <w:szCs w:val="20"/>
+          <w:lang w:eastAsia="en-GB"/>
+          <w14:ligatures w14:val="none"/>
+        </w:rPr>
+      </w:pPr>
+      <w:r>
+        <w:rPr>
+          <w:rFonts w:eastAsia="Times New Roman" w:cs="" w:asciiTheme="majorBidi" w:cstheme="majorBidi" w:hAnsiTheme="majorBidi"/>
+          <w:color w:val="0000FF"/>
+          <w:kern w:val="0"/>
+          <w:sz w:val="20"/>
+          <w:szCs w:val="20"/>
+          <w:lang w:eastAsia="en-GB"/>
+          <w14:ligatures w14:val="none"/>
+        </w:rPr>
+        <w:t>Client-side runtime execution environments are provided natively by modern web browsers.</w:t>
       </w:r>
     </w:p>
     <w:p>
@@ -3445,47 +3573,7 @@
     <w:p>
       <w:pPr>
         <w:pStyle w:val="Normal"/>
-        <w:shd w:val="clear" w:color="auto" w:fill="FFFFFF"/>
-        <w:spacing w:lineRule="auto" w:line="240" w:before="240" w:after="0"/>
-        <w:jc w:val="both"/>
-        <w:rPr>
-          <w:rFonts w:eastAsia="Times New Roman" w:cs="" w:asciiTheme="majorBidi" w:cstheme="majorBidi" w:hAnsiTheme="majorBidi"/>
-          <w:color w:val="373D3F"/>
-          <w:kern w:val="0"/>
-          <w:sz w:val="20"/>
-          <w:szCs w:val="20"/>
-          <w:lang w:eastAsia="en-GB"/>
-          <w14:ligatures w14:val="none"/>
-        </w:rPr>
-      </w:pPr>
-      <w:r>
-        <w:rPr>
-          <w:rFonts w:eastAsia="Times New Roman" w:cs="" w:asciiTheme="majorBidi" w:cstheme="majorBidi" w:hAnsiTheme="majorBidi"/>
-          <w:color w:val="0000FF"/>
-          <w:kern w:val="0"/>
-          <w:sz w:val="20"/>
-          <w:szCs w:val="20"/>
-          <w:lang w:eastAsia="en-GB"/>
-          <w14:ligatures w14:val="none"/>
-        </w:rPr>
-        <w:t>«This template illustrates organizing the functional requirements for the product by system features, the major services provided by the product.»</w:t>
-      </w:r>
-    </w:p>
-    <w:p>
-      <w:pPr>
-        <w:pStyle w:val="Normal"/>
-        <w:shd w:val="clear" w:color="auto" w:fill="FFFFFF"/>
-        <w:spacing w:lineRule="auto" w:line="240" w:before="240" w:after="0"/>
-        <w:jc w:val="both"/>
-        <w:rPr>
-          <w:rFonts w:eastAsia="Times New Roman" w:cs="" w:asciiTheme="majorBidi" w:cstheme="majorBidi" w:hAnsiTheme="majorBidi"/>
-          <w:color w:val="373D3F"/>
-          <w:kern w:val="0"/>
-          <w:sz w:val="20"/>
-          <w:szCs w:val="20"/>
-          <w:lang w:eastAsia="en-GB"/>
-          <w14:ligatures w14:val="none"/>
-        </w:rPr>
+        <w:rPr/>
       </w:pPr>
       <w:r>
         <w:rPr>
@@ -3513,7 +3601,497 @@
           <w:lang w:eastAsia="en-GB"/>
           <w14:ligatures w14:val="none"/>
         </w:rPr>
-        <w:t>«System Feature Name»</w:t>
+        <w:t>U</w:t>
+      </w:r>
+      <w:r>
+        <w:rPr>
+          <w:rFonts w:eastAsia="Times New Roman" w:cs="" w:asciiTheme="majorBidi" w:cstheme="majorBidi" w:hAnsiTheme="majorBidi"/>
+          <w:b/>
+          <w:bCs/>
+          <w:color w:val="0000FF"/>
+          <w:kern w:val="0"/>
+          <w:sz w:val="20"/>
+          <w:szCs w:val="20"/>
+          <w:lang w:eastAsia="en-GB"/>
+          <w14:ligatures w14:val="none"/>
+        </w:rPr>
+        <w:t>s</w:t>
+      </w:r>
+      <w:r>
+        <w:rPr>
+          <w:rFonts w:eastAsia="Times New Roman" w:cs="" w:asciiTheme="majorBidi" w:cstheme="majorBidi" w:hAnsiTheme="majorBidi"/>
+          <w:b/>
+          <w:bCs/>
+          <w:color w:val="0000FF"/>
+          <w:kern w:val="0"/>
+          <w:sz w:val="20"/>
+          <w:szCs w:val="20"/>
+          <w:lang w:eastAsia="en-GB"/>
+          <w14:ligatures w14:val="none"/>
+        </w:rPr>
+        <w:t>e</w:t>
+      </w:r>
+      <w:r>
+        <w:rPr>
+          <w:rFonts w:eastAsia="Times New Roman" w:cs="" w:asciiTheme="majorBidi" w:cstheme="majorBidi" w:hAnsiTheme="majorBidi"/>
+          <w:b/>
+          <w:bCs/>
+          <w:color w:val="0000FF"/>
+          <w:kern w:val="0"/>
+          <w:sz w:val="20"/>
+          <w:szCs w:val="20"/>
+          <w:lang w:eastAsia="en-GB"/>
+          <w14:ligatures w14:val="none"/>
+        </w:rPr>
+        <w:t xml:space="preserve">r </w:t>
+      </w:r>
+      <w:r>
+        <w:rPr>
+          <w:rFonts w:eastAsia="Times New Roman" w:cs="" w:asciiTheme="majorBidi" w:cstheme="majorBidi" w:hAnsiTheme="majorBidi"/>
+          <w:b/>
+          <w:bCs/>
+          <w:color w:val="0000FF"/>
+          <w:kern w:val="0"/>
+          <w:sz w:val="20"/>
+          <w:szCs w:val="20"/>
+          <w:lang w:eastAsia="en-GB"/>
+          <w14:ligatures w14:val="none"/>
+        </w:rPr>
+        <w:t>A</w:t>
+      </w:r>
+      <w:r>
+        <w:rPr>
+          <w:rFonts w:eastAsia="Times New Roman" w:cs="" w:asciiTheme="majorBidi" w:cstheme="majorBidi" w:hAnsiTheme="majorBidi"/>
+          <w:b/>
+          <w:bCs/>
+          <w:color w:val="0000FF"/>
+          <w:kern w:val="0"/>
+          <w:sz w:val="20"/>
+          <w:szCs w:val="20"/>
+          <w:lang w:eastAsia="en-GB"/>
+          <w14:ligatures w14:val="none"/>
+        </w:rPr>
+        <w:t>u</w:t>
+      </w:r>
+      <w:r>
+        <w:rPr>
+          <w:rFonts w:eastAsia="Times New Roman" w:cs="" w:asciiTheme="majorBidi" w:cstheme="majorBidi" w:hAnsiTheme="majorBidi"/>
+          <w:b/>
+          <w:bCs/>
+          <w:color w:val="0000FF"/>
+          <w:kern w:val="0"/>
+          <w:sz w:val="20"/>
+          <w:szCs w:val="20"/>
+          <w:lang w:eastAsia="en-GB"/>
+          <w14:ligatures w14:val="none"/>
+        </w:rPr>
+        <w:t>t</w:t>
+      </w:r>
+      <w:r>
+        <w:rPr>
+          <w:rFonts w:eastAsia="Times New Roman" w:cs="" w:asciiTheme="majorBidi" w:cstheme="majorBidi" w:hAnsiTheme="majorBidi"/>
+          <w:b/>
+          <w:bCs/>
+          <w:color w:val="0000FF"/>
+          <w:kern w:val="0"/>
+          <w:sz w:val="20"/>
+          <w:szCs w:val="20"/>
+          <w:lang w:eastAsia="en-GB"/>
+          <w14:ligatures w14:val="none"/>
+        </w:rPr>
+        <w:t>h</w:t>
+      </w:r>
+      <w:r>
+        <w:rPr>
+          <w:rFonts w:eastAsia="Times New Roman" w:cs="" w:asciiTheme="majorBidi" w:cstheme="majorBidi" w:hAnsiTheme="majorBidi"/>
+          <w:b/>
+          <w:bCs/>
+          <w:color w:val="0000FF"/>
+          <w:kern w:val="0"/>
+          <w:sz w:val="20"/>
+          <w:szCs w:val="20"/>
+          <w:lang w:eastAsia="en-GB"/>
+          <w14:ligatures w14:val="none"/>
+        </w:rPr>
+        <w:t>e</w:t>
+      </w:r>
+      <w:r>
+        <w:rPr>
+          <w:rFonts w:eastAsia="Times New Roman" w:cs="" w:asciiTheme="majorBidi" w:cstheme="majorBidi" w:hAnsiTheme="majorBidi"/>
+          <w:b/>
+          <w:bCs/>
+          <w:color w:val="0000FF"/>
+          <w:kern w:val="0"/>
+          <w:sz w:val="20"/>
+          <w:szCs w:val="20"/>
+          <w:lang w:eastAsia="en-GB"/>
+          <w14:ligatures w14:val="none"/>
+        </w:rPr>
+        <w:t>n</w:t>
+      </w:r>
+      <w:r>
+        <w:rPr>
+          <w:rFonts w:eastAsia="Times New Roman" w:cs="" w:asciiTheme="majorBidi" w:cstheme="majorBidi" w:hAnsiTheme="majorBidi"/>
+          <w:b/>
+          <w:bCs/>
+          <w:color w:val="0000FF"/>
+          <w:kern w:val="0"/>
+          <w:sz w:val="20"/>
+          <w:szCs w:val="20"/>
+          <w:lang w:eastAsia="en-GB"/>
+          <w14:ligatures w14:val="none"/>
+        </w:rPr>
+        <w:t>t</w:t>
+      </w:r>
+      <w:r>
+        <w:rPr>
+          <w:rFonts w:eastAsia="Times New Roman" w:cs="" w:asciiTheme="majorBidi" w:cstheme="majorBidi" w:hAnsiTheme="majorBidi"/>
+          <w:b/>
+          <w:bCs/>
+          <w:color w:val="0000FF"/>
+          <w:kern w:val="0"/>
+          <w:sz w:val="20"/>
+          <w:szCs w:val="20"/>
+          <w:lang w:eastAsia="en-GB"/>
+          <w14:ligatures w14:val="none"/>
+        </w:rPr>
+        <w:t>i</w:t>
+      </w:r>
+      <w:r>
+        <w:rPr>
+          <w:rFonts w:eastAsia="Times New Roman" w:cs="" w:asciiTheme="majorBidi" w:cstheme="majorBidi" w:hAnsiTheme="majorBidi"/>
+          <w:b/>
+          <w:bCs/>
+          <w:color w:val="0000FF"/>
+          <w:kern w:val="0"/>
+          <w:sz w:val="20"/>
+          <w:szCs w:val="20"/>
+          <w:lang w:eastAsia="en-GB"/>
+          <w14:ligatures w14:val="none"/>
+        </w:rPr>
+        <w:t>c</w:t>
+      </w:r>
+      <w:r>
+        <w:rPr>
+          <w:rFonts w:eastAsia="Times New Roman" w:cs="" w:asciiTheme="majorBidi" w:cstheme="majorBidi" w:hAnsiTheme="majorBidi"/>
+          <w:b/>
+          <w:bCs/>
+          <w:color w:val="0000FF"/>
+          <w:kern w:val="0"/>
+          <w:sz w:val="20"/>
+          <w:szCs w:val="20"/>
+          <w:lang w:eastAsia="en-GB"/>
+          <w14:ligatures w14:val="none"/>
+        </w:rPr>
+        <w:t>a</w:t>
+      </w:r>
+      <w:r>
+        <w:rPr>
+          <w:rFonts w:eastAsia="Times New Roman" w:cs="" w:asciiTheme="majorBidi" w:cstheme="majorBidi" w:hAnsiTheme="majorBidi"/>
+          <w:b/>
+          <w:bCs/>
+          <w:color w:val="0000FF"/>
+          <w:kern w:val="0"/>
+          <w:sz w:val="20"/>
+          <w:szCs w:val="20"/>
+          <w:lang w:eastAsia="en-GB"/>
+          <w14:ligatures w14:val="none"/>
+        </w:rPr>
+        <w:t>t</w:t>
+      </w:r>
+      <w:r>
+        <w:rPr>
+          <w:rFonts w:eastAsia="Times New Roman" w:cs="" w:asciiTheme="majorBidi" w:cstheme="majorBidi" w:hAnsiTheme="majorBidi"/>
+          <w:b/>
+          <w:bCs/>
+          <w:color w:val="0000FF"/>
+          <w:kern w:val="0"/>
+          <w:sz w:val="20"/>
+          <w:szCs w:val="20"/>
+          <w:lang w:eastAsia="en-GB"/>
+          <w14:ligatures w14:val="none"/>
+        </w:rPr>
+        <w:t>i</w:t>
+      </w:r>
+      <w:r>
+        <w:rPr>
+          <w:rFonts w:eastAsia="Times New Roman" w:cs="" w:asciiTheme="majorBidi" w:cstheme="majorBidi" w:hAnsiTheme="majorBidi"/>
+          <w:b/>
+          <w:bCs/>
+          <w:color w:val="0000FF"/>
+          <w:kern w:val="0"/>
+          <w:sz w:val="20"/>
+          <w:szCs w:val="20"/>
+          <w:lang w:eastAsia="en-GB"/>
+          <w14:ligatures w14:val="none"/>
+        </w:rPr>
+        <w:t>o</w:t>
+      </w:r>
+      <w:r>
+        <w:rPr>
+          <w:rFonts w:eastAsia="Times New Roman" w:cs="" w:asciiTheme="majorBidi" w:cstheme="majorBidi" w:hAnsiTheme="majorBidi"/>
+          <w:b/>
+          <w:bCs/>
+          <w:color w:val="0000FF"/>
+          <w:kern w:val="0"/>
+          <w:sz w:val="20"/>
+          <w:szCs w:val="20"/>
+          <w:lang w:eastAsia="en-GB"/>
+          <w14:ligatures w14:val="none"/>
+        </w:rPr>
+        <w:t xml:space="preserve">n </w:t>
+      </w:r>
+      <w:r>
+        <w:rPr>
+          <w:rFonts w:eastAsia="Times New Roman" w:cs="" w:asciiTheme="majorBidi" w:cstheme="majorBidi" w:hAnsiTheme="majorBidi"/>
+          <w:b/>
+          <w:bCs/>
+          <w:color w:val="0000FF"/>
+          <w:kern w:val="0"/>
+          <w:sz w:val="20"/>
+          <w:szCs w:val="20"/>
+          <w:lang w:eastAsia="en-GB"/>
+          <w14:ligatures w14:val="none"/>
+        </w:rPr>
+        <w:t>a</w:t>
+      </w:r>
+      <w:r>
+        <w:rPr>
+          <w:rFonts w:eastAsia="Times New Roman" w:cs="" w:asciiTheme="majorBidi" w:cstheme="majorBidi" w:hAnsiTheme="majorBidi"/>
+          <w:b/>
+          <w:bCs/>
+          <w:color w:val="0000FF"/>
+          <w:kern w:val="0"/>
+          <w:sz w:val="20"/>
+          <w:szCs w:val="20"/>
+          <w:lang w:eastAsia="en-GB"/>
+          <w14:ligatures w14:val="none"/>
+        </w:rPr>
+        <w:t>n</w:t>
+      </w:r>
+      <w:r>
+        <w:rPr>
+          <w:rFonts w:eastAsia="Times New Roman" w:cs="" w:asciiTheme="majorBidi" w:cstheme="majorBidi" w:hAnsiTheme="majorBidi"/>
+          <w:b/>
+          <w:bCs/>
+          <w:color w:val="0000FF"/>
+          <w:kern w:val="0"/>
+          <w:sz w:val="20"/>
+          <w:szCs w:val="20"/>
+          <w:lang w:eastAsia="en-GB"/>
+          <w14:ligatures w14:val="none"/>
+        </w:rPr>
+        <w:t xml:space="preserve">d </w:t>
+      </w:r>
+      <w:r>
+        <w:rPr>
+          <w:rFonts w:eastAsia="Times New Roman" w:cs="" w:asciiTheme="majorBidi" w:cstheme="majorBidi" w:hAnsiTheme="majorBidi"/>
+          <w:b/>
+          <w:bCs/>
+          <w:color w:val="0000FF"/>
+          <w:kern w:val="0"/>
+          <w:sz w:val="20"/>
+          <w:szCs w:val="20"/>
+          <w:lang w:eastAsia="en-GB"/>
+          <w14:ligatures w14:val="none"/>
+        </w:rPr>
+        <w:t>S</w:t>
+      </w:r>
+      <w:r>
+        <w:rPr>
+          <w:rFonts w:eastAsia="Times New Roman" w:cs="" w:asciiTheme="majorBidi" w:cstheme="majorBidi" w:hAnsiTheme="majorBidi"/>
+          <w:b/>
+          <w:bCs/>
+          <w:color w:val="0000FF"/>
+          <w:kern w:val="0"/>
+          <w:sz w:val="20"/>
+          <w:szCs w:val="20"/>
+          <w:lang w:eastAsia="en-GB"/>
+          <w14:ligatures w14:val="none"/>
+        </w:rPr>
+        <w:t>e</w:t>
+      </w:r>
+      <w:r>
+        <w:rPr>
+          <w:rFonts w:eastAsia="Times New Roman" w:cs="" w:asciiTheme="majorBidi" w:cstheme="majorBidi" w:hAnsiTheme="majorBidi"/>
+          <w:b/>
+          <w:bCs/>
+          <w:color w:val="0000FF"/>
+          <w:kern w:val="0"/>
+          <w:sz w:val="20"/>
+          <w:szCs w:val="20"/>
+          <w:lang w:eastAsia="en-GB"/>
+          <w14:ligatures w14:val="none"/>
+        </w:rPr>
+        <w:t>c</w:t>
+      </w:r>
+      <w:r>
+        <w:rPr>
+          <w:rFonts w:eastAsia="Times New Roman" w:cs="" w:asciiTheme="majorBidi" w:cstheme="majorBidi" w:hAnsiTheme="majorBidi"/>
+          <w:b/>
+          <w:bCs/>
+          <w:color w:val="0000FF"/>
+          <w:kern w:val="0"/>
+          <w:sz w:val="20"/>
+          <w:szCs w:val="20"/>
+          <w:lang w:eastAsia="en-GB"/>
+          <w14:ligatures w14:val="none"/>
+        </w:rPr>
+        <w:t>u</w:t>
+      </w:r>
+      <w:r>
+        <w:rPr>
+          <w:rFonts w:eastAsia="Times New Roman" w:cs="" w:asciiTheme="majorBidi" w:cstheme="majorBidi" w:hAnsiTheme="majorBidi"/>
+          <w:b/>
+          <w:bCs/>
+          <w:color w:val="0000FF"/>
+          <w:kern w:val="0"/>
+          <w:sz w:val="20"/>
+          <w:szCs w:val="20"/>
+          <w:lang w:eastAsia="en-GB"/>
+          <w14:ligatures w14:val="none"/>
+        </w:rPr>
+        <w:t>r</w:t>
+      </w:r>
+      <w:r>
+        <w:rPr>
+          <w:rFonts w:eastAsia="Times New Roman" w:cs="" w:asciiTheme="majorBidi" w:cstheme="majorBidi" w:hAnsiTheme="majorBidi"/>
+          <w:b/>
+          <w:bCs/>
+          <w:color w:val="0000FF"/>
+          <w:kern w:val="0"/>
+          <w:sz w:val="20"/>
+          <w:szCs w:val="20"/>
+          <w:lang w:eastAsia="en-GB"/>
+          <w14:ligatures w14:val="none"/>
+        </w:rPr>
+        <w:t>i</w:t>
+      </w:r>
+      <w:r>
+        <w:rPr>
+          <w:rFonts w:eastAsia="Times New Roman" w:cs="" w:asciiTheme="majorBidi" w:cstheme="majorBidi" w:hAnsiTheme="majorBidi"/>
+          <w:b/>
+          <w:bCs/>
+          <w:color w:val="0000FF"/>
+          <w:kern w:val="0"/>
+          <w:sz w:val="20"/>
+          <w:szCs w:val="20"/>
+          <w:lang w:eastAsia="en-GB"/>
+          <w14:ligatures w14:val="none"/>
+        </w:rPr>
+        <w:t>t</w:t>
+      </w:r>
+      <w:r>
+        <w:rPr>
+          <w:rFonts w:eastAsia="Times New Roman" w:cs="" w:asciiTheme="majorBidi" w:cstheme="majorBidi" w:hAnsiTheme="majorBidi"/>
+          <w:b/>
+          <w:bCs/>
+          <w:color w:val="0000FF"/>
+          <w:kern w:val="0"/>
+          <w:sz w:val="20"/>
+          <w:szCs w:val="20"/>
+          <w:lang w:eastAsia="en-GB"/>
+          <w14:ligatures w14:val="none"/>
+        </w:rPr>
+        <w:t xml:space="preserve">y </w:t>
+      </w:r>
+      <w:r>
+        <w:rPr>
+          <w:rFonts w:eastAsia="Times New Roman" w:cs="" w:asciiTheme="majorBidi" w:cstheme="majorBidi" w:hAnsiTheme="majorBidi"/>
+          <w:b/>
+          <w:bCs/>
+          <w:color w:val="0000FF"/>
+          <w:kern w:val="0"/>
+          <w:sz w:val="20"/>
+          <w:szCs w:val="20"/>
+          <w:lang w:eastAsia="en-GB"/>
+          <w14:ligatures w14:val="none"/>
+        </w:rPr>
+        <w:t>C</w:t>
+      </w:r>
+      <w:r>
+        <w:rPr>
+          <w:rFonts w:eastAsia="Times New Roman" w:cs="" w:asciiTheme="majorBidi" w:cstheme="majorBidi" w:hAnsiTheme="majorBidi"/>
+          <w:b/>
+          <w:bCs/>
+          <w:color w:val="0000FF"/>
+          <w:kern w:val="0"/>
+          <w:sz w:val="20"/>
+          <w:szCs w:val="20"/>
+          <w:lang w:eastAsia="en-GB"/>
+          <w14:ligatures w14:val="none"/>
+        </w:rPr>
+        <w:t>o</w:t>
+      </w:r>
+      <w:r>
+        <w:rPr>
+          <w:rFonts w:eastAsia="Times New Roman" w:cs="" w:asciiTheme="majorBidi" w:cstheme="majorBidi" w:hAnsiTheme="majorBidi"/>
+          <w:b/>
+          <w:bCs/>
+          <w:color w:val="0000FF"/>
+          <w:kern w:val="0"/>
+          <w:sz w:val="20"/>
+          <w:szCs w:val="20"/>
+          <w:lang w:eastAsia="en-GB"/>
+          <w14:ligatures w14:val="none"/>
+        </w:rPr>
+        <w:t>n</w:t>
+      </w:r>
+      <w:r>
+        <w:rPr>
+          <w:rFonts w:eastAsia="Times New Roman" w:cs="" w:asciiTheme="majorBidi" w:cstheme="majorBidi" w:hAnsiTheme="majorBidi"/>
+          <w:b/>
+          <w:bCs/>
+          <w:color w:val="0000FF"/>
+          <w:kern w:val="0"/>
+          <w:sz w:val="20"/>
+          <w:szCs w:val="20"/>
+          <w:lang w:eastAsia="en-GB"/>
+          <w14:ligatures w14:val="none"/>
+        </w:rPr>
+        <w:t>t</w:t>
+      </w:r>
+      <w:r>
+        <w:rPr>
+          <w:rFonts w:eastAsia="Times New Roman" w:cs="" w:asciiTheme="majorBidi" w:cstheme="majorBidi" w:hAnsiTheme="majorBidi"/>
+          <w:b/>
+          <w:bCs/>
+          <w:color w:val="0000FF"/>
+          <w:kern w:val="0"/>
+          <w:sz w:val="20"/>
+          <w:szCs w:val="20"/>
+          <w:lang w:eastAsia="en-GB"/>
+          <w14:ligatures w14:val="none"/>
+        </w:rPr>
+        <w:t>r</w:t>
+      </w:r>
+      <w:r>
+        <w:rPr>
+          <w:rFonts w:eastAsia="Times New Roman" w:cs="" w:asciiTheme="majorBidi" w:cstheme="majorBidi" w:hAnsiTheme="majorBidi"/>
+          <w:b/>
+          <w:bCs/>
+          <w:color w:val="0000FF"/>
+          <w:kern w:val="0"/>
+          <w:sz w:val="20"/>
+          <w:szCs w:val="20"/>
+          <w:lang w:eastAsia="en-GB"/>
+          <w14:ligatures w14:val="none"/>
+        </w:rPr>
+        <w:t>o</w:t>
+      </w:r>
+      <w:r>
+        <w:rPr>
+          <w:rFonts w:eastAsia="Times New Roman" w:cs="" w:asciiTheme="majorBidi" w:cstheme="majorBidi" w:hAnsiTheme="majorBidi"/>
+          <w:b/>
+          <w:bCs/>
+          <w:color w:val="0000FF"/>
+          <w:kern w:val="0"/>
+          <w:sz w:val="20"/>
+          <w:szCs w:val="20"/>
+          <w:lang w:eastAsia="en-GB"/>
+          <w14:ligatures w14:val="none"/>
+        </w:rPr>
+        <w:t>l</w:t>
       </w:r>
     </w:p>
     <w:p>
@@ -3573,7 +4151,7 @@
           <w:lang w:eastAsia="en-GB"/>
           <w14:ligatures w14:val="none"/>
         </w:rPr>
-        <w:t>«Provide a short description of the feature. Give its priority, too.»</w:t>
+        <w:t xml:space="preserve">This module secures local system access based on employee roles. It has a critical priority to uphold user data privacy and eliminate third-party security vulnerabilities </w:t>
       </w:r>
     </w:p>
     <w:p>
@@ -3626,55 +4204,20 @@
       <w:r>
         <w:rPr>
           <w:rFonts w:eastAsia="Times New Roman" w:cs="" w:asciiTheme="majorBidi" w:cstheme="majorBidi" w:hAnsiTheme="majorBidi"/>
-          <w:color w:val="0000FF"/>
-          <w:kern w:val="0"/>
-          <w:sz w:val="20"/>
-          <w:szCs w:val="20"/>
-          <w:lang w:eastAsia="en-GB"/>
-          <w14:ligatures w14:val="none"/>
-        </w:rPr>
-        <w:t>«”Stimulus” or “Condition”»</w:t>
-      </w:r>
-      <w:r>
-        <w:rPr>
-          <w:rFonts w:eastAsia="Times New Roman" w:cs="" w:asciiTheme="majorBidi" w:cstheme="majorBidi" w:hAnsiTheme="majorBidi"/>
-          <w:color w:val="373D3F"/>
-          <w:kern w:val="0"/>
-          <w:sz w:val="20"/>
-          <w:szCs w:val="20"/>
-          <w:lang w:eastAsia="en-GB"/>
-          <w14:ligatures w14:val="none"/>
-        </w:rPr>
-        <w:t>: </w:t>
-      </w:r>
-      <w:r>
-        <w:rPr>
-          <w:rFonts w:eastAsia="Times New Roman" w:cs="" w:asciiTheme="majorBidi" w:cstheme="majorBidi" w:hAnsiTheme="majorBidi"/>
-          <w:color w:val="0000FF"/>
-          <w:kern w:val="0"/>
-          <w:sz w:val="20"/>
-          <w:szCs w:val="20"/>
-          <w:lang w:eastAsia="en-GB"/>
-          <w14:ligatures w14:val="none"/>
-        </w:rPr>
-        <w:t>«Describe the stimulus or condition»</w:t>
-      </w:r>
-    </w:p>
-    <w:p>
-      <w:pPr>
-        <w:pStyle w:val="Normal"/>
-        <w:shd w:val="clear" w:color="auto" w:fill="FFFFFF"/>
-        <w:spacing w:lineRule="auto" w:line="240" w:before="240" w:after="0"/>
-        <w:jc w:val="both"/>
-        <w:rPr>
-          <w:rFonts w:eastAsia="Times New Roman" w:cs="" w:asciiTheme="majorBidi" w:cstheme="majorBidi" w:hAnsiTheme="majorBidi"/>
-          <w:color w:val="373D3F"/>
-          <w:kern w:val="0"/>
-          <w:sz w:val="20"/>
-          <w:szCs w:val="20"/>
-          <w:lang w:eastAsia="en-GB"/>
-          <w14:ligatures w14:val="none"/>
-        </w:rPr>
+          <w:color w:val="373D3F"/>
+          <w:kern w:val="0"/>
+          <w:sz w:val="20"/>
+          <w:szCs w:val="20"/>
+          <w:lang w:eastAsia="en-GB"/>
+          <w14:ligatures w14:val="none"/>
+        </w:rPr>
+        <w:t xml:space="preserve">An employee submits credentials or form data via the system interface </w:t>
+      </w:r>
+    </w:p>
+    <w:p>
+      <w:pPr>
+        <w:pStyle w:val="Normal"/>
+        <w:rPr/>
       </w:pPr>
       <w:r>
         <w:rPr>
@@ -3698,36 +4241,7 @@
           <w:lang w:eastAsia="en-GB"/>
           <w14:ligatures w14:val="none"/>
         </w:rPr>
-        <w:t>«Describe the response»</w:t>
-      </w:r>
-    </w:p>
-    <w:p>
-      <w:pPr>
-        <w:pStyle w:val="Normal"/>
-        <w:shd w:val="clear" w:color="auto" w:fill="FFFFFF"/>
-        <w:spacing w:lineRule="auto" w:line="240" w:before="240" w:after="0"/>
-        <w:jc w:val="both"/>
-        <w:rPr>
-          <w:rFonts w:eastAsia="Times New Roman" w:cs="" w:asciiTheme="majorBidi" w:cstheme="majorBidi" w:hAnsiTheme="majorBidi"/>
-          <w:color w:val="373D3F"/>
-          <w:kern w:val="0"/>
-          <w:sz w:val="20"/>
-          <w:szCs w:val="20"/>
-          <w:lang w:eastAsia="en-GB"/>
-          <w14:ligatures w14:val="none"/>
-        </w:rPr>
-      </w:pPr>
-      <w:r>
-        <w:rPr>
-          <w:rFonts w:eastAsia="Times New Roman" w:cs="" w:asciiTheme="majorBidi" w:cstheme="majorBidi" w:hAnsiTheme="majorBidi"/>
-          <w:color w:val="0000FF"/>
-          <w:kern w:val="0"/>
-          <w:sz w:val="20"/>
-          <w:szCs w:val="20"/>
-          <w:lang w:eastAsia="en-GB"/>
-          <w14:ligatures w14:val="none"/>
-        </w:rPr>
-        <w:t>«Additional Stimulus/Response pairs as needed»</w:t>
+        <w:t>The system validates the submission parameters and grants secure access matching the user's role criteria</w:t>
       </w:r>
     </w:p>
     <w:p>
@@ -3759,35 +4273,6 @@
           <w14:ligatures w14:val="none"/>
         </w:rPr>
         <w:t>5.1.3 Functional Requirements</w:t>
-      </w:r>
-    </w:p>
-    <w:p>
-      <w:pPr>
-        <w:pStyle w:val="Normal"/>
-        <w:shd w:val="clear" w:color="auto" w:fill="FFFFFF"/>
-        <w:spacing w:lineRule="auto" w:line="240" w:before="240" w:after="0"/>
-        <w:jc w:val="both"/>
-        <w:rPr>
-          <w:rFonts w:eastAsia="Times New Roman" w:cs="" w:asciiTheme="majorBidi" w:cstheme="majorBidi" w:hAnsiTheme="majorBidi"/>
-          <w:color w:val="373D3F"/>
-          <w:kern w:val="0"/>
-          <w:sz w:val="20"/>
-          <w:szCs w:val="20"/>
-          <w:lang w:eastAsia="en-GB"/>
-          <w14:ligatures w14:val="none"/>
-        </w:rPr>
-      </w:pPr>
-      <w:r>
-        <w:rPr>
-          <w:rFonts w:eastAsia="Times New Roman" w:cs="" w:asciiTheme="majorBidi" w:cstheme="majorBidi" w:hAnsiTheme="majorBidi"/>
-          <w:color w:val="0000FF"/>
-          <w:kern w:val="0"/>
-          <w:sz w:val="20"/>
-          <w:szCs w:val="20"/>
-          <w:lang w:eastAsia="en-GB"/>
-          <w14:ligatures w14:val="none"/>
-        </w:rPr>
-        <w:t>«Itemize the detailed functional requirements associated with this feature. These are the software capabilities that must be present in order for the user to carry out the services provided by the feature. Include how the product should respond to anticipated error conditions or invalid inputs. Requirements should be concise, complete, unambiguous, verifiable, and necessary. Each requirement should be uniquely identified with a sequence number or a meaningful tag of some kind.»</w:t>
       </w:r>
     </w:p>
     <w:p>
@@ -4184,7 +4669,35 @@
           <w:lang w:eastAsia="en-GB"/>
           <w14:ligatures w14:val="none"/>
         </w:rPr>
-        <w:t xml:space="preserve">REQ-1.5: upon guest check-out, the System shall update the room status to "Needs Cleaning" automatically.   </w:t>
+        <w:t xml:space="preserve">REQ-1.5: upon guest check-out, the System </w:t>
+      </w:r>
+      <w:r>
+        <w:rPr>
+          <w:rFonts w:eastAsia="Times New Roman" w:cs="" w:ascii="Liberation Serif" w:hAnsi="Liberation Serif" w:cstheme="majorBidi"/>
+          <w:b w:val="false"/>
+          <w:bCs w:val="false"/>
+          <w:color w:val="0000FF"/>
+          <w:kern w:val="0"/>
+          <w:sz w:val="20"/>
+          <w:szCs w:val="20"/>
+          <w:lang w:eastAsia="en-GB"/>
+          <w14:ligatures w14:val="none"/>
+        </w:rPr>
+        <w:t>shall</w:t>
+      </w:r>
+      <w:r>
+        <w:rPr>
+          <w:rFonts w:eastAsia="Times New Roman" w:cs="" w:asciiTheme="majorBidi" w:cstheme="majorBidi" w:hAnsiTheme="majorBidi"/>
+          <w:b w:val="false"/>
+          <w:bCs w:val="false"/>
+          <w:color w:val="0000FF"/>
+          <w:kern w:val="0"/>
+          <w:sz w:val="20"/>
+          <w:szCs w:val="20"/>
+          <w:lang w:eastAsia="en-GB"/>
+          <w14:ligatures w14:val="none"/>
+        </w:rPr>
+        <w:t xml:space="preserve"> update the room status to "Needs Cleaning" automatically.   </w:t>
       </w:r>
     </w:p>
     <w:p>
@@ -4229,35 +4742,621 @@
           <w:lang w:eastAsia="en-GB"/>
           <w14:ligatures w14:val="none"/>
         </w:rPr>
-        <w:t>«N»</w:t>
-      </w:r>
-      <w:r>
-        <w:rPr>
-          <w:rFonts w:eastAsia="Times New Roman" w:cs="" w:asciiTheme="majorBidi" w:cstheme="majorBidi" w:hAnsiTheme="majorBidi"/>
-          <w:b/>
-          <w:bCs/>
-          <w:color w:val="373D3F"/>
-          <w:kern w:val="0"/>
-          <w:sz w:val="20"/>
-          <w:szCs w:val="20"/>
-          <w:lang w:eastAsia="en-GB"/>
-          <w14:ligatures w14:val="none"/>
-        </w:rPr>
-        <w:t>. </w:t>
-      </w:r>
-      <w:r>
-        <w:rPr>
-          <w:rFonts w:eastAsia="Times New Roman" w:cs="" w:asciiTheme="majorBidi" w:cstheme="majorBidi" w:hAnsiTheme="majorBidi"/>
-          <w:b/>
-          <w:bCs/>
-          <w:color w:val="0000FF"/>
-          <w:kern w:val="0"/>
-          <w:sz w:val="20"/>
-          <w:szCs w:val="20"/>
-          <w:lang w:eastAsia="en-GB"/>
-          <w14:ligatures w14:val="none"/>
-        </w:rPr>
-        <w:t>«Additional feature blocks»</w:t>
+        <w:t xml:space="preserve">2 </w:t>
+      </w:r>
+      <w:r>
+        <w:rPr>
+          <w:rFonts w:eastAsia="Times New Roman" w:cs="" w:asciiTheme="majorBidi" w:cstheme="majorBidi" w:hAnsiTheme="majorBidi"/>
+          <w:b/>
+          <w:bCs/>
+          <w:color w:val="0000FF"/>
+          <w:kern w:val="0"/>
+          <w:sz w:val="20"/>
+          <w:szCs w:val="20"/>
+          <w:lang w:eastAsia="en-GB"/>
+          <w14:ligatures w14:val="none"/>
+        </w:rPr>
+        <w:t>R</w:t>
+      </w:r>
+      <w:r>
+        <w:rPr>
+          <w:rFonts w:eastAsia="Times New Roman" w:cs="" w:asciiTheme="majorBidi" w:cstheme="majorBidi" w:hAnsiTheme="majorBidi"/>
+          <w:b/>
+          <w:bCs/>
+          <w:color w:val="0000FF"/>
+          <w:kern w:val="0"/>
+          <w:sz w:val="20"/>
+          <w:szCs w:val="20"/>
+          <w:lang w:eastAsia="en-GB"/>
+          <w14:ligatures w14:val="none"/>
+        </w:rPr>
+        <w:t>o</w:t>
+      </w:r>
+      <w:r>
+        <w:rPr>
+          <w:rFonts w:eastAsia="Times New Roman" w:cs="" w:asciiTheme="majorBidi" w:cstheme="majorBidi" w:hAnsiTheme="majorBidi"/>
+          <w:b/>
+          <w:bCs/>
+          <w:color w:val="0000FF"/>
+          <w:kern w:val="0"/>
+          <w:sz w:val="20"/>
+          <w:szCs w:val="20"/>
+          <w:lang w:eastAsia="en-GB"/>
+          <w14:ligatures w14:val="none"/>
+        </w:rPr>
+        <w:t>o</w:t>
+      </w:r>
+      <w:r>
+        <w:rPr>
+          <w:rFonts w:eastAsia="Times New Roman" w:cs="" w:asciiTheme="majorBidi" w:cstheme="majorBidi" w:hAnsiTheme="majorBidi"/>
+          <w:b/>
+          <w:bCs/>
+          <w:color w:val="0000FF"/>
+          <w:kern w:val="0"/>
+          <w:sz w:val="20"/>
+          <w:szCs w:val="20"/>
+          <w:lang w:eastAsia="en-GB"/>
+          <w14:ligatures w14:val="none"/>
+        </w:rPr>
+        <w:t xml:space="preserve">m </w:t>
+      </w:r>
+      <w:r>
+        <w:rPr>
+          <w:rFonts w:eastAsia="Times New Roman" w:cs="" w:asciiTheme="majorBidi" w:cstheme="majorBidi" w:hAnsiTheme="majorBidi"/>
+          <w:b/>
+          <w:bCs/>
+          <w:color w:val="0000FF"/>
+          <w:kern w:val="0"/>
+          <w:sz w:val="20"/>
+          <w:szCs w:val="20"/>
+          <w:lang w:eastAsia="en-GB"/>
+          <w14:ligatures w14:val="none"/>
+        </w:rPr>
+        <w:t>i</w:t>
+      </w:r>
+      <w:r>
+        <w:rPr>
+          <w:rFonts w:eastAsia="Times New Roman" w:cs="" w:asciiTheme="majorBidi" w:cstheme="majorBidi" w:hAnsiTheme="majorBidi"/>
+          <w:b/>
+          <w:bCs/>
+          <w:color w:val="0000FF"/>
+          <w:kern w:val="0"/>
+          <w:sz w:val="20"/>
+          <w:szCs w:val="20"/>
+          <w:lang w:eastAsia="en-GB"/>
+          <w14:ligatures w14:val="none"/>
+        </w:rPr>
+        <w:t>n</w:t>
+      </w:r>
+      <w:r>
+        <w:rPr>
+          <w:rFonts w:eastAsia="Times New Roman" w:cs="" w:asciiTheme="majorBidi" w:cstheme="majorBidi" w:hAnsiTheme="majorBidi"/>
+          <w:b/>
+          <w:bCs/>
+          <w:color w:val="0000FF"/>
+          <w:kern w:val="0"/>
+          <w:sz w:val="20"/>
+          <w:szCs w:val="20"/>
+          <w:lang w:eastAsia="en-GB"/>
+          <w14:ligatures w14:val="none"/>
+        </w:rPr>
+        <w:t>v</w:t>
+      </w:r>
+      <w:r>
+        <w:rPr>
+          <w:rFonts w:eastAsia="Times New Roman" w:cs="" w:asciiTheme="majorBidi" w:cstheme="majorBidi" w:hAnsiTheme="majorBidi"/>
+          <w:b/>
+          <w:bCs/>
+          <w:color w:val="0000FF"/>
+          <w:kern w:val="0"/>
+          <w:sz w:val="20"/>
+          <w:szCs w:val="20"/>
+          <w:lang w:eastAsia="en-GB"/>
+          <w14:ligatures w14:val="none"/>
+        </w:rPr>
+        <w:t>e</w:t>
+      </w:r>
+      <w:r>
+        <w:rPr>
+          <w:rFonts w:eastAsia="Times New Roman" w:cs="" w:asciiTheme="majorBidi" w:cstheme="majorBidi" w:hAnsiTheme="majorBidi"/>
+          <w:b/>
+          <w:bCs/>
+          <w:color w:val="0000FF"/>
+          <w:kern w:val="0"/>
+          <w:sz w:val="20"/>
+          <w:szCs w:val="20"/>
+          <w:lang w:eastAsia="en-GB"/>
+          <w14:ligatures w14:val="none"/>
+        </w:rPr>
+        <w:t>n</w:t>
+      </w:r>
+      <w:r>
+        <w:rPr>
+          <w:rFonts w:eastAsia="Times New Roman" w:cs="" w:asciiTheme="majorBidi" w:cstheme="majorBidi" w:hAnsiTheme="majorBidi"/>
+          <w:b/>
+          <w:bCs/>
+          <w:color w:val="0000FF"/>
+          <w:kern w:val="0"/>
+          <w:sz w:val="20"/>
+          <w:szCs w:val="20"/>
+          <w:lang w:eastAsia="en-GB"/>
+          <w14:ligatures w14:val="none"/>
+        </w:rPr>
+        <w:t>t</w:t>
+      </w:r>
+      <w:r>
+        <w:rPr>
+          <w:rFonts w:eastAsia="Times New Roman" w:cs="" w:asciiTheme="majorBidi" w:cstheme="majorBidi" w:hAnsiTheme="majorBidi"/>
+          <w:b/>
+          <w:bCs/>
+          <w:color w:val="0000FF"/>
+          <w:kern w:val="0"/>
+          <w:sz w:val="20"/>
+          <w:szCs w:val="20"/>
+          <w:lang w:eastAsia="en-GB"/>
+          <w14:ligatures w14:val="none"/>
+        </w:rPr>
+        <w:t>o</w:t>
+      </w:r>
+      <w:r>
+        <w:rPr>
+          <w:rFonts w:eastAsia="Times New Roman" w:cs="" w:asciiTheme="majorBidi" w:cstheme="majorBidi" w:hAnsiTheme="majorBidi"/>
+          <w:b/>
+          <w:bCs/>
+          <w:color w:val="0000FF"/>
+          <w:kern w:val="0"/>
+          <w:sz w:val="20"/>
+          <w:szCs w:val="20"/>
+          <w:lang w:eastAsia="en-GB"/>
+          <w14:ligatures w14:val="none"/>
+        </w:rPr>
+        <w:t>r</w:t>
+      </w:r>
+      <w:r>
+        <w:rPr>
+          <w:rFonts w:eastAsia="Times New Roman" w:cs="" w:asciiTheme="majorBidi" w:cstheme="majorBidi" w:hAnsiTheme="majorBidi"/>
+          <w:b/>
+          <w:bCs/>
+          <w:color w:val="0000FF"/>
+          <w:kern w:val="0"/>
+          <w:sz w:val="20"/>
+          <w:szCs w:val="20"/>
+          <w:lang w:eastAsia="en-GB"/>
+          <w14:ligatures w14:val="none"/>
+        </w:rPr>
+        <w:t xml:space="preserve">y </w:t>
+      </w:r>
+      <w:r>
+        <w:rPr>
+          <w:rFonts w:eastAsia="Times New Roman" w:cs="" w:asciiTheme="majorBidi" w:cstheme="majorBidi" w:hAnsiTheme="majorBidi"/>
+          <w:b/>
+          <w:bCs/>
+          <w:color w:val="0000FF"/>
+          <w:kern w:val="0"/>
+          <w:sz w:val="20"/>
+          <w:szCs w:val="20"/>
+          <w:lang w:eastAsia="en-GB"/>
+          <w14:ligatures w14:val="none"/>
+        </w:rPr>
+        <w:t>m</w:t>
+      </w:r>
+      <w:r>
+        <w:rPr>
+          <w:rFonts w:eastAsia="Times New Roman" w:cs="" w:asciiTheme="majorBidi" w:cstheme="majorBidi" w:hAnsiTheme="majorBidi"/>
+          <w:b/>
+          <w:bCs/>
+          <w:color w:val="0000FF"/>
+          <w:kern w:val="0"/>
+          <w:sz w:val="20"/>
+          <w:szCs w:val="20"/>
+          <w:lang w:eastAsia="en-GB"/>
+          <w14:ligatures w14:val="none"/>
+        </w:rPr>
+        <w:t>a</w:t>
+      </w:r>
+      <w:r>
+        <w:rPr>
+          <w:rFonts w:eastAsia="Times New Roman" w:cs="" w:asciiTheme="majorBidi" w:cstheme="majorBidi" w:hAnsiTheme="majorBidi"/>
+          <w:b/>
+          <w:bCs/>
+          <w:color w:val="0000FF"/>
+          <w:kern w:val="0"/>
+          <w:sz w:val="20"/>
+          <w:szCs w:val="20"/>
+          <w:lang w:eastAsia="en-GB"/>
+          <w14:ligatures w14:val="none"/>
+        </w:rPr>
+        <w:t>n</w:t>
+      </w:r>
+      <w:r>
+        <w:rPr>
+          <w:rFonts w:eastAsia="Times New Roman" w:cs="" w:asciiTheme="majorBidi" w:cstheme="majorBidi" w:hAnsiTheme="majorBidi"/>
+          <w:b/>
+          <w:bCs/>
+          <w:color w:val="0000FF"/>
+          <w:kern w:val="0"/>
+          <w:sz w:val="20"/>
+          <w:szCs w:val="20"/>
+          <w:lang w:eastAsia="en-GB"/>
+          <w14:ligatures w14:val="none"/>
+        </w:rPr>
+        <w:t>a</w:t>
+      </w:r>
+      <w:r>
+        <w:rPr>
+          <w:rFonts w:eastAsia="Times New Roman" w:cs="" w:asciiTheme="majorBidi" w:cstheme="majorBidi" w:hAnsiTheme="majorBidi"/>
+          <w:b/>
+          <w:bCs/>
+          <w:color w:val="0000FF"/>
+          <w:kern w:val="0"/>
+          <w:sz w:val="20"/>
+          <w:szCs w:val="20"/>
+          <w:lang w:eastAsia="en-GB"/>
+          <w14:ligatures w14:val="none"/>
+        </w:rPr>
+        <w:t>g</w:t>
+      </w:r>
+      <w:r>
+        <w:rPr>
+          <w:rFonts w:eastAsia="Times New Roman" w:cs="" w:asciiTheme="majorBidi" w:cstheme="majorBidi" w:hAnsiTheme="majorBidi"/>
+          <w:b/>
+          <w:bCs/>
+          <w:color w:val="0000FF"/>
+          <w:kern w:val="0"/>
+          <w:sz w:val="20"/>
+          <w:szCs w:val="20"/>
+          <w:lang w:eastAsia="en-GB"/>
+          <w14:ligatures w14:val="none"/>
+        </w:rPr>
+        <w:t>e</w:t>
+      </w:r>
+      <w:r>
+        <w:rPr>
+          <w:rFonts w:eastAsia="Times New Roman" w:cs="" w:asciiTheme="majorBidi" w:cstheme="majorBidi" w:hAnsiTheme="majorBidi"/>
+          <w:b/>
+          <w:bCs/>
+          <w:color w:val="0000FF"/>
+          <w:kern w:val="0"/>
+          <w:sz w:val="20"/>
+          <w:szCs w:val="20"/>
+          <w:lang w:eastAsia="en-GB"/>
+          <w14:ligatures w14:val="none"/>
+        </w:rPr>
+        <w:t>m</w:t>
+      </w:r>
+      <w:r>
+        <w:rPr>
+          <w:rFonts w:eastAsia="Times New Roman" w:cs="" w:asciiTheme="majorBidi" w:cstheme="majorBidi" w:hAnsiTheme="majorBidi"/>
+          <w:b/>
+          <w:bCs/>
+          <w:color w:val="0000FF"/>
+          <w:kern w:val="0"/>
+          <w:sz w:val="20"/>
+          <w:szCs w:val="20"/>
+          <w:lang w:eastAsia="en-GB"/>
+          <w14:ligatures w14:val="none"/>
+        </w:rPr>
+        <w:t>e</w:t>
+      </w:r>
+      <w:r>
+        <w:rPr>
+          <w:rFonts w:eastAsia="Times New Roman" w:cs="" w:asciiTheme="majorBidi" w:cstheme="majorBidi" w:hAnsiTheme="majorBidi"/>
+          <w:b/>
+          <w:bCs/>
+          <w:color w:val="0000FF"/>
+          <w:kern w:val="0"/>
+          <w:sz w:val="20"/>
+          <w:szCs w:val="20"/>
+          <w:lang w:eastAsia="en-GB"/>
+          <w14:ligatures w14:val="none"/>
+        </w:rPr>
+        <w:t>n</w:t>
+      </w:r>
+      <w:r>
+        <w:rPr>
+          <w:rFonts w:eastAsia="Times New Roman" w:cs="" w:asciiTheme="majorBidi" w:cstheme="majorBidi" w:hAnsiTheme="majorBidi"/>
+          <w:b/>
+          <w:bCs/>
+          <w:color w:val="0000FF"/>
+          <w:kern w:val="0"/>
+          <w:sz w:val="20"/>
+          <w:szCs w:val="20"/>
+          <w:lang w:eastAsia="en-GB"/>
+          <w14:ligatures w14:val="none"/>
+        </w:rPr>
+        <w:t>t</w:t>
+      </w:r>
+    </w:p>
+    <w:p>
+      <w:pPr>
+        <w:pStyle w:val="Normal"/>
+        <w:shd w:val="clear" w:color="auto" w:fill="FFFFFF"/>
+        <w:spacing w:lineRule="auto" w:line="240" w:before="240" w:after="0"/>
+        <w:jc w:val="both"/>
+        <w:rPr>
+          <w:rFonts w:eastAsia="Times New Roman" w:cs="" w:asciiTheme="majorBidi" w:cstheme="majorBidi" w:hAnsiTheme="majorBidi"/>
+          <w:color w:val="373D3F"/>
+          <w:kern w:val="0"/>
+          <w:sz w:val="20"/>
+          <w:szCs w:val="20"/>
+          <w:lang w:eastAsia="en-GB"/>
+          <w14:ligatures w14:val="none"/>
+        </w:rPr>
+      </w:pPr>
+      <w:r>
+        <w:rPr>
+          <w:rFonts w:eastAsia="Times New Roman" w:cs="" w:asciiTheme="majorBidi" w:cstheme="majorBidi" w:hAnsiTheme="majorBidi"/>
+          <w:b/>
+          <w:bCs/>
+          <w:color w:val="0000FF"/>
+          <w:kern w:val="0"/>
+          <w:sz w:val="20"/>
+          <w:szCs w:val="20"/>
+          <w:lang w:eastAsia="en-GB"/>
+          <w14:ligatures w14:val="none"/>
+        </w:rPr>
+        <w:t>5.2.1 Description and Priority</w:t>
+      </w:r>
+    </w:p>
+    <w:p>
+      <w:pPr>
+        <w:pStyle w:val="Normal"/>
+        <w:shd w:val="clear" w:color="auto" w:fill="FFFFFF"/>
+        <w:spacing w:lineRule="auto" w:line="240" w:before="240" w:after="0"/>
+        <w:jc w:val="both"/>
+        <w:rPr>
+          <w:rFonts w:eastAsia="Times New Roman" w:cs="" w:asciiTheme="majorBidi" w:cstheme="majorBidi" w:hAnsiTheme="majorBidi"/>
+          <w:b w:val="false"/>
+          <w:bCs w:val="false"/>
+          <w:color w:val="0000FF"/>
+          <w:kern w:val="0"/>
+          <w:sz w:val="20"/>
+          <w:szCs w:val="20"/>
+          <w:lang w:eastAsia="en-GB"/>
+          <w14:ligatures w14:val="none"/>
+        </w:rPr>
+      </w:pPr>
+      <w:r>
+        <w:rPr>
+          <w:rFonts w:eastAsia="Times New Roman" w:cs="" w:asciiTheme="majorBidi" w:cstheme="majorBidi" w:hAnsiTheme="majorBidi"/>
+          <w:b w:val="false"/>
+          <w:bCs w:val="false"/>
+          <w:color w:val="0000FF"/>
+          <w:kern w:val="0"/>
+          <w:sz w:val="20"/>
+          <w:szCs w:val="20"/>
+          <w:lang w:eastAsia="en-GB"/>
+          <w14:ligatures w14:val="none"/>
+        </w:rPr>
+        <w:t>Handles real-time digital allocation, filtering, and automated updates of room cleanliness statuses</w:t>
+      </w:r>
+    </w:p>
+    <w:p>
+      <w:pPr>
+        <w:pStyle w:val="Normal"/>
+        <w:shd w:val="clear" w:color="auto" w:fill="FFFFFF"/>
+        <w:spacing w:lineRule="auto" w:line="240" w:before="240" w:after="0"/>
+        <w:jc w:val="both"/>
+        <w:rPr>
+          <w:rFonts w:eastAsia="Times New Roman" w:cs="" w:asciiTheme="majorBidi" w:cstheme="majorBidi" w:hAnsiTheme="majorBidi"/>
+          <w:b/>
+          <w:bCs/>
+          <w:color w:val="0000FF"/>
+          <w:kern w:val="0"/>
+          <w:sz w:val="20"/>
+          <w:szCs w:val="20"/>
+          <w:lang w:eastAsia="en-GB"/>
+          <w14:ligatures w14:val="none"/>
+        </w:rPr>
+      </w:pPr>
+      <w:r>
+        <w:rPr>
+          <w:rFonts w:eastAsia="Times New Roman" w:cs="" w:asciiTheme="majorBidi" w:cstheme="majorBidi" w:hAnsiTheme="majorBidi"/>
+          <w:b/>
+          <w:bCs/>
+          <w:color w:val="0000FF"/>
+          <w:kern w:val="0"/>
+          <w:sz w:val="20"/>
+          <w:szCs w:val="20"/>
+          <w:lang w:eastAsia="en-GB"/>
+          <w14:ligatures w14:val="none"/>
+        </w:rPr>
+        <w:t>5.2.2 Stimulus/Response Sequences</w:t>
+      </w:r>
+    </w:p>
+    <w:p>
+      <w:pPr>
+        <w:pStyle w:val="Normal"/>
+        <w:shd w:val="clear" w:color="auto" w:fill="FFFFFF"/>
+        <w:bidi w:val="0"/>
+        <w:spacing w:lineRule="auto" w:line="240" w:before="240" w:after="0"/>
+        <w:jc w:val="both"/>
+        <w:rPr>
+          <w:rFonts w:eastAsia="Times New Roman" w:cs="" w:asciiTheme="majorBidi" w:cstheme="majorBidi" w:hAnsiTheme="majorBidi"/>
+          <w:b w:val="false"/>
+          <w:bCs w:val="false"/>
+          <w:color w:val="0000FF"/>
+          <w:kern w:val="0"/>
+          <w:sz w:val="20"/>
+          <w:szCs w:val="20"/>
+          <w:lang w:eastAsia="en-GB"/>
+          <w14:ligatures w14:val="none"/>
+        </w:rPr>
+      </w:pPr>
+      <w:r>
+        <w:rPr>
+          <w:rFonts w:eastAsia="Times New Roman" w:cs="" w:asciiTheme="majorBidi" w:cstheme="majorBidi" w:hAnsiTheme="majorBidi"/>
+          <w:b w:val="false"/>
+          <w:bCs w:val="false"/>
+          <w:color w:val="0000FF"/>
+          <w:kern w:val="0"/>
+          <w:sz w:val="20"/>
+          <w:szCs w:val="20"/>
+          <w:lang w:eastAsia="en-GB"/>
+          <w14:ligatures w14:val="none"/>
+        </w:rPr>
+        <w:t>A user initiates an inventory search query or finishes checking out a guest</w:t>
+      </w:r>
+    </w:p>
+    <w:p>
+      <w:pPr>
+        <w:pStyle w:val="Normal"/>
+        <w:shd w:val="clear" w:color="auto" w:fill="FFFFFF"/>
+        <w:bidi w:val="0"/>
+        <w:spacing w:lineRule="auto" w:line="240" w:before="240" w:after="0"/>
+        <w:jc w:val="both"/>
+        <w:rPr>
+          <w:rFonts w:eastAsia="Times New Roman" w:cs="" w:asciiTheme="majorBidi" w:cstheme="majorBidi" w:hAnsiTheme="majorBidi"/>
+          <w:b w:val="false"/>
+          <w:bCs w:val="false"/>
+          <w:color w:val="0000FF"/>
+          <w:kern w:val="0"/>
+          <w:sz w:val="20"/>
+          <w:szCs w:val="20"/>
+          <w:lang w:eastAsia="en-GB"/>
+          <w14:ligatures w14:val="none"/>
+        </w:rPr>
+      </w:pPr>
+      <w:r>
+        <w:rPr>
+          <w:rFonts w:eastAsia="Times New Roman" w:cs="" w:asciiTheme="majorBidi" w:cstheme="majorBidi" w:hAnsiTheme="majorBidi"/>
+          <w:b w:val="false"/>
+          <w:bCs w:val="false"/>
+          <w:color w:val="0000FF"/>
+          <w:kern w:val="0"/>
+          <w:sz w:val="20"/>
+          <w:szCs w:val="20"/>
+          <w:lang w:eastAsia="en-GB"/>
+          <w14:ligatures w14:val="none"/>
+        </w:rPr>
+        <w:t>Response: The system filters the visible records or triggers an automated room cleanliness status update</w:t>
+      </w:r>
+    </w:p>
+    <w:p>
+      <w:pPr>
+        <w:pStyle w:val="Normal"/>
+        <w:shd w:val="clear" w:color="auto" w:fill="FFFFFF"/>
+        <w:spacing w:lineRule="auto" w:line="240" w:before="240" w:after="0"/>
+        <w:jc w:val="both"/>
+        <w:rPr>
+          <w:rFonts w:eastAsia="Times New Roman" w:cs="" w:asciiTheme="majorBidi" w:cstheme="majorBidi" w:hAnsiTheme="majorBidi"/>
+          <w:b/>
+          <w:bCs/>
+          <w:color w:val="0000FF"/>
+          <w:kern w:val="0"/>
+          <w:sz w:val="20"/>
+          <w:szCs w:val="20"/>
+          <w:lang w:eastAsia="en-GB"/>
+          <w14:ligatures w14:val="none"/>
+        </w:rPr>
+      </w:pPr>
+      <w:r>
+        <w:rPr>
+          <w:rFonts w:eastAsia="Times New Roman" w:cs="" w:asciiTheme="majorBidi" w:cstheme="majorBidi" w:hAnsiTheme="majorBidi"/>
+          <w:b/>
+          <w:bCs/>
+          <w:color w:val="0000FF"/>
+          <w:kern w:val="0"/>
+          <w:sz w:val="20"/>
+          <w:szCs w:val="20"/>
+          <w:lang w:eastAsia="en-GB"/>
+          <w14:ligatures w14:val="none"/>
+        </w:rPr>
+        <w:t>5.2.3 Functional requirements</w:t>
+      </w:r>
+    </w:p>
+    <w:p>
+      <w:pPr>
+        <w:pStyle w:val="Normal"/>
+        <w:shd w:val="clear" w:color="auto" w:fill="FFFFFF"/>
+        <w:spacing w:lineRule="auto" w:line="240" w:before="240" w:after="0"/>
+        <w:jc w:val="both"/>
+        <w:rPr>
+          <w:rFonts w:eastAsia="Times New Roman" w:cs="" w:asciiTheme="majorBidi" w:cstheme="majorBidi" w:hAnsiTheme="majorBidi"/>
+          <w:b/>
+          <w:bCs/>
+          <w:color w:val="0000FF"/>
+          <w:kern w:val="0"/>
+          <w:sz w:val="20"/>
+          <w:szCs w:val="20"/>
+          <w:lang w:eastAsia="en-GB"/>
+          <w14:ligatures w14:val="none"/>
+        </w:rPr>
+      </w:pPr>
+      <w:r>
+        <w:rPr>
+          <w:rFonts w:eastAsia="Times New Roman" w:cs="" w:asciiTheme="majorBidi" w:cstheme="majorBidi" w:hAnsiTheme="majorBidi"/>
+          <w:b/>
+          <w:bCs/>
+          <w:color w:val="0000FF"/>
+          <w:kern w:val="0"/>
+          <w:sz w:val="20"/>
+          <w:szCs w:val="20"/>
+          <w:lang w:eastAsia="en-GB"/>
+          <w14:ligatures w14:val="none"/>
+        </w:rPr>
+        <w:t xml:space="preserve">REQ-2.1: </w:t>
+      </w:r>
+      <w:r>
+        <w:rPr>
+          <w:rFonts w:eastAsia="Times New Roman" w:cs="" w:asciiTheme="majorBidi" w:cstheme="majorBidi" w:hAnsiTheme="majorBidi"/>
+          <w:b w:val="false"/>
+          <w:bCs w:val="false"/>
+          <w:color w:val="0000FF"/>
+          <w:kern w:val="0"/>
+          <w:sz w:val="20"/>
+          <w:szCs w:val="20"/>
+          <w:lang w:eastAsia="en-GB"/>
+          <w14:ligatures w14:val="none"/>
+        </w:rPr>
+        <w:t>Upon a search query, the System shall filter room inventory to display only items with the "Available" status flag</w:t>
+      </w:r>
+    </w:p>
+    <w:p>
+      <w:pPr>
+        <w:pStyle w:val="Normal"/>
+        <w:shd w:val="clear" w:color="auto" w:fill="FFFFFF"/>
+        <w:spacing w:lineRule="auto" w:line="240" w:before="240" w:after="0"/>
+        <w:jc w:val="both"/>
+        <w:rPr>
+          <w:rFonts w:eastAsia="Times New Roman" w:cs="" w:asciiTheme="majorBidi" w:cstheme="majorBidi" w:hAnsiTheme="majorBidi"/>
+          <w:b w:val="false"/>
+          <w:bCs w:val="false"/>
+          <w:color w:val="0000FF"/>
+          <w:kern w:val="0"/>
+          <w:sz w:val="20"/>
+          <w:szCs w:val="20"/>
+          <w:lang w:eastAsia="en-GB"/>
+          <w14:ligatures w14:val="none"/>
+        </w:rPr>
+      </w:pPr>
+      <w:r>
+        <w:rPr>
+          <w:rFonts w:eastAsia="Times New Roman" w:cs="" w:asciiTheme="majorBidi" w:cstheme="majorBidi" w:hAnsiTheme="majorBidi"/>
+          <w:b/>
+          <w:bCs w:val="false"/>
+          <w:color w:val="0000FF"/>
+          <w:kern w:val="0"/>
+          <w:sz w:val="20"/>
+          <w:szCs w:val="20"/>
+          <w:lang w:eastAsia="en-GB"/>
+          <w14:ligatures w14:val="none"/>
+        </w:rPr>
+        <w:t>REQ-2.2:</w:t>
+      </w:r>
+      <w:r>
+        <w:rPr>
+          <w:rFonts w:eastAsia="Times New Roman" w:cs="" w:asciiTheme="majorBidi" w:cstheme="majorBidi" w:hAnsiTheme="majorBidi"/>
+          <w:b w:val="false"/>
+          <w:bCs w:val="false"/>
+          <w:color w:val="0000FF"/>
+          <w:kern w:val="0"/>
+          <w:sz w:val="20"/>
+          <w:szCs w:val="20"/>
+          <w:lang w:eastAsia="en-GB"/>
+          <w14:ligatures w14:val="none"/>
+        </w:rPr>
+        <w:t xml:space="preserve"> Upon guest check-out, the System shall update the room status to "Needs Cleaning" automatically</w:t>
       </w:r>
     </w:p>
     <w:p>
@@ -6015,15 +7114,15 @@
       <w:bCs/>
     </w:rPr>
   </w:style>
-  <w:style w:type="character" w:styleId="Bulletsuser">
-    <w:name w:val="Bullets (user)"/>
+  <w:style w:type="character" w:styleId="Bullets">
+    <w:name w:val="Bullets"/>
     <w:qFormat/>
     <w:rPr>
       <w:rFonts w:ascii="OpenSymbol" w:hAnsi="OpenSymbol" w:eastAsia="OpenSymbol" w:cs="OpenSymbol"/>
     </w:rPr>
   </w:style>
-  <w:style w:type="character" w:styleId="Bullets">
-    <w:name w:val="Bullets"/>
+  <w:style w:type="character" w:styleId="Bulletsuser">
+    <w:name w:val="Bullets (user)"/>
     <w:qFormat/>
     <w:rPr>
       <w:rFonts w:ascii="OpenSymbol" w:hAnsi="OpenSymbol" w:eastAsia="OpenSymbol" w:cs="OpenSymbol"/>

</xml_diff>